<commit_message>
update template to remove trial content
https://tools.hmcts.net/jira/browse/CIV-16719
</commit_message>
<xml_diff>
--- a/docker/docmosis/templates/CV-UNS-STD-ENG-01378_13066.docx
+++ b/docker/docmosis/templates/CV-UNS-STD-ENG-01378_13066.docx
@@ -1,6 +1,6 @@
 
 <file path=word/document.xml><?xml version="1.0" encoding="utf-8"?>
-<w:document xmlns:wpc="http://schemas.microsoft.com/office/word/2010/wordprocessingCanvas" xmlns:cx="http://schemas.microsoft.com/office/drawing/2014/chartex" xmlns:cx1="http://schemas.microsoft.com/office/drawing/2015/9/8/chartex" xmlns:cx2="http://schemas.microsoft.com/office/drawing/2015/10/21/chartex" xmlns:cx3="http://schemas.microsoft.com/office/drawing/2016/5/9/chartex" xmlns:cx4="http://schemas.microsoft.com/office/drawing/2016/5/10/chartex" xmlns:cx5="http://schemas.microsoft.com/office/drawing/2016/5/11/chartex" xmlns:cx6="http://schemas.microsoft.com/office/drawing/2016/5/12/chartex" xmlns:cx7="http://schemas.microsoft.com/office/drawing/2016/5/13/chartex" xmlns:cx8="http://schemas.microsoft.com/office/drawing/2016/5/14/chartex" xmlns:mc="http://schemas.openxmlformats.org/markup-compatibility/2006" xmlns:aink="http://schemas.microsoft.com/office/drawing/2016/ink" xmlns:am3d="http://schemas.microsoft.com/office/drawing/2017/model3d" xmlns:o="urn:schemas-microsoft-com:office:office" xmlns:oel="http://schemas.microsoft.com/office/2019/extlst" xmlns:r="http://schemas.openxmlformats.org/officeDocument/2006/relationships" xmlns:m="http://schemas.openxmlformats.org/officeDocument/2006/math" xmlns:v="urn:schemas-microsoft-com:vml" xmlns:wp14="http://schemas.microsoft.com/office/word/2010/wordprocessingDrawing" xmlns:wp="http://schemas.openxmlformats.org/drawingml/2006/wordprocessingDrawing" xmlns:w10="urn:schemas-microsoft-com:office:word" xmlns:w="http://schemas.openxmlformats.org/wordprocessingml/2006/main" xmlns:w14="http://schemas.microsoft.com/office/word/2010/wordml" xmlns:w15="http://schemas.microsoft.com/office/word/2012/wordml" xmlns:w16cex="http://schemas.microsoft.com/office/word/2018/wordml/cex" xmlns:w16cid="http://schemas.microsoft.com/office/word/2016/wordml/cid" xmlns:w16="http://schemas.microsoft.com/office/word/2018/wordml" xmlns:w16du="http://schemas.microsoft.com/office/word/2023/wordml/word16du" xmlns:w16sdtdh="http://schemas.microsoft.com/office/word/2020/wordml/sdtdatahash" xmlns:w16se="http://schemas.microsoft.com/office/word/2015/wordml/symex" xmlns:wpg="http://schemas.microsoft.com/office/word/2010/wordprocessingGroup" xmlns:wpi="http://schemas.microsoft.com/office/word/2010/wordprocessingInk" xmlns:wne="http://schemas.microsoft.com/office/word/2006/wordml" xmlns:wps="http://schemas.microsoft.com/office/word/2010/wordprocessingShape" mc:Ignorable="w14 w15 w16se w16cid w16 w16cex w16sdtdh w16du wp14">
+<w:document xmlns:wpc="http://schemas.microsoft.com/office/word/2010/wordprocessingCanvas" xmlns:cx="http://schemas.microsoft.com/office/drawing/2014/chartex" xmlns:cx1="http://schemas.microsoft.com/office/drawing/2015/9/8/chartex" xmlns:cx2="http://schemas.microsoft.com/office/drawing/2015/10/21/chartex" xmlns:cx3="http://schemas.microsoft.com/office/drawing/2016/5/9/chartex" xmlns:cx4="http://schemas.microsoft.com/office/drawing/2016/5/10/chartex" xmlns:cx5="http://schemas.microsoft.com/office/drawing/2016/5/11/chartex" xmlns:cx6="http://schemas.microsoft.com/office/drawing/2016/5/12/chartex" xmlns:cx7="http://schemas.microsoft.com/office/drawing/2016/5/13/chartex" xmlns:cx8="http://schemas.microsoft.com/office/drawing/2016/5/14/chartex" xmlns:mc="http://schemas.openxmlformats.org/markup-compatibility/2006" xmlns:aink="http://schemas.microsoft.com/office/drawing/2016/ink" xmlns:am3d="http://schemas.microsoft.com/office/drawing/2017/model3d" xmlns:o="urn:schemas-microsoft-com:office:office" xmlns:oel="http://schemas.microsoft.com/office/2019/extlst" xmlns:r="http://schemas.openxmlformats.org/officeDocument/2006/relationships" xmlns:m="http://schemas.openxmlformats.org/officeDocument/2006/math" xmlns:v="urn:schemas-microsoft-com:vml" xmlns:wp14="http://schemas.microsoft.com/office/word/2010/wordprocessingDrawing" xmlns:wp="http://schemas.openxmlformats.org/drawingml/2006/wordprocessingDrawing" xmlns:w10="urn:schemas-microsoft-com:office:word" xmlns:w="http://schemas.openxmlformats.org/wordprocessingml/2006/main" xmlns:w14="http://schemas.microsoft.com/office/word/2010/wordml" xmlns:w15="http://schemas.microsoft.com/office/word/2012/wordml" xmlns:w16cex="http://schemas.microsoft.com/office/word/2018/wordml/cex" xmlns:w16cid="http://schemas.microsoft.com/office/word/2016/wordml/cid" xmlns:w16="http://schemas.microsoft.com/office/word/2018/wordml" xmlns:w16du="http://schemas.microsoft.com/office/word/2023/wordml/word16du" xmlns:w16sdtdh="http://schemas.microsoft.com/office/word/2020/wordml/sdtdatahash" xmlns:w16sdtfl="http://schemas.microsoft.com/office/word/2024/wordml/sdtformatlock" xmlns:w16se="http://schemas.microsoft.com/office/word/2015/wordml/symex" xmlns:wpg="http://schemas.microsoft.com/office/word/2010/wordprocessingGroup" xmlns:wpi="http://schemas.microsoft.com/office/word/2010/wordprocessingInk" xmlns:wne="http://schemas.microsoft.com/office/word/2006/wordml" xmlns:wps="http://schemas.microsoft.com/office/word/2010/wordprocessingShape" mc:Ignorable="w14 w15 w16se w16cid w16 w16cex w16sdtdh w16sdtfl w16du wp14">
   <w:body>
     <w:p>
       <w:pPr>
@@ -25,47 +25,7 @@
           <w:sz w:val="18"/>
           <w:szCs w:val="18"/>
         </w:rPr>
-        <w:t>&lt;&lt;{</w:t>
-      </w:r>
-      <w:proofErr w:type="spellStart"/>
-      <w:r>
-        <w:rPr>
-          <w:rFonts w:ascii="Arial" w:hAnsi="Arial" w:cs="Arial"/>
-          <w:color w:val="000000" w:themeColor="text1"/>
-          <w:sz w:val="18"/>
-          <w:szCs w:val="18"/>
-        </w:rPr>
-        <w:t>dateFormat</w:t>
-      </w:r>
-      <w:proofErr w:type="spellEnd"/>
-      <w:r>
-        <w:rPr>
-          <w:rFonts w:ascii="Arial" w:hAnsi="Arial" w:cs="Arial"/>
-          <w:color w:val="000000" w:themeColor="text1"/>
-          <w:sz w:val="18"/>
-          <w:szCs w:val="18"/>
-        </w:rPr>
-        <w:t>($</w:t>
-      </w:r>
-      <w:proofErr w:type="spellStart"/>
-      <w:r>
-        <w:rPr>
-          <w:rFonts w:ascii="Arial" w:hAnsi="Arial" w:cs="Arial"/>
-          <w:color w:val="000000" w:themeColor="text1"/>
-          <w:sz w:val="18"/>
-          <w:szCs w:val="18"/>
-        </w:rPr>
-        <w:t>nowUTC</w:t>
-      </w:r>
-      <w:proofErr w:type="spellEnd"/>
-      <w:r>
-        <w:rPr>
-          <w:rFonts w:ascii="Arial" w:hAnsi="Arial" w:cs="Arial"/>
-          <w:color w:val="000000" w:themeColor="text1"/>
-          <w:sz w:val="18"/>
-          <w:szCs w:val="18"/>
-        </w:rPr>
-        <w:t xml:space="preserve"> </w:t>
+        <w:t xml:space="preserve">&lt;&lt;{dateFormat($nowUTC </w:t>
       </w:r>
       <w:r>
         <w:rPr>
@@ -74,27 +34,7 @@
           <w:sz w:val="18"/>
           <w:szCs w:val="18"/>
         </w:rPr>
-        <w:t xml:space="preserve">,‘d MMMM </w:t>
-      </w:r>
-      <w:proofErr w:type="spellStart"/>
-      <w:r>
-        <w:rPr>
-          <w:rFonts w:ascii="Arial" w:eastAsia="Times New Roman" w:hAnsi="Arial" w:cs="Arial"/>
-          <w:color w:val="000000" w:themeColor="text1"/>
-          <w:sz w:val="18"/>
-          <w:szCs w:val="18"/>
-        </w:rPr>
-        <w:t>yyyy</w:t>
-      </w:r>
-      <w:proofErr w:type="spellEnd"/>
-      <w:r>
-        <w:rPr>
-          <w:rFonts w:ascii="Arial" w:eastAsia="Times New Roman" w:hAnsi="Arial" w:cs="Arial"/>
-          <w:color w:val="000000" w:themeColor="text1"/>
-          <w:sz w:val="18"/>
-          <w:szCs w:val="18"/>
-        </w:rPr>
-        <w:t xml:space="preserve">’)} </w:t>
+        <w:t xml:space="preserve">,‘d MMMM yyyy’)} </w:t>
       </w:r>
       <w:r>
         <w:rPr>
@@ -238,10 +178,12 @@
           <w:sz w:val="28"/>
           <w:szCs w:val="28"/>
         </w:rPr>
-        <w:t>&lt;&lt;</w:t>
-      </w:r>
-      <w:proofErr w:type="spellStart"/>
-      <w:r>
+        <w:t>&lt;&lt;judgeName&gt;&gt;</w:t>
+      </w:r>
+    </w:p>
+    <w:p>
+      <w:pPr>
+        <w:jc w:val="center"/>
         <w:rPr>
           <w:rFonts w:ascii="Arial" w:hAnsi="Arial" w:cs="Arial"/>
           <w:b/>
@@ -249,30 +191,6 @@
           <w:sz w:val="28"/>
           <w:szCs w:val="28"/>
         </w:rPr>
-        <w:t>judgeName</w:t>
-      </w:r>
-      <w:proofErr w:type="spellEnd"/>
-      <w:r>
-        <w:rPr>
-          <w:rFonts w:ascii="Arial" w:hAnsi="Arial" w:cs="Arial"/>
-          <w:b/>
-          <w:color w:val="000000" w:themeColor="text1"/>
-          <w:sz w:val="28"/>
-          <w:szCs w:val="28"/>
-        </w:rPr>
-        <w:t>&gt;&gt;</w:t>
-      </w:r>
-    </w:p>
-    <w:p>
-      <w:pPr>
-        <w:jc w:val="center"/>
-        <w:rPr>
-          <w:rFonts w:ascii="Arial" w:hAnsi="Arial" w:cs="Arial"/>
-          <w:b/>
-          <w:color w:val="000000" w:themeColor="text1"/>
-          <w:sz w:val="28"/>
-          <w:szCs w:val="28"/>
-        </w:rPr>
       </w:pPr>
       <w:r>
         <w:rPr>
@@ -284,21 +202,7 @@
         <w:rPr>
           <w:rFonts w:ascii="Tahoma" w:hAnsi="Tahoma" w:cs="Tahoma"/>
         </w:rPr>
-        <w:t xml:space="preserve">&lt;&lt; </w:t>
-      </w:r>
-      <w:proofErr w:type="spellStart"/>
-      <w:r>
-        <w:rPr>
-          <w:rFonts w:ascii="Tahoma" w:hAnsi="Tahoma" w:cs="Tahoma"/>
-        </w:rPr>
-        <w:t>caseNumber</w:t>
-      </w:r>
-      <w:proofErr w:type="spellEnd"/>
-      <w:r>
-        <w:rPr>
-          <w:rFonts w:ascii="Tahoma" w:hAnsi="Tahoma" w:cs="Tahoma"/>
-        </w:rPr>
-        <w:t>&gt;&gt;</w:t>
+        <w:t>&lt;&lt; caseNumber&gt;&gt;</w:t>
       </w:r>
     </w:p>
     <w:p>
@@ -1088,7 +992,7 @@
               </wp:inline>
             </w:drawing>
           </mc:Choice>
-          <mc:Fallback xmlns:arto="http://schemas.microsoft.com/office/word/2006/arto" xmlns:a="http://schemas.openxmlformats.org/drawingml/2006/main" xmlns:pic="http://schemas.openxmlformats.org/drawingml/2006/picture">
+          <mc:Fallback xmlns:pic="http://schemas.openxmlformats.org/drawingml/2006/picture" xmlns:a="http://schemas.openxmlformats.org/drawingml/2006/main" xmlns:arto="http://schemas.microsoft.com/office/word/2006/arto">
             <w:pict w14:anchorId="2F5695A1">
               <v:group id="Group 2792" style="width:467.95pt;height:.75pt;mso-position-horizontal-relative:char;mso-position-vertical-relative:line" coordsize="59429,95" o:spid="_x0000_s1026" w14:anchorId="14BA9070" o:gfxdata="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">
                 <v:shape id="Shape 91" style="position:absolute;width:59429;height:0;visibility:visible;mso-wrap-style:square;v-text-anchor:top" coordsize="5942965,0" o:spid="_x0000_s1027" filled="f" path="m5942965,l,e" o:gfxdata="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">
@@ -1133,9 +1037,8 @@
           <w:szCs w:val="20"/>
           <w:lang w:val="en-US"/>
         </w:rPr>
-        <w:t xml:space="preserve"> You must comply with the terms imposed upon you by this order otherwise your claim or the </w:t>
-      </w:r>
-      <w:proofErr w:type="spellStart"/>
+        <w:t> You must comply with the terms imposed upon you by this order otherwise your claim or the defence of it is liable to be struck out or some other sanction imposed. If you cannot comply, you are expected to make</w:t>
+      </w:r>
       <w:r>
         <w:rPr>
           <w:rFonts w:ascii="Arial" w:hAnsi="Arial" w:cs="Arial"/>
@@ -1144,9 +1047,8 @@
           <w:szCs w:val="20"/>
           <w:lang w:val="en-US"/>
         </w:rPr>
-        <w:t>defence</w:t>
-      </w:r>
-      <w:proofErr w:type="spellEnd"/>
+        <w:t xml:space="preserve"> a</w:t>
+      </w:r>
       <w:r>
         <w:rPr>
           <w:rFonts w:ascii="Arial" w:hAnsi="Arial" w:cs="Arial"/>
@@ -1155,7 +1057,7 @@
           <w:szCs w:val="20"/>
           <w:lang w:val="en-US"/>
         </w:rPr>
-        <w:t xml:space="preserve"> of it is liable to be struck out or some other sanction imposed. If you cannot comply, you are expected to make</w:t>
+        <w:t xml:space="preserve"> formal application to the court before any deadline imposed upon you expires.</w:t>
       </w:r>
       <w:r>
         <w:rPr>
@@ -1165,26 +1067,6 @@
           <w:szCs w:val="20"/>
           <w:lang w:val="en-US"/>
         </w:rPr>
-        <w:t xml:space="preserve"> a</w:t>
-      </w:r>
-      <w:r>
-        <w:rPr>
-          <w:rFonts w:ascii="Arial" w:hAnsi="Arial" w:cs="Arial"/>
-          <w:bCs/>
-          <w:snapToGrid w:val="0"/>
-          <w:szCs w:val="20"/>
-          <w:lang w:val="en-US"/>
-        </w:rPr>
-        <w:t xml:space="preserve"> formal application to the court before any deadline imposed upon you expires.</w:t>
-      </w:r>
-      <w:r>
-        <w:rPr>
-          <w:rFonts w:ascii="Arial" w:hAnsi="Arial" w:cs="Arial"/>
-          <w:bCs/>
-          <w:snapToGrid w:val="0"/>
-          <w:szCs w:val="20"/>
-          <w:lang w:val="en-US"/>
-        </w:rPr>
         <w:br/>
       </w:r>
     </w:p>
@@ -1200,23 +1082,7 @@
           <w:rFonts w:ascii="Arial" w:hAnsi="Arial" w:cs="Arial"/>
           <w:lang w:val="en-US"/>
         </w:rPr>
-        <w:t>&lt;&lt;</w:t>
-      </w:r>
-      <w:proofErr w:type="spellStart"/>
-      <w:r>
-        <w:rPr>
-          <w:rFonts w:ascii="Arial" w:hAnsi="Arial" w:cs="Arial"/>
-          <w:lang w:val="en-US"/>
-        </w:rPr>
-        <w:t>fastTrackJudgesRecital.input</w:t>
-      </w:r>
-      <w:proofErr w:type="spellEnd"/>
-      <w:r>
-        <w:rPr>
-          <w:rFonts w:ascii="Arial" w:hAnsi="Arial" w:cs="Arial"/>
-          <w:lang w:val="en-US"/>
-        </w:rPr>
-        <w:t>&gt;&gt;</w:t>
+        <w:t>&lt;&lt;fastTrackJudgesRecital.input&gt;&gt;</w:t>
       </w:r>
     </w:p>
     <w:p>
@@ -1451,14 +1317,7 @@
         <w:rPr>
           <w:rFonts w:ascii="Arial" w:hAnsi="Arial" w:cs="Arial"/>
         </w:rPr>
-        <w:t>&lt;&lt;</w:t>
-      </w:r>
-      <w:proofErr w:type="spellStart"/>
-      <w:r>
-        <w:rPr>
-          <w:rFonts w:ascii="Arial" w:hAnsi="Arial" w:cs="Arial"/>
-        </w:rPr>
-        <w:t>fastTrack</w:t>
+        <w:t>&lt;&lt;fastTrack</w:t>
       </w:r>
       <w:r>
         <w:rPr>
@@ -1466,7 +1325,6 @@
         </w:rPr>
         <w:t>Allocation</w:t>
       </w:r>
-      <w:proofErr w:type="spellEnd"/>
       <w:r>
         <w:rPr>
           <w:rFonts w:ascii="Arial" w:hAnsi="Arial" w:cs="Arial"/>
@@ -1496,21 +1354,12 @@
         <w:lastRenderedPageBreak/>
         <w:t>&lt;&lt;cs_{</w:t>
       </w:r>
-      <w:proofErr w:type="spellStart"/>
-      <w:r>
-        <w:rPr>
-          <w:rFonts w:ascii="Arial" w:hAnsi="Arial" w:cs="Arial"/>
-          <w:lang w:val="en-US"/>
-        </w:rPr>
-        <w:t>drawDirectionsOrderRequired</w:t>
-      </w:r>
-      <w:proofErr w:type="spellEnd"/>
-      <w:r>
-        <w:rPr>
-          <w:rFonts w:ascii="Arial" w:hAnsi="Arial" w:cs="Arial"/>
-          <w:lang w:val="en-US"/>
-        </w:rPr>
-        <w:t>=</w:t>
+      <w:r>
+        <w:rPr>
+          <w:rFonts w:ascii="Arial" w:hAnsi="Arial" w:cs="Arial"/>
+          <w:lang w:val="en-US"/>
+        </w:rPr>
+        <w:t>drawDirectionsOrderRequired=</w:t>
       </w:r>
       <w:r>
         <w:rPr>
@@ -1591,21 +1440,12 @@
         </w:rPr>
         <w:t>&lt;&lt;cs_{</w:t>
       </w:r>
-      <w:proofErr w:type="spellStart"/>
-      <w:r>
-        <w:rPr>
-          <w:rFonts w:ascii="Arial" w:hAnsi="Arial" w:cs="Arial"/>
-          <w:lang w:val="en-US"/>
-        </w:rPr>
-        <w:t>drawDirectionsOrderRequired</w:t>
-      </w:r>
-      <w:proofErr w:type="spellEnd"/>
-      <w:r>
-        <w:rPr>
-          <w:rFonts w:ascii="Arial" w:hAnsi="Arial" w:cs="Arial"/>
-          <w:lang w:val="en-US"/>
-        </w:rPr>
-        <w:t>=</w:t>
+      <w:r>
+        <w:rPr>
+          <w:rFonts w:ascii="Arial" w:hAnsi="Arial" w:cs="Arial"/>
+          <w:lang w:val="en-US"/>
+        </w:rPr>
+        <w:t>drawDirectionsOrderRequired=</w:t>
       </w:r>
       <w:r>
         <w:rPr>
@@ -1620,23 +1460,7 @@
           <w:rFonts w:ascii="Arial" w:hAnsi="Arial" w:cs="Arial"/>
           <w:lang w:val="en-US"/>
         </w:rPr>
-        <w:t xml:space="preserve"> &amp;&amp; </w:t>
-      </w:r>
-      <w:proofErr w:type="spellStart"/>
-      <w:r>
-        <w:rPr>
-          <w:rFonts w:ascii="Arial" w:hAnsi="Arial" w:cs="Arial"/>
-          <w:lang w:val="en-US"/>
-        </w:rPr>
-        <w:t>drawDirectionsOrder.judgementSum</w:t>
-      </w:r>
-      <w:proofErr w:type="spellEnd"/>
-      <w:r>
-        <w:rPr>
-          <w:rFonts w:ascii="Arial" w:hAnsi="Arial" w:cs="Arial"/>
-          <w:lang w:val="en-US"/>
-        </w:rPr>
-        <w:t>!=</w:t>
+        <w:t xml:space="preserve"> &amp;&amp; drawDirectionsOrder.judgementSum!=</w:t>
       </w:r>
       <w:r>
         <w:rPr>
@@ -1680,7 +1504,6 @@
         </w:rPr>
         <w:t>&lt;&lt;</w:t>
       </w:r>
-      <w:proofErr w:type="spellStart"/>
       <w:r>
         <w:rPr>
           <w:rFonts w:ascii="Arial" w:hAnsi="Arial" w:cs="Arial"/>
@@ -1688,7 +1511,6 @@
         </w:rPr>
         <w:t>drawDirectionsOrder.judgementSum</w:t>
       </w:r>
-      <w:proofErr w:type="spellEnd"/>
       <w:r>
         <w:rPr>
           <w:rFonts w:ascii="Arial" w:hAnsi="Arial" w:cs="Arial"/>
@@ -1752,23 +1574,7 @@
           <w:rFonts w:ascii="Arial" w:hAnsi="Arial" w:cs="Arial"/>
           <w:lang w:val="en-US"/>
         </w:rPr>
-        <w:t>_{</w:t>
-      </w:r>
-      <w:proofErr w:type="spellStart"/>
-      <w:r>
-        <w:rPr>
-          <w:rFonts w:ascii="Arial" w:hAnsi="Arial" w:cs="Arial"/>
-          <w:lang w:val="en-US"/>
-        </w:rPr>
-        <w:t>fastTrackAltDisputeResolutionToggle</w:t>
-      </w:r>
-      <w:proofErr w:type="spellEnd"/>
-      <w:r>
-        <w:rPr>
-          <w:rFonts w:ascii="Arial" w:hAnsi="Arial" w:cs="Arial"/>
-          <w:lang w:val="en-US"/>
-        </w:rPr>
-        <w:t>=true}&gt;&gt;</w:t>
+        <w:t>_{fastTrackAltDisputeResolutionToggle=true}&gt;&gt;</w:t>
       </w:r>
     </w:p>
     <w:p>
@@ -1845,21 +1651,12 @@
         </w:rPr>
         <w:t>&lt;&lt;cs_{</w:t>
       </w:r>
-      <w:proofErr w:type="spellStart"/>
-      <w:r>
-        <w:rPr>
-          <w:rFonts w:ascii="Arial" w:hAnsi="Arial" w:cs="Arial"/>
-          <w:lang w:val="en-US"/>
-        </w:rPr>
-        <w:t>fastTrackVariationOfDirectionsToggle</w:t>
-      </w:r>
-      <w:proofErr w:type="spellEnd"/>
-      <w:r>
-        <w:rPr>
-          <w:rFonts w:ascii="Arial" w:hAnsi="Arial" w:cs="Arial"/>
-          <w:lang w:val="en-US"/>
-        </w:rPr>
-        <w:t>=true}&gt;&gt;</w:t>
+      <w:r>
+        <w:rPr>
+          <w:rFonts w:ascii="Arial" w:hAnsi="Arial" w:cs="Arial"/>
+          <w:lang w:val="en-US"/>
+        </w:rPr>
+        <w:t>fastTrackVariationOfDirectionsToggle=true}&gt;&gt;</w:t>
       </w:r>
     </w:p>
     <w:p>
@@ -1935,21 +1732,12 @@
         </w:rPr>
         <w:t>&lt;&lt;cs_{</w:t>
       </w:r>
-      <w:proofErr w:type="spellStart"/>
-      <w:r>
-        <w:rPr>
-          <w:rFonts w:ascii="Arial" w:hAnsi="Arial" w:cs="Arial"/>
-          <w:lang w:val="en-US"/>
-        </w:rPr>
-        <w:t>fastTrackSettlementToggle</w:t>
-      </w:r>
-      <w:proofErr w:type="spellEnd"/>
-      <w:r>
-        <w:rPr>
-          <w:rFonts w:ascii="Arial" w:hAnsi="Arial" w:cs="Arial"/>
-          <w:lang w:val="en-US"/>
-        </w:rPr>
-        <w:t>=true}&gt;&gt;</w:t>
+      <w:r>
+        <w:rPr>
+          <w:rFonts w:ascii="Arial" w:hAnsi="Arial" w:cs="Arial"/>
+          <w:lang w:val="en-US"/>
+        </w:rPr>
+        <w:t>fastTrackSettlementToggle=true}&gt;&gt;</w:t>
       </w:r>
     </w:p>
     <w:p>
@@ -2015,21 +1803,12 @@
         </w:rPr>
         <w:t>&lt;&lt;cs_{</w:t>
       </w:r>
-      <w:proofErr w:type="spellStart"/>
-      <w:r>
-        <w:rPr>
-          <w:rFonts w:ascii="Arial" w:hAnsi="Arial" w:cs="Arial"/>
-          <w:lang w:val="en-US"/>
-        </w:rPr>
-        <w:t>fastTrackDisclosureOfDocumentsToggle</w:t>
-      </w:r>
-      <w:proofErr w:type="spellEnd"/>
-      <w:r>
-        <w:rPr>
-          <w:rFonts w:ascii="Arial" w:hAnsi="Arial" w:cs="Arial"/>
-          <w:lang w:val="en-US"/>
-        </w:rPr>
-        <w:t>=true}&gt;&gt;</w:t>
+      <w:r>
+        <w:rPr>
+          <w:rFonts w:ascii="Arial" w:hAnsi="Arial" w:cs="Arial"/>
+          <w:lang w:val="en-US"/>
+        </w:rPr>
+        <w:t>fastTrackDisclosureOfDocumentsToggle=true}&gt;&gt;</w:t>
       </w:r>
     </w:p>
     <w:p>
@@ -2097,76 +1876,28 @@
           <w:rFonts w:ascii="Arial" w:eastAsia="Arial" w:hAnsi="Arial" w:cs="Arial"/>
           <w:bCs/>
         </w:rPr>
-        <w:t>{</w:t>
-      </w:r>
-      <w:proofErr w:type="spellStart"/>
+        <w:t>{dateFormat(</w:t>
+      </w:r>
+      <w:r>
+        <w:rPr>
+          <w:rFonts w:ascii="Arial" w:hAnsi="Arial" w:cs="Arial"/>
+          <w:lang w:val="en-US"/>
+        </w:rPr>
+        <w:t>fastTrackDisclosureOfDocuments.</w:t>
+      </w:r>
+      <w:r>
+        <w:rPr>
+          <w:rFonts w:ascii="Arial" w:hAnsi="Arial" w:cs="Arial"/>
+          <w:lang w:val="en-US"/>
+        </w:rPr>
+        <w:t>date1</w:t>
+      </w:r>
       <w:r>
         <w:rPr>
           <w:rFonts w:ascii="Arial" w:eastAsia="Arial" w:hAnsi="Arial" w:cs="Arial"/>
           <w:bCs/>
         </w:rPr>
-        <w:t>dateFormat</w:t>
-      </w:r>
-      <w:proofErr w:type="spellEnd"/>
-      <w:r>
-        <w:rPr>
-          <w:rFonts w:ascii="Arial" w:eastAsia="Arial" w:hAnsi="Arial" w:cs="Arial"/>
-          <w:bCs/>
-        </w:rPr>
-        <w:t>(</w:t>
-      </w:r>
-      <w:r>
-        <w:rPr>
-          <w:rFonts w:ascii="Arial" w:hAnsi="Arial" w:cs="Arial"/>
-          <w:lang w:val="en-US"/>
-        </w:rPr>
-        <w:t>fastTrackDisclosureOfDocuments.</w:t>
-      </w:r>
-      <w:r>
-        <w:rPr>
-          <w:rFonts w:ascii="Arial" w:hAnsi="Arial" w:cs="Arial"/>
-          <w:lang w:val="en-US"/>
-        </w:rPr>
-        <w:t>date1</w:t>
-      </w:r>
-      <w:r>
-        <w:rPr>
-          <w:rFonts w:ascii="Arial" w:eastAsia="Arial" w:hAnsi="Arial" w:cs="Arial"/>
-          <w:bCs/>
-        </w:rPr>
-        <w:t xml:space="preserve">, ‘dd MMMM </w:t>
-      </w:r>
-      <w:proofErr w:type="spellStart"/>
-      <w:r>
-        <w:rPr>
-          <w:rFonts w:ascii="Arial" w:eastAsia="Arial" w:hAnsi="Arial" w:cs="Arial"/>
-          <w:bCs/>
-        </w:rPr>
-        <w:t>yyyy</w:t>
-      </w:r>
-      <w:proofErr w:type="spellEnd"/>
-      <w:r>
-        <w:rPr>
-          <w:rFonts w:ascii="Arial" w:eastAsia="Arial" w:hAnsi="Arial" w:cs="Arial"/>
-          <w:bCs/>
-        </w:rPr>
-        <w:t>’, ‘</w:t>
-      </w:r>
-      <w:proofErr w:type="spellStart"/>
-      <w:r>
-        <w:rPr>
-          <w:rFonts w:ascii="Arial" w:eastAsia="Arial" w:hAnsi="Arial" w:cs="Arial"/>
-          <w:bCs/>
-        </w:rPr>
-        <w:t>yyyy</w:t>
-      </w:r>
-      <w:proofErr w:type="spellEnd"/>
-      <w:r>
-        <w:rPr>
-          <w:rFonts w:ascii="Arial" w:eastAsia="Arial" w:hAnsi="Arial" w:cs="Arial"/>
-          <w:bCs/>
-        </w:rPr>
-        <w:t>-MM-dd’</w:t>
+        <w:t>, ‘dd MMMM yyyy’, ‘yyyy-MM-dd’</w:t>
       </w:r>
       <w:r>
         <w:rPr>
@@ -2247,76 +1978,28 @@
           <w:rFonts w:ascii="Arial" w:eastAsia="Arial" w:hAnsi="Arial" w:cs="Arial"/>
           <w:bCs/>
         </w:rPr>
-        <w:t>{</w:t>
-      </w:r>
-      <w:proofErr w:type="spellStart"/>
+        <w:t>{dateFormat(</w:t>
+      </w:r>
+      <w:r>
+        <w:rPr>
+          <w:rFonts w:ascii="Arial" w:hAnsi="Arial" w:cs="Arial"/>
+          <w:lang w:val="en-US"/>
+        </w:rPr>
+        <w:t>fastTrackDisclosureOfDocuments.</w:t>
+      </w:r>
+      <w:r>
+        <w:rPr>
+          <w:rFonts w:ascii="Arial" w:hAnsi="Arial" w:cs="Arial"/>
+          <w:lang w:val="en-US"/>
+        </w:rPr>
+        <w:t>date2</w:t>
+      </w:r>
       <w:r>
         <w:rPr>
           <w:rFonts w:ascii="Arial" w:eastAsia="Arial" w:hAnsi="Arial" w:cs="Arial"/>
           <w:bCs/>
         </w:rPr>
-        <w:t>dateFormat</w:t>
-      </w:r>
-      <w:proofErr w:type="spellEnd"/>
-      <w:r>
-        <w:rPr>
-          <w:rFonts w:ascii="Arial" w:eastAsia="Arial" w:hAnsi="Arial" w:cs="Arial"/>
-          <w:bCs/>
-        </w:rPr>
-        <w:t>(</w:t>
-      </w:r>
-      <w:r>
-        <w:rPr>
-          <w:rFonts w:ascii="Arial" w:hAnsi="Arial" w:cs="Arial"/>
-          <w:lang w:val="en-US"/>
-        </w:rPr>
-        <w:t>fastTrackDisclosureOfDocuments.</w:t>
-      </w:r>
-      <w:r>
-        <w:rPr>
-          <w:rFonts w:ascii="Arial" w:hAnsi="Arial" w:cs="Arial"/>
-          <w:lang w:val="en-US"/>
-        </w:rPr>
-        <w:t>date2</w:t>
-      </w:r>
-      <w:r>
-        <w:rPr>
-          <w:rFonts w:ascii="Arial" w:eastAsia="Arial" w:hAnsi="Arial" w:cs="Arial"/>
-          <w:bCs/>
-        </w:rPr>
-        <w:t xml:space="preserve">, ‘dd MMMM </w:t>
-      </w:r>
-      <w:proofErr w:type="spellStart"/>
-      <w:r>
-        <w:rPr>
-          <w:rFonts w:ascii="Arial" w:eastAsia="Arial" w:hAnsi="Arial" w:cs="Arial"/>
-          <w:bCs/>
-        </w:rPr>
-        <w:t>yyyy</w:t>
-      </w:r>
-      <w:proofErr w:type="spellEnd"/>
-      <w:r>
-        <w:rPr>
-          <w:rFonts w:ascii="Arial" w:eastAsia="Arial" w:hAnsi="Arial" w:cs="Arial"/>
-          <w:bCs/>
-        </w:rPr>
-        <w:t>’, ‘</w:t>
-      </w:r>
-      <w:proofErr w:type="spellStart"/>
-      <w:r>
-        <w:rPr>
-          <w:rFonts w:ascii="Arial" w:eastAsia="Arial" w:hAnsi="Arial" w:cs="Arial"/>
-          <w:bCs/>
-        </w:rPr>
-        <w:t>yyyy</w:t>
-      </w:r>
-      <w:proofErr w:type="spellEnd"/>
-      <w:r>
-        <w:rPr>
-          <w:rFonts w:ascii="Arial" w:eastAsia="Arial" w:hAnsi="Arial" w:cs="Arial"/>
-          <w:bCs/>
-        </w:rPr>
-        <w:t>-MM-dd’</w:t>
+        <w:t>, ‘dd MMMM yyyy’, ‘yyyy-MM-dd’</w:t>
       </w:r>
       <w:r>
         <w:rPr>
@@ -2417,89 +2100,41 @@
           <w:rFonts w:ascii="Arial" w:eastAsia="Arial" w:hAnsi="Arial" w:cs="Arial"/>
           <w:bCs/>
         </w:rPr>
-        <w:t>{</w:t>
-      </w:r>
-      <w:proofErr w:type="spellStart"/>
+        <w:t>{dateFormat(</w:t>
+      </w:r>
+      <w:r>
+        <w:rPr>
+          <w:rFonts w:ascii="Arial" w:hAnsi="Arial" w:cs="Arial"/>
+          <w:lang w:val="en-US"/>
+        </w:rPr>
+        <w:t>fastTrackDisclosureOfDocuments.</w:t>
+      </w:r>
+      <w:r>
+        <w:rPr>
+          <w:rFonts w:ascii="Arial" w:hAnsi="Arial" w:cs="Arial"/>
+          <w:lang w:val="en-US"/>
+        </w:rPr>
+        <w:t>date3</w:t>
+      </w:r>
       <w:r>
         <w:rPr>
           <w:rFonts w:ascii="Arial" w:eastAsia="Arial" w:hAnsi="Arial" w:cs="Arial"/>
           <w:bCs/>
         </w:rPr>
-        <w:t>dateFormat</w:t>
-      </w:r>
-      <w:proofErr w:type="spellEnd"/>
+        <w:t>, ‘dd MMMM yyyy’, ‘yyyy-MM-dd’</w:t>
+      </w:r>
       <w:r>
         <w:rPr>
           <w:rFonts w:ascii="Arial" w:eastAsia="Arial" w:hAnsi="Arial" w:cs="Arial"/>
           <w:bCs/>
         </w:rPr>
-        <w:t>(</w:t>
-      </w:r>
-      <w:r>
-        <w:rPr>
-          <w:rFonts w:ascii="Arial" w:hAnsi="Arial" w:cs="Arial"/>
-          <w:lang w:val="en-US"/>
-        </w:rPr>
-        <w:t>fastTrackDisclosureOfDocuments.</w:t>
-      </w:r>
-      <w:r>
-        <w:rPr>
-          <w:rFonts w:ascii="Arial" w:hAnsi="Arial" w:cs="Arial"/>
-          <w:lang w:val="en-US"/>
-        </w:rPr>
-        <w:t>date3</w:t>
+        <w:t>)</w:t>
       </w:r>
       <w:r>
         <w:rPr>
           <w:rFonts w:ascii="Arial" w:eastAsia="Arial" w:hAnsi="Arial" w:cs="Arial"/>
           <w:bCs/>
         </w:rPr>
-        <w:t xml:space="preserve">, ‘dd MMMM </w:t>
-      </w:r>
-      <w:proofErr w:type="spellStart"/>
-      <w:r>
-        <w:rPr>
-          <w:rFonts w:ascii="Arial" w:eastAsia="Arial" w:hAnsi="Arial" w:cs="Arial"/>
-          <w:bCs/>
-        </w:rPr>
-        <w:t>yyyy</w:t>
-      </w:r>
-      <w:proofErr w:type="spellEnd"/>
-      <w:r>
-        <w:rPr>
-          <w:rFonts w:ascii="Arial" w:eastAsia="Arial" w:hAnsi="Arial" w:cs="Arial"/>
-          <w:bCs/>
-        </w:rPr>
-        <w:t>’, ‘</w:t>
-      </w:r>
-      <w:proofErr w:type="spellStart"/>
-      <w:r>
-        <w:rPr>
-          <w:rFonts w:ascii="Arial" w:eastAsia="Arial" w:hAnsi="Arial" w:cs="Arial"/>
-          <w:bCs/>
-        </w:rPr>
-        <w:t>yyyy</w:t>
-      </w:r>
-      <w:proofErr w:type="spellEnd"/>
-      <w:r>
-        <w:rPr>
-          <w:rFonts w:ascii="Arial" w:eastAsia="Arial" w:hAnsi="Arial" w:cs="Arial"/>
-          <w:bCs/>
-        </w:rPr>
-        <w:t>-MM-dd’</w:t>
-      </w:r>
-      <w:r>
-        <w:rPr>
-          <w:rFonts w:ascii="Arial" w:eastAsia="Arial" w:hAnsi="Arial" w:cs="Arial"/>
-          <w:bCs/>
-        </w:rPr>
-        <w:t>)</w:t>
-      </w:r>
-      <w:r>
-        <w:rPr>
-          <w:rFonts w:ascii="Arial" w:eastAsia="Arial" w:hAnsi="Arial" w:cs="Arial"/>
-          <w:bCs/>
-        </w:rPr>
         <w:t>}</w:t>
       </w:r>
       <w:r>
@@ -2546,21 +2181,12 @@
         </w:rPr>
         <w:t>&lt;&lt;cs_{</w:t>
       </w:r>
-      <w:proofErr w:type="spellStart"/>
-      <w:r>
-        <w:rPr>
-          <w:rFonts w:ascii="Arial" w:hAnsi="Arial" w:cs="Arial"/>
-          <w:lang w:val="en-US"/>
-        </w:rPr>
-        <w:t>fastTrackWitnessOfFactToggle</w:t>
-      </w:r>
-      <w:proofErr w:type="spellEnd"/>
-      <w:r>
-        <w:rPr>
-          <w:rFonts w:ascii="Arial" w:hAnsi="Arial" w:cs="Arial"/>
-          <w:lang w:val="en-US"/>
-        </w:rPr>
-        <w:t>=true}&gt;&gt;</w:t>
+      <w:r>
+        <w:rPr>
+          <w:rFonts w:ascii="Arial" w:hAnsi="Arial" w:cs="Arial"/>
+          <w:lang w:val="en-US"/>
+        </w:rPr>
+        <w:t>fastTrackWitnessOfFactToggle=true}&gt;&gt;</w:t>
       </w:r>
     </w:p>
     <w:p>
@@ -2859,49 +2485,7 @@
         <w:rPr>
           <w:rFonts w:ascii="Arial" w:hAnsi="Arial" w:cs="Arial"/>
         </w:rPr>
-        <w:t>&lt;&lt;{</w:t>
-      </w:r>
-      <w:proofErr w:type="spellStart"/>
-      <w:r>
-        <w:rPr>
-          <w:rFonts w:ascii="Arial" w:hAnsi="Arial" w:cs="Arial"/>
-        </w:rPr>
-        <w:t>dateFormat</w:t>
-      </w:r>
-      <w:proofErr w:type="spellEnd"/>
-      <w:r>
-        <w:rPr>
-          <w:rFonts w:ascii="Arial" w:hAnsi="Arial" w:cs="Arial"/>
-        </w:rPr>
-        <w:t xml:space="preserve">(sdoR2WitnessesOfFact.sdoWitnessDeadlineDate, ‘dd MMMM </w:t>
-      </w:r>
-      <w:proofErr w:type="spellStart"/>
-      <w:r>
-        <w:rPr>
-          <w:rFonts w:ascii="Arial" w:hAnsi="Arial" w:cs="Arial"/>
-        </w:rPr>
-        <w:t>yyyy</w:t>
-      </w:r>
-      <w:proofErr w:type="spellEnd"/>
-      <w:r>
-        <w:rPr>
-          <w:rFonts w:ascii="Arial" w:hAnsi="Arial" w:cs="Arial"/>
-        </w:rPr>
-        <w:t>’, ‘</w:t>
-      </w:r>
-      <w:proofErr w:type="spellStart"/>
-      <w:r>
-        <w:rPr>
-          <w:rFonts w:ascii="Arial" w:hAnsi="Arial" w:cs="Arial"/>
-        </w:rPr>
-        <w:t>yyyy</w:t>
-      </w:r>
-      <w:proofErr w:type="spellEnd"/>
-      <w:r>
-        <w:rPr>
-          <w:rFonts w:ascii="Arial" w:hAnsi="Arial" w:cs="Arial"/>
-        </w:rPr>
-        <w:t>-MM-dd’)}&gt;&gt;.</w:t>
+        <w:t>&lt;&lt;{dateFormat(sdoR2WitnessesOfFact.sdoWitnessDeadlineDate, ‘dd MMMM yyyy’, ‘yyyy-MM-dd’)}&gt;&gt;.</w:t>
       </w:r>
     </w:p>
     <w:p>
@@ -2951,21 +2535,12 @@
         </w:rPr>
         <w:t>&lt;&lt;cs_{</w:t>
       </w:r>
-      <w:proofErr w:type="spellStart"/>
-      <w:r>
-        <w:rPr>
-          <w:rFonts w:ascii="Arial" w:hAnsi="Arial" w:cs="Arial"/>
-          <w:lang w:val="en-US"/>
-        </w:rPr>
-        <w:t>fastTrackSchedulesOfLossToggle</w:t>
-      </w:r>
-      <w:proofErr w:type="spellEnd"/>
-      <w:r>
-        <w:rPr>
-          <w:rFonts w:ascii="Arial" w:hAnsi="Arial" w:cs="Arial"/>
-          <w:lang w:val="en-US"/>
-        </w:rPr>
-        <w:t>=true}&gt;&gt;</w:t>
+      <w:r>
+        <w:rPr>
+          <w:rFonts w:ascii="Arial" w:hAnsi="Arial" w:cs="Arial"/>
+          <w:lang w:val="en-US"/>
+        </w:rPr>
+        <w:t>fastTrackSchedulesOfLossToggle=true}&gt;&gt;</w:t>
       </w:r>
     </w:p>
     <w:p>
@@ -3033,76 +2608,28 @@
           <w:rFonts w:ascii="Arial" w:eastAsia="Arial" w:hAnsi="Arial" w:cs="Arial"/>
           <w:bCs/>
         </w:rPr>
-        <w:t>{</w:t>
-      </w:r>
-      <w:proofErr w:type="spellStart"/>
+        <w:t>{dateFormat(</w:t>
+      </w:r>
+      <w:r>
+        <w:rPr>
+          <w:rFonts w:ascii="Arial" w:hAnsi="Arial" w:cs="Arial"/>
+          <w:lang w:val="en-US"/>
+        </w:rPr>
+        <w:t>fastTrackSchedulesOfLoss.</w:t>
+      </w:r>
+      <w:r>
+        <w:rPr>
+          <w:rFonts w:ascii="Arial" w:hAnsi="Arial" w:cs="Arial"/>
+          <w:lang w:val="en-US"/>
+        </w:rPr>
+        <w:t>date1</w:t>
+      </w:r>
       <w:r>
         <w:rPr>
           <w:rFonts w:ascii="Arial" w:eastAsia="Arial" w:hAnsi="Arial" w:cs="Arial"/>
           <w:bCs/>
         </w:rPr>
-        <w:t>dateFormat</w:t>
-      </w:r>
-      <w:proofErr w:type="spellEnd"/>
-      <w:r>
-        <w:rPr>
-          <w:rFonts w:ascii="Arial" w:eastAsia="Arial" w:hAnsi="Arial" w:cs="Arial"/>
-          <w:bCs/>
-        </w:rPr>
-        <w:t>(</w:t>
-      </w:r>
-      <w:r>
-        <w:rPr>
-          <w:rFonts w:ascii="Arial" w:hAnsi="Arial" w:cs="Arial"/>
-          <w:lang w:val="en-US"/>
-        </w:rPr>
-        <w:t>fastTrackSchedulesOfLoss.</w:t>
-      </w:r>
-      <w:r>
-        <w:rPr>
-          <w:rFonts w:ascii="Arial" w:hAnsi="Arial" w:cs="Arial"/>
-          <w:lang w:val="en-US"/>
-        </w:rPr>
-        <w:t>date1</w:t>
-      </w:r>
-      <w:r>
-        <w:rPr>
-          <w:rFonts w:ascii="Arial" w:eastAsia="Arial" w:hAnsi="Arial" w:cs="Arial"/>
-          <w:bCs/>
-        </w:rPr>
-        <w:t xml:space="preserve">, ‘dd MMMM </w:t>
-      </w:r>
-      <w:proofErr w:type="spellStart"/>
-      <w:r>
-        <w:rPr>
-          <w:rFonts w:ascii="Arial" w:eastAsia="Arial" w:hAnsi="Arial" w:cs="Arial"/>
-          <w:bCs/>
-        </w:rPr>
-        <w:t>yyyy</w:t>
-      </w:r>
-      <w:proofErr w:type="spellEnd"/>
-      <w:r>
-        <w:rPr>
-          <w:rFonts w:ascii="Arial" w:eastAsia="Arial" w:hAnsi="Arial" w:cs="Arial"/>
-          <w:bCs/>
-        </w:rPr>
-        <w:t>’, ‘</w:t>
-      </w:r>
-      <w:proofErr w:type="spellStart"/>
-      <w:r>
-        <w:rPr>
-          <w:rFonts w:ascii="Arial" w:eastAsia="Arial" w:hAnsi="Arial" w:cs="Arial"/>
-          <w:bCs/>
-        </w:rPr>
-        <w:t>yyyy</w:t>
-      </w:r>
-      <w:proofErr w:type="spellEnd"/>
-      <w:r>
-        <w:rPr>
-          <w:rFonts w:ascii="Arial" w:eastAsia="Arial" w:hAnsi="Arial" w:cs="Arial"/>
-          <w:bCs/>
-        </w:rPr>
-        <w:t>-MM-dd’</w:t>
+        <w:t>, ‘dd MMMM yyyy’, ‘yyyy-MM-dd’</w:t>
       </w:r>
       <w:r>
         <w:rPr>
@@ -3183,76 +2710,28 @@
           <w:rFonts w:ascii="Arial" w:eastAsia="Arial" w:hAnsi="Arial" w:cs="Arial"/>
           <w:bCs/>
         </w:rPr>
-        <w:t>{</w:t>
-      </w:r>
-      <w:proofErr w:type="spellStart"/>
+        <w:t>{dateFormat(</w:t>
+      </w:r>
+      <w:r>
+        <w:rPr>
+          <w:rFonts w:ascii="Arial" w:hAnsi="Arial" w:cs="Arial"/>
+          <w:lang w:val="en-US"/>
+        </w:rPr>
+        <w:t>fastTrackSchedulesOfLoss.</w:t>
+      </w:r>
+      <w:r>
+        <w:rPr>
+          <w:rFonts w:ascii="Arial" w:hAnsi="Arial" w:cs="Arial"/>
+          <w:lang w:val="en-US"/>
+        </w:rPr>
+        <w:t>date2</w:t>
+      </w:r>
       <w:r>
         <w:rPr>
           <w:rFonts w:ascii="Arial" w:eastAsia="Arial" w:hAnsi="Arial" w:cs="Arial"/>
           <w:bCs/>
         </w:rPr>
-        <w:t>dateFormat</w:t>
-      </w:r>
-      <w:proofErr w:type="spellEnd"/>
-      <w:r>
-        <w:rPr>
-          <w:rFonts w:ascii="Arial" w:eastAsia="Arial" w:hAnsi="Arial" w:cs="Arial"/>
-          <w:bCs/>
-        </w:rPr>
-        <w:t>(</w:t>
-      </w:r>
-      <w:r>
-        <w:rPr>
-          <w:rFonts w:ascii="Arial" w:hAnsi="Arial" w:cs="Arial"/>
-          <w:lang w:val="en-US"/>
-        </w:rPr>
-        <w:t>fastTrackSchedulesOfLoss.</w:t>
-      </w:r>
-      <w:r>
-        <w:rPr>
-          <w:rFonts w:ascii="Arial" w:hAnsi="Arial" w:cs="Arial"/>
-          <w:lang w:val="en-US"/>
-        </w:rPr>
-        <w:t>date2</w:t>
-      </w:r>
-      <w:r>
-        <w:rPr>
-          <w:rFonts w:ascii="Arial" w:eastAsia="Arial" w:hAnsi="Arial" w:cs="Arial"/>
-          <w:bCs/>
-        </w:rPr>
-        <w:t xml:space="preserve">, ‘dd MMMM </w:t>
-      </w:r>
-      <w:proofErr w:type="spellStart"/>
-      <w:r>
-        <w:rPr>
-          <w:rFonts w:ascii="Arial" w:eastAsia="Arial" w:hAnsi="Arial" w:cs="Arial"/>
-          <w:bCs/>
-        </w:rPr>
-        <w:t>yyyy</w:t>
-      </w:r>
-      <w:proofErr w:type="spellEnd"/>
-      <w:r>
-        <w:rPr>
-          <w:rFonts w:ascii="Arial" w:eastAsia="Arial" w:hAnsi="Arial" w:cs="Arial"/>
-          <w:bCs/>
-        </w:rPr>
-        <w:t>’, ‘</w:t>
-      </w:r>
-      <w:proofErr w:type="spellStart"/>
-      <w:r>
-        <w:rPr>
-          <w:rFonts w:ascii="Arial" w:eastAsia="Arial" w:hAnsi="Arial" w:cs="Arial"/>
-          <w:bCs/>
-        </w:rPr>
-        <w:t>yyyy</w:t>
-      </w:r>
-      <w:proofErr w:type="spellEnd"/>
-      <w:r>
-        <w:rPr>
-          <w:rFonts w:ascii="Arial" w:eastAsia="Arial" w:hAnsi="Arial" w:cs="Arial"/>
-          <w:bCs/>
-        </w:rPr>
-        <w:t>-MM-dd’</w:t>
+        <w:t>, ‘dd MMMM yyyy’, ‘yyyy-MM-dd’</w:t>
       </w:r>
       <w:r>
         <w:rPr>
@@ -3343,21 +2822,12 @@
         </w:rPr>
         <w:t>&lt;&lt;cs_{</w:t>
       </w:r>
-      <w:proofErr w:type="spellStart"/>
-      <w:r>
-        <w:rPr>
-          <w:rFonts w:ascii="Arial" w:hAnsi="Arial" w:cs="Arial"/>
-          <w:lang w:val="en-US"/>
-        </w:rPr>
-        <w:t>fastTrackTrialToggle</w:t>
-      </w:r>
-      <w:proofErr w:type="spellEnd"/>
-      <w:r>
-        <w:rPr>
-          <w:rFonts w:ascii="Arial" w:hAnsi="Arial" w:cs="Arial"/>
-          <w:lang w:val="en-US"/>
-        </w:rPr>
-        <w:t>=true}&gt;&gt;</w:t>
+      <w:r>
+        <w:rPr>
+          <w:rFonts w:ascii="Arial" w:hAnsi="Arial" w:cs="Arial"/>
+          <w:lang w:val="en-US"/>
+        </w:rPr>
+        <w:t>fastTrackTrialToggle=true}&gt;&gt;</w:t>
       </w:r>
     </w:p>
     <w:p>
@@ -3390,7 +2860,6 @@
         </w:rPr>
         <w:t>&lt;&lt;cs_{</w:t>
       </w:r>
-      <w:proofErr w:type="spellStart"/>
       <w:r>
         <w:rPr>
           <w:rFonts w:ascii="Arial" w:hAnsi="Arial" w:cs="Arial"/>
@@ -3398,7 +2867,6 @@
         </w:rPr>
         <w:t>fastTrackTrialDateToToggle</w:t>
       </w:r>
-      <w:proofErr w:type="spellEnd"/>
       <w:r>
         <w:rPr>
           <w:rFonts w:ascii="Arial" w:hAnsi="Arial" w:cs="Arial"/>
@@ -3449,84 +2917,112 @@
           <w:rFonts w:ascii="Arial" w:eastAsia="Arial" w:hAnsi="Arial" w:cs="Arial"/>
           <w:bCs/>
         </w:rPr>
-        <w:t>{</w:t>
-      </w:r>
-      <w:proofErr w:type="spellStart"/>
+        <w:t>{dateFormat(</w:t>
+      </w:r>
+      <w:r>
+        <w:rPr>
+          <w:rFonts w:ascii="Arial" w:hAnsi="Arial" w:cs="Arial"/>
+          <w:lang w:val="en-US"/>
+        </w:rPr>
+        <w:t>fastTrackHearingTime.dateFrom</w:t>
+      </w:r>
       <w:r>
         <w:rPr>
           <w:rFonts w:ascii="Arial" w:eastAsia="Arial" w:hAnsi="Arial" w:cs="Arial"/>
           <w:bCs/>
         </w:rPr>
-        <w:t>dateFormat</w:t>
-      </w:r>
-      <w:proofErr w:type="spellEnd"/>
+        <w:t>, ‘dd MMMM yyyy’, ‘yyyy-MM-dd’</w:t>
+      </w:r>
       <w:r>
         <w:rPr>
           <w:rFonts w:ascii="Arial" w:eastAsia="Arial" w:hAnsi="Arial" w:cs="Arial"/>
           <w:bCs/>
         </w:rPr>
-        <w:t>(</w:t>
-      </w:r>
-      <w:proofErr w:type="spellStart"/>
-      <w:r>
-        <w:rPr>
-          <w:rFonts w:ascii="Arial" w:hAnsi="Arial" w:cs="Arial"/>
-          <w:lang w:val="en-US"/>
-        </w:rPr>
-        <w:t>fastTrackHearingTime.dateFrom</w:t>
-      </w:r>
-      <w:proofErr w:type="spellEnd"/>
+        <w:t>)</w:t>
+      </w:r>
       <w:r>
         <w:rPr>
           <w:rFonts w:ascii="Arial" w:eastAsia="Arial" w:hAnsi="Arial" w:cs="Arial"/>
           <w:bCs/>
         </w:rPr>
-        <w:t xml:space="preserve">, ‘dd MMMM </w:t>
-      </w:r>
-      <w:proofErr w:type="spellStart"/>
+        <w:t>}</w:t>
+      </w:r>
+      <w:r>
+        <w:rPr>
+          <w:rFonts w:ascii="Arial" w:hAnsi="Arial" w:cs="Arial"/>
+          <w:b/>
+          <w:bCs/>
+        </w:rPr>
+        <w:t>&gt;&gt;</w:t>
+      </w:r>
+      <w:r>
+        <w:rPr>
+          <w:rFonts w:ascii="Arial" w:hAnsi="Arial" w:cs="Arial"/>
+          <w:b/>
+          <w:bCs/>
+        </w:rPr>
+        <w:t xml:space="preserve"> </w:t>
+      </w:r>
+      <w:r>
+        <w:rPr>
+          <w:rFonts w:ascii="Arial" w:hAnsi="Arial" w:cs="Arial"/>
+        </w:rPr>
+        <w:t xml:space="preserve">and </w:t>
+      </w:r>
+      <w:r>
+        <w:rPr>
+          <w:rFonts w:ascii="Arial" w:hAnsi="Arial" w:cs="Arial"/>
+        </w:rPr>
+        <w:t xml:space="preserve"> </w:t>
+      </w:r>
+      <w:r>
+        <w:rPr>
+          <w:rFonts w:ascii="Arial" w:hAnsi="Arial" w:cs="Arial"/>
+          <w:b/>
+          <w:bCs/>
+        </w:rPr>
+        <w:t>&lt;&lt;</w:t>
+      </w:r>
       <w:r>
         <w:rPr>
           <w:rFonts w:ascii="Arial" w:eastAsia="Arial" w:hAnsi="Arial" w:cs="Arial"/>
           <w:bCs/>
         </w:rPr>
-        <w:t>yyyy</w:t>
-      </w:r>
-      <w:proofErr w:type="spellEnd"/>
+        <w:t>{dateFormat(</w:t>
+      </w:r>
+      <w:r>
+        <w:rPr>
+          <w:rFonts w:ascii="Arial" w:hAnsi="Arial" w:cs="Arial"/>
+          <w:lang w:val="en-US"/>
+        </w:rPr>
+        <w:t>fastTrackHearingTime.date</w:t>
+      </w:r>
+      <w:r>
+        <w:rPr>
+          <w:rFonts w:ascii="Arial" w:hAnsi="Arial" w:cs="Arial"/>
+          <w:lang w:val="en-US"/>
+        </w:rPr>
+        <w:t>To</w:t>
+      </w:r>
       <w:r>
         <w:rPr>
           <w:rFonts w:ascii="Arial" w:eastAsia="Arial" w:hAnsi="Arial" w:cs="Arial"/>
           <w:bCs/>
         </w:rPr>
-        <w:t>’, ‘</w:t>
-      </w:r>
-      <w:proofErr w:type="spellStart"/>
+        <w:t>, ‘dd MMMM yyyy’, ‘yyyy-MM-dd’</w:t>
+      </w:r>
       <w:r>
         <w:rPr>
           <w:rFonts w:ascii="Arial" w:eastAsia="Arial" w:hAnsi="Arial" w:cs="Arial"/>
           <w:bCs/>
         </w:rPr>
-        <w:t>yyyy</w:t>
-      </w:r>
-      <w:proofErr w:type="spellEnd"/>
+        <w:t>)</w:t>
+      </w:r>
       <w:r>
         <w:rPr>
           <w:rFonts w:ascii="Arial" w:eastAsia="Arial" w:hAnsi="Arial" w:cs="Arial"/>
           <w:bCs/>
         </w:rPr>
-        <w:t>-MM-dd’</w:t>
-      </w:r>
-      <w:r>
-        <w:rPr>
-          <w:rFonts w:ascii="Arial" w:eastAsia="Arial" w:hAnsi="Arial" w:cs="Arial"/>
-          <w:bCs/>
-        </w:rPr>
-        <w:t>)</w:t>
-      </w:r>
-      <w:r>
-        <w:rPr>
-          <w:rFonts w:ascii="Arial" w:eastAsia="Arial" w:hAnsi="Arial" w:cs="Arial"/>
-          <w:bCs/>
-        </w:rPr>
         <w:t>}</w:t>
       </w:r>
       <w:r>
@@ -3543,13 +3039,19 @@
           <w:b/>
           <w:bCs/>
         </w:rPr>
+        <w:t>.</w:t>
+      </w:r>
+      <w:r>
+        <w:rPr>
+          <w:rFonts w:ascii="Arial" w:hAnsi="Arial" w:cs="Arial"/>
+        </w:rPr>
         <w:t xml:space="preserve"> </w:t>
       </w:r>
       <w:r>
         <w:rPr>
           <w:rFonts w:ascii="Arial" w:hAnsi="Arial" w:cs="Arial"/>
         </w:rPr>
-        <w:t xml:space="preserve">and </w:t>
+        <w:t>The time estimate is</w:t>
       </w:r>
       <w:r>
         <w:rPr>
@@ -3562,171 +3064,17 @@
           <w:rFonts w:ascii="Arial" w:hAnsi="Arial" w:cs="Arial"/>
           <w:b/>
           <w:bCs/>
-        </w:rPr>
-        <w:t>&lt;&lt;</w:t>
-      </w:r>
-      <w:r>
-        <w:rPr>
-          <w:rFonts w:ascii="Arial" w:eastAsia="Arial" w:hAnsi="Arial" w:cs="Arial"/>
-          <w:bCs/>
-        </w:rPr>
-        <w:t>{</w:t>
-      </w:r>
-      <w:proofErr w:type="spellStart"/>
-      <w:r>
-        <w:rPr>
-          <w:rFonts w:ascii="Arial" w:eastAsia="Arial" w:hAnsi="Arial" w:cs="Arial"/>
-          <w:bCs/>
-        </w:rPr>
-        <w:t>dateFormat</w:t>
-      </w:r>
-      <w:proofErr w:type="spellEnd"/>
-      <w:r>
-        <w:rPr>
-          <w:rFonts w:ascii="Arial" w:eastAsia="Arial" w:hAnsi="Arial" w:cs="Arial"/>
-          <w:bCs/>
-        </w:rPr>
-        <w:t>(</w:t>
-      </w:r>
-      <w:proofErr w:type="spellStart"/>
-      <w:r>
-        <w:rPr>
-          <w:rFonts w:ascii="Arial" w:hAnsi="Arial" w:cs="Arial"/>
-          <w:lang w:val="en-US"/>
-        </w:rPr>
-        <w:t>fastTrackHearingTime.date</w:t>
-      </w:r>
-      <w:r>
-        <w:rPr>
-          <w:rFonts w:ascii="Arial" w:hAnsi="Arial" w:cs="Arial"/>
-          <w:lang w:val="en-US"/>
-        </w:rPr>
-        <w:t>To</w:t>
-      </w:r>
-      <w:proofErr w:type="spellEnd"/>
-      <w:r>
-        <w:rPr>
-          <w:rFonts w:ascii="Arial" w:eastAsia="Arial" w:hAnsi="Arial" w:cs="Arial"/>
-          <w:bCs/>
-        </w:rPr>
-        <w:t xml:space="preserve">, ‘dd MMMM </w:t>
-      </w:r>
-      <w:proofErr w:type="spellStart"/>
-      <w:r>
-        <w:rPr>
-          <w:rFonts w:ascii="Arial" w:eastAsia="Arial" w:hAnsi="Arial" w:cs="Arial"/>
-          <w:bCs/>
-        </w:rPr>
-        <w:t>yyyy</w:t>
-      </w:r>
-      <w:proofErr w:type="spellEnd"/>
-      <w:r>
-        <w:rPr>
-          <w:rFonts w:ascii="Arial" w:eastAsia="Arial" w:hAnsi="Arial" w:cs="Arial"/>
-          <w:bCs/>
-        </w:rPr>
-        <w:t>’, ‘</w:t>
-      </w:r>
-      <w:proofErr w:type="spellStart"/>
-      <w:r>
-        <w:rPr>
-          <w:rFonts w:ascii="Arial" w:eastAsia="Arial" w:hAnsi="Arial" w:cs="Arial"/>
-          <w:bCs/>
-        </w:rPr>
-        <w:t>yyyy</w:t>
-      </w:r>
-      <w:proofErr w:type="spellEnd"/>
-      <w:r>
-        <w:rPr>
-          <w:rFonts w:ascii="Arial" w:eastAsia="Arial" w:hAnsi="Arial" w:cs="Arial"/>
-          <w:bCs/>
-        </w:rPr>
-        <w:t>-MM-dd’</w:t>
-      </w:r>
-      <w:r>
-        <w:rPr>
-          <w:rFonts w:ascii="Arial" w:eastAsia="Arial" w:hAnsi="Arial" w:cs="Arial"/>
-          <w:bCs/>
-        </w:rPr>
-        <w:t>)</w:t>
-      </w:r>
-      <w:r>
-        <w:rPr>
-          <w:rFonts w:ascii="Arial" w:eastAsia="Arial" w:hAnsi="Arial" w:cs="Arial"/>
-          <w:bCs/>
-        </w:rPr>
-        <w:t>}</w:t>
-      </w:r>
-      <w:r>
-        <w:rPr>
-          <w:rFonts w:ascii="Arial" w:hAnsi="Arial" w:cs="Arial"/>
-          <w:b/>
-          <w:bCs/>
-        </w:rPr>
-        <w:t>&gt;&gt;</w:t>
-      </w:r>
-      <w:r>
-        <w:rPr>
-          <w:rFonts w:ascii="Arial" w:hAnsi="Arial" w:cs="Arial"/>
-          <w:b/>
-          <w:bCs/>
+          <w:lang w:val="en-US"/>
+        </w:rPr>
+        <w:t>&lt;&lt;fastTrackHearingTimeEstimate&gt;&gt;</w:t>
+      </w:r>
+      <w:r>
+        <w:rPr>
+          <w:rFonts w:ascii="Arial" w:hAnsi="Arial" w:cs="Arial"/>
+          <w:lang w:val="en-US"/>
         </w:rPr>
         <w:t>.</w:t>
       </w:r>
-      <w:r>
-        <w:rPr>
-          <w:rFonts w:ascii="Arial" w:hAnsi="Arial" w:cs="Arial"/>
-        </w:rPr>
-        <w:t xml:space="preserve"> </w:t>
-      </w:r>
-      <w:r>
-        <w:rPr>
-          <w:rFonts w:ascii="Arial" w:hAnsi="Arial" w:cs="Arial"/>
-        </w:rPr>
-        <w:t>The time estimate is</w:t>
-      </w:r>
-      <w:r>
-        <w:rPr>
-          <w:rFonts w:ascii="Arial" w:hAnsi="Arial" w:cs="Arial"/>
-        </w:rPr>
-        <w:t xml:space="preserve"> </w:t>
-      </w:r>
-      <w:r>
-        <w:rPr>
-          <w:rFonts w:ascii="Arial" w:hAnsi="Arial" w:cs="Arial"/>
-          <w:b/>
-          <w:bCs/>
-          <w:lang w:val="en-US"/>
-        </w:rPr>
-        <w:t>&lt;&lt;</w:t>
-      </w:r>
-      <w:proofErr w:type="spellStart"/>
-      <w:r>
-        <w:rPr>
-          <w:rFonts w:ascii="Arial" w:hAnsi="Arial" w:cs="Arial"/>
-          <w:b/>
-          <w:bCs/>
-          <w:lang w:val="en-US"/>
-        </w:rPr>
-        <w:t>fastTrackHearingTimeEstimate</w:t>
-      </w:r>
-      <w:proofErr w:type="spellEnd"/>
-      <w:r>
-        <w:rPr>
-          <w:rFonts w:ascii="Arial" w:hAnsi="Arial" w:cs="Arial"/>
-          <w:b/>
-          <w:bCs/>
-          <w:lang w:val="en-US"/>
-        </w:rPr>
-        <w:t>&gt;&gt;</w:t>
-      </w:r>
-      <w:r>
-        <w:rPr>
-          <w:rFonts w:ascii="Arial" w:hAnsi="Arial" w:cs="Arial"/>
-          <w:lang w:val="en-US"/>
-        </w:rPr>
-        <w:t>.</w:t>
-      </w:r>
     </w:p>
     <w:p>
       <w:pPr>
@@ -3756,7 +3104,6 @@
         </w:rPr>
         <w:t>&lt;&lt;cs_{</w:t>
       </w:r>
-      <w:proofErr w:type="spellStart"/>
       <w:r>
         <w:rPr>
           <w:rFonts w:ascii="Arial" w:hAnsi="Arial" w:cs="Arial"/>
@@ -3764,7 +3111,6 @@
         </w:rPr>
         <w:t>fastTrackTrialDateToToggle</w:t>
       </w:r>
-      <w:proofErr w:type="spellEnd"/>
       <w:r>
         <w:rPr>
           <w:rFonts w:ascii="Arial" w:hAnsi="Arial" w:cs="Arial"/>
@@ -3835,84 +3181,34 @@
           <w:rFonts w:ascii="Arial" w:eastAsia="Arial" w:hAnsi="Arial" w:cs="Arial"/>
           <w:bCs/>
         </w:rPr>
-        <w:t>{</w:t>
-      </w:r>
-      <w:proofErr w:type="spellStart"/>
+        <w:t>{dateFormat(</w:t>
+      </w:r>
+      <w:r>
+        <w:rPr>
+          <w:rFonts w:ascii="Arial" w:hAnsi="Arial" w:cs="Arial"/>
+          <w:lang w:val="en-US"/>
+        </w:rPr>
+        <w:t>fastTrackHearingTime.dateFrom</w:t>
+      </w:r>
       <w:r>
         <w:rPr>
           <w:rFonts w:ascii="Arial" w:eastAsia="Arial" w:hAnsi="Arial" w:cs="Arial"/>
           <w:bCs/>
         </w:rPr>
-        <w:t>dateFormat</w:t>
-      </w:r>
-      <w:proofErr w:type="spellEnd"/>
+        <w:t>, ‘dd MMMM yyyy’, ‘yyyy-MM-dd’</w:t>
+      </w:r>
       <w:r>
         <w:rPr>
           <w:rFonts w:ascii="Arial" w:eastAsia="Arial" w:hAnsi="Arial" w:cs="Arial"/>
           <w:bCs/>
         </w:rPr>
-        <w:t>(</w:t>
-      </w:r>
-      <w:proofErr w:type="spellStart"/>
-      <w:r>
-        <w:rPr>
-          <w:rFonts w:ascii="Arial" w:hAnsi="Arial" w:cs="Arial"/>
-          <w:lang w:val="en-US"/>
-        </w:rPr>
-        <w:t>fastTrackHearingTime.dateFrom</w:t>
-      </w:r>
-      <w:proofErr w:type="spellEnd"/>
+        <w:t>)</w:t>
+      </w:r>
       <w:r>
         <w:rPr>
           <w:rFonts w:ascii="Arial" w:eastAsia="Arial" w:hAnsi="Arial" w:cs="Arial"/>
           <w:bCs/>
         </w:rPr>
-        <w:t xml:space="preserve">, ‘dd MMMM </w:t>
-      </w:r>
-      <w:proofErr w:type="spellStart"/>
-      <w:r>
-        <w:rPr>
-          <w:rFonts w:ascii="Arial" w:eastAsia="Arial" w:hAnsi="Arial" w:cs="Arial"/>
-          <w:bCs/>
-        </w:rPr>
-        <w:t>yyyy</w:t>
-      </w:r>
-      <w:proofErr w:type="spellEnd"/>
-      <w:r>
-        <w:rPr>
-          <w:rFonts w:ascii="Arial" w:eastAsia="Arial" w:hAnsi="Arial" w:cs="Arial"/>
-          <w:bCs/>
-        </w:rPr>
-        <w:t>’, ‘</w:t>
-      </w:r>
-      <w:proofErr w:type="spellStart"/>
-      <w:r>
-        <w:rPr>
-          <w:rFonts w:ascii="Arial" w:eastAsia="Arial" w:hAnsi="Arial" w:cs="Arial"/>
-          <w:bCs/>
-        </w:rPr>
-        <w:t>yyyy</w:t>
-      </w:r>
-      <w:proofErr w:type="spellEnd"/>
-      <w:r>
-        <w:rPr>
-          <w:rFonts w:ascii="Arial" w:eastAsia="Arial" w:hAnsi="Arial" w:cs="Arial"/>
-          <w:bCs/>
-        </w:rPr>
-        <w:t>-MM-dd’</w:t>
-      </w:r>
-      <w:r>
-        <w:rPr>
-          <w:rFonts w:ascii="Arial" w:eastAsia="Arial" w:hAnsi="Arial" w:cs="Arial"/>
-          <w:bCs/>
-        </w:rPr>
-        <w:t>)</w:t>
-      </w:r>
-      <w:r>
-        <w:rPr>
-          <w:rFonts w:ascii="Arial" w:eastAsia="Arial" w:hAnsi="Arial" w:cs="Arial"/>
-          <w:bCs/>
-        </w:rPr>
         <w:t>}</w:t>
       </w:r>
       <w:r>
@@ -3956,27 +3252,7 @@
           <w:bCs/>
           <w:lang w:val="en-US"/>
         </w:rPr>
-        <w:t>&lt;&lt;</w:t>
-      </w:r>
-      <w:proofErr w:type="spellStart"/>
-      <w:r>
-        <w:rPr>
-          <w:rFonts w:ascii="Arial" w:hAnsi="Arial" w:cs="Arial"/>
-          <w:b/>
-          <w:bCs/>
-          <w:lang w:val="en-US"/>
-        </w:rPr>
-        <w:t>fastTrackHearingTimeEstimate</w:t>
-      </w:r>
-      <w:proofErr w:type="spellEnd"/>
-      <w:r>
-        <w:rPr>
-          <w:rFonts w:ascii="Arial" w:hAnsi="Arial" w:cs="Arial"/>
-          <w:b/>
-          <w:bCs/>
-          <w:lang w:val="en-US"/>
-        </w:rPr>
-        <w:t>&gt;&gt;</w:t>
+        <w:t>&lt;&lt;fastTrackHearingTimeEstimate&gt;&gt;</w:t>
       </w:r>
       <w:r>
         <w:rPr>
@@ -4049,72 +3325,6 @@
     </w:p>
     <w:p>
       <w:pPr>
-        <w:pStyle w:val="ListParagraph"/>
-        <w:numPr>
-          <w:ilvl w:val="0"/>
-          <w:numId w:val="15"/>
-        </w:numPr>
-        <w:rPr>
-          <w:rFonts w:ascii="Arial" w:hAnsi="Arial" w:cs="Arial"/>
-          <w:lang w:val="en-US"/>
-        </w:rPr>
-      </w:pPr>
-      <w:r>
-        <w:rPr>
-          <w:rFonts w:ascii="Arial" w:hAnsi="Arial" w:cs="Arial"/>
-        </w:rPr>
-        <w:t>&lt;&lt;</w:t>
-      </w:r>
-      <w:r>
-        <w:rPr>
-          <w:rFonts w:ascii="Arial" w:hAnsi="Arial" w:cs="Arial"/>
-          <w:lang w:val="en-US"/>
-        </w:rPr>
-        <w:t xml:space="preserve"> </w:t>
-      </w:r>
-      <w:r>
-        <w:rPr>
-          <w:rFonts w:ascii="Arial" w:hAnsi="Arial" w:cs="Arial"/>
-          <w:lang w:val="en-US"/>
-        </w:rPr>
-        <w:t>fastTrackHearingTime</w:t>
-      </w:r>
-      <w:r>
-        <w:rPr>
-          <w:rFonts w:ascii="Arial" w:hAnsi="Arial" w:cs="Arial"/>
-          <w:lang w:val="en-US"/>
-        </w:rPr>
-        <w:t>.helpText2</w:t>
-      </w:r>
-      <w:r>
-        <w:rPr>
-          <w:rFonts w:ascii="Arial" w:hAnsi="Arial" w:cs="Arial"/>
-        </w:rPr>
-        <w:t>&gt;&gt;</w:t>
-      </w:r>
-      <w:r>
-        <w:rPr>
-          <w:rFonts w:ascii="Arial" w:hAnsi="Arial" w:cs="Arial"/>
-        </w:rPr>
-        <w:t xml:space="preserve"> &lt;&lt;</w:t>
-      </w:r>
-      <w:proofErr w:type="spellStart"/>
-      <w:r>
-        <w:rPr>
-          <w:rFonts w:ascii="Arial" w:hAnsi="Arial" w:cs="Arial"/>
-        </w:rPr>
-        <w:t>fastTrackTrialBundleTypeText</w:t>
-      </w:r>
-      <w:proofErr w:type="spellEnd"/>
-      <w:r>
-        <w:rPr>
-          <w:rFonts w:ascii="Arial" w:hAnsi="Arial" w:cs="Arial"/>
-        </w:rPr>
-        <w:t>&gt;&gt;</w:t>
-      </w:r>
-    </w:p>
-    <w:p>
-      <w:pPr>
         <w:rPr>
           <w:rFonts w:ascii="Arial" w:hAnsi="Arial" w:cs="Arial"/>
           <w:bCs/>
@@ -4142,7 +3352,6 @@
         </w:rPr>
         <w:t>&lt;&lt;cs_{</w:t>
       </w:r>
-      <w:proofErr w:type="spellStart"/>
       <w:r>
         <w:rPr>
           <w:rFonts w:ascii="Arial" w:hAnsi="Arial" w:cs="Arial"/>
@@ -4150,7 +3359,6 @@
         </w:rPr>
         <w:t>showBundleInfo</w:t>
       </w:r>
-      <w:proofErr w:type="spellEnd"/>
       <w:r>
         <w:rPr>
           <w:rFonts w:ascii="Arial" w:hAnsi="Arial" w:cs="Arial"/>
@@ -4628,21 +3836,12 @@
         </w:rPr>
         <w:t>&lt;&lt;cs_{</w:t>
       </w:r>
-      <w:proofErr w:type="spellStart"/>
-      <w:r>
-        <w:rPr>
-          <w:rFonts w:ascii="Arial" w:hAnsi="Arial" w:cs="Arial"/>
-          <w:lang w:val="en-US"/>
-        </w:rPr>
-        <w:t>fastTrackMethodToggle</w:t>
-      </w:r>
-      <w:proofErr w:type="spellEnd"/>
-      <w:r>
-        <w:rPr>
-          <w:rFonts w:ascii="Arial" w:hAnsi="Arial" w:cs="Arial"/>
-          <w:lang w:val="en-US"/>
-        </w:rPr>
-        <w:t>=true}&gt;&gt;</w:t>
+      <w:r>
+        <w:rPr>
+          <w:rFonts w:ascii="Arial" w:hAnsi="Arial" w:cs="Arial"/>
+          <w:lang w:val="en-US"/>
+        </w:rPr>
+        <w:t>fastTrackMethodToggle=true}&gt;&gt;</w:t>
       </w:r>
     </w:p>
     <w:p>
@@ -4681,7 +3880,6 @@
         </w:rPr>
         <w:t>&lt;&lt;cs_{</w:t>
       </w:r>
-      <w:proofErr w:type="spellStart"/>
       <w:r>
         <w:rPr>
           <w:rFonts w:ascii="Arial" w:hAnsi="Arial" w:cs="Arial"/>
@@ -4694,17 +3892,8 @@
           <w:rFonts w:ascii="Arial" w:hAnsi="Arial" w:cs="Arial"/>
           <w:lang w:val="en-US"/>
         </w:rPr>
-        <w:t>Method</w:t>
-      </w:r>
-      <w:proofErr w:type="spellEnd"/>
-      <w:r>
-        <w:rPr>
-          <w:rFonts w:ascii="Arial" w:hAnsi="Arial" w:cs="Arial"/>
-          <w:lang w:val="en-US"/>
-        </w:rPr>
-        <w:t>=’</w:t>
-      </w:r>
-      <w:proofErr w:type="spellStart"/>
+        <w:t>Method=’</w:t>
+      </w:r>
       <w:r>
         <w:rPr>
           <w:rFonts w:ascii="Arial" w:hAnsi="Arial" w:cs="Arial"/>
@@ -4717,15 +3906,7 @@
           <w:rFonts w:ascii="Arial" w:hAnsi="Arial" w:cs="Arial"/>
           <w:lang w:val="en-US"/>
         </w:rPr>
-        <w:t>MethodInPerson</w:t>
-      </w:r>
-      <w:proofErr w:type="spellEnd"/>
-      <w:r>
-        <w:rPr>
-          <w:rFonts w:ascii="Arial" w:hAnsi="Arial" w:cs="Arial"/>
-          <w:lang w:val="en-US"/>
-        </w:rPr>
-        <w:t>’}&gt;&gt;</w:t>
+        <w:t>MethodInPerson’}&gt;&gt;</w:t>
       </w:r>
     </w:p>
     <w:p>
@@ -4774,71 +3955,7 @@
           <w:rFonts w:ascii="Arial" w:eastAsia="Times New Roman" w:hAnsi="Arial" w:cs="Arial"/>
           <w:lang w:eastAsia="en-GB"/>
         </w:rPr>
-        <w:t>&lt;&lt;cs_{</w:t>
-      </w:r>
-      <w:proofErr w:type="spellStart"/>
-      <w:r>
-        <w:rPr>
-          <w:rFonts w:ascii="Arial" w:eastAsia="Times New Roman" w:hAnsi="Arial" w:cs="Arial"/>
-          <w:lang w:eastAsia="en-GB"/>
-        </w:rPr>
-        <w:t>hearingLocation.site_name</w:t>
-      </w:r>
-      <w:proofErr w:type="spellEnd"/>
-      <w:r>
-        <w:rPr>
-          <w:rFonts w:ascii="Arial" w:eastAsia="Times New Roman" w:hAnsi="Arial" w:cs="Arial"/>
-          <w:lang w:eastAsia="en-GB"/>
-        </w:rPr>
-        <w:t>!=null}&gt;&gt;at &lt;&lt;</w:t>
-      </w:r>
-      <w:proofErr w:type="spellStart"/>
-      <w:r>
-        <w:rPr>
-          <w:rFonts w:ascii="Arial" w:eastAsia="Times New Roman" w:hAnsi="Arial" w:cs="Arial"/>
-          <w:lang w:eastAsia="en-GB"/>
-        </w:rPr>
-        <w:t>hearingLocation.site_name</w:t>
-      </w:r>
-      <w:proofErr w:type="spellEnd"/>
-      <w:r>
-        <w:rPr>
-          <w:rFonts w:ascii="Arial" w:eastAsia="Times New Roman" w:hAnsi="Arial" w:cs="Arial"/>
-          <w:lang w:eastAsia="en-GB"/>
-        </w:rPr>
-        <w:t>&gt;&gt;, &lt;&lt;</w:t>
-      </w:r>
-      <w:proofErr w:type="spellStart"/>
-      <w:r>
-        <w:rPr>
-          <w:rFonts w:ascii="Arial" w:eastAsia="Times New Roman" w:hAnsi="Arial" w:cs="Arial"/>
-          <w:lang w:eastAsia="en-GB"/>
-        </w:rPr>
-        <w:t>hearingLocation.court_address</w:t>
-      </w:r>
-      <w:proofErr w:type="spellEnd"/>
-      <w:r>
-        <w:rPr>
-          <w:rFonts w:ascii="Arial" w:eastAsia="Times New Roman" w:hAnsi="Arial" w:cs="Arial"/>
-          <w:lang w:eastAsia="en-GB"/>
-        </w:rPr>
-        <w:t>&gt;&gt; &lt;&lt;</w:t>
-      </w:r>
-      <w:proofErr w:type="spellStart"/>
-      <w:r>
-        <w:rPr>
-          <w:rFonts w:ascii="Arial" w:eastAsia="Times New Roman" w:hAnsi="Arial" w:cs="Arial"/>
-          <w:lang w:eastAsia="en-GB"/>
-        </w:rPr>
-        <w:t>hearingLocation.postcode</w:t>
-      </w:r>
-      <w:proofErr w:type="spellEnd"/>
-      <w:r>
-        <w:rPr>
-          <w:rFonts w:ascii="Arial" w:eastAsia="Times New Roman" w:hAnsi="Arial" w:cs="Arial"/>
-          <w:lang w:eastAsia="en-GB"/>
-        </w:rPr>
-        <w:t>&gt;&gt;, &lt;&lt;es_&gt;&gt;</w:t>
+        <w:t>&lt;&lt;cs_{hearingLocation.site_name!=null}&gt;&gt;at &lt;&lt;hearingLocation.site_name&gt;&gt;, &lt;&lt;hearingLocation.court_address&gt;&gt; &lt;&lt;hearingLocation.postcode&gt;&gt;, &lt;&lt;es_&gt;&gt;</w:t>
       </w:r>
       <w:r>
         <w:rPr>
@@ -4890,7 +4007,6 @@
         </w:rPr>
         <w:t>&lt;&lt;cs_{</w:t>
       </w:r>
-      <w:proofErr w:type="spellStart"/>
       <w:r>
         <w:rPr>
           <w:rFonts w:ascii="Arial" w:hAnsi="Arial" w:cs="Arial"/>
@@ -4903,17 +4019,8 @@
           <w:rFonts w:ascii="Arial" w:hAnsi="Arial" w:cs="Arial"/>
           <w:lang w:val="en-US"/>
         </w:rPr>
-        <w:t>Method</w:t>
-      </w:r>
-      <w:proofErr w:type="spellEnd"/>
-      <w:r>
-        <w:rPr>
-          <w:rFonts w:ascii="Arial" w:hAnsi="Arial" w:cs="Arial"/>
-          <w:lang w:val="en-US"/>
-        </w:rPr>
-        <w:t>=’</w:t>
-      </w:r>
-      <w:proofErr w:type="spellStart"/>
+        <w:t>Method=’</w:t>
+      </w:r>
       <w:r>
         <w:rPr>
           <w:rFonts w:ascii="Arial" w:hAnsi="Arial" w:cs="Arial"/>
@@ -4926,15 +4033,7 @@
           <w:rFonts w:ascii="Arial" w:hAnsi="Arial" w:cs="Arial"/>
           <w:lang w:val="en-US"/>
         </w:rPr>
-        <w:t>MethodTelephoneHearing</w:t>
-      </w:r>
-      <w:proofErr w:type="spellEnd"/>
-      <w:r>
-        <w:rPr>
-          <w:rFonts w:ascii="Arial" w:hAnsi="Arial" w:cs="Arial"/>
-          <w:lang w:val="en-US"/>
-        </w:rPr>
-        <w:t>’}&gt;&gt;</w:t>
+        <w:t>MethodTelephoneHearing’}&gt;&gt;</w:t>
       </w:r>
     </w:p>
     <w:p>
@@ -4965,71 +4064,7 @@
           <w:rFonts w:ascii="Arial" w:eastAsia="Times New Roman" w:hAnsi="Arial" w:cs="Arial"/>
           <w:lang w:eastAsia="en-GB"/>
         </w:rPr>
-        <w:t>&lt;&lt;cs_{</w:t>
-      </w:r>
-      <w:proofErr w:type="spellStart"/>
-      <w:r>
-        <w:rPr>
-          <w:rFonts w:ascii="Arial" w:eastAsia="Times New Roman" w:hAnsi="Arial" w:cs="Arial"/>
-          <w:lang w:eastAsia="en-GB"/>
-        </w:rPr>
-        <w:t>hearingLocation.site_name</w:t>
-      </w:r>
-      <w:proofErr w:type="spellEnd"/>
-      <w:r>
-        <w:rPr>
-          <w:rFonts w:ascii="Arial" w:eastAsia="Times New Roman" w:hAnsi="Arial" w:cs="Arial"/>
-          <w:lang w:eastAsia="en-GB"/>
-        </w:rPr>
-        <w:t>!=null}&gt;&gt;will take place at &lt;&lt;</w:t>
-      </w:r>
-      <w:proofErr w:type="spellStart"/>
-      <w:r>
-        <w:rPr>
-          <w:rFonts w:ascii="Arial" w:eastAsia="Times New Roman" w:hAnsi="Arial" w:cs="Arial"/>
-          <w:lang w:eastAsia="en-GB"/>
-        </w:rPr>
-        <w:t>hearingLocation.site_name</w:t>
-      </w:r>
-      <w:proofErr w:type="spellEnd"/>
-      <w:r>
-        <w:rPr>
-          <w:rFonts w:ascii="Arial" w:eastAsia="Times New Roman" w:hAnsi="Arial" w:cs="Arial"/>
-          <w:lang w:eastAsia="en-GB"/>
-        </w:rPr>
-        <w:t>&gt;&gt;, &lt;&lt;</w:t>
-      </w:r>
-      <w:proofErr w:type="spellStart"/>
-      <w:r>
-        <w:rPr>
-          <w:rFonts w:ascii="Arial" w:eastAsia="Times New Roman" w:hAnsi="Arial" w:cs="Arial"/>
-          <w:lang w:eastAsia="en-GB"/>
-        </w:rPr>
-        <w:t>hearingLocation.court_address</w:t>
-      </w:r>
-      <w:proofErr w:type="spellEnd"/>
-      <w:r>
-        <w:rPr>
-          <w:rFonts w:ascii="Arial" w:eastAsia="Times New Roman" w:hAnsi="Arial" w:cs="Arial"/>
-          <w:lang w:eastAsia="en-GB"/>
-        </w:rPr>
-        <w:t>&gt;&gt; &lt;&lt;</w:t>
-      </w:r>
-      <w:proofErr w:type="spellStart"/>
-      <w:r>
-        <w:rPr>
-          <w:rFonts w:ascii="Arial" w:eastAsia="Times New Roman" w:hAnsi="Arial" w:cs="Arial"/>
-          <w:lang w:eastAsia="en-GB"/>
-        </w:rPr>
-        <w:t>hearingLocation.postcode</w:t>
-      </w:r>
-      <w:proofErr w:type="spellEnd"/>
-      <w:r>
-        <w:rPr>
-          <w:rFonts w:ascii="Arial" w:eastAsia="Times New Roman" w:hAnsi="Arial" w:cs="Arial"/>
-          <w:lang w:eastAsia="en-GB"/>
-        </w:rPr>
-        <w:t>&gt;&gt;, and &lt;&lt;es_&gt;&gt;</w:t>
+        <w:t>&lt;&lt;cs_{hearingLocation.site_name!=null}&gt;&gt;will take place at &lt;&lt;hearingLocation.site_name&gt;&gt;, &lt;&lt;hearingLocation.court_address&gt;&gt; &lt;&lt;hearingLocation.postcode&gt;&gt;, and &lt;&lt;es_&gt;&gt;</w:t>
       </w:r>
       <w:r>
         <w:rPr>
@@ -5099,7 +4134,6 @@
         </w:rPr>
         <w:t>&lt;&lt;cs_{</w:t>
       </w:r>
-      <w:proofErr w:type="spellStart"/>
       <w:r>
         <w:rPr>
           <w:rFonts w:ascii="Arial" w:hAnsi="Arial" w:cs="Arial"/>
@@ -5112,17 +4146,8 @@
           <w:rFonts w:ascii="Arial" w:hAnsi="Arial" w:cs="Arial"/>
           <w:lang w:val="en-US"/>
         </w:rPr>
-        <w:t>Method</w:t>
-      </w:r>
-      <w:proofErr w:type="spellEnd"/>
-      <w:r>
-        <w:rPr>
-          <w:rFonts w:ascii="Arial" w:hAnsi="Arial" w:cs="Arial"/>
-          <w:lang w:val="en-US"/>
-        </w:rPr>
-        <w:t>=’</w:t>
-      </w:r>
-      <w:proofErr w:type="spellStart"/>
+        <w:t>Method=’</w:t>
+      </w:r>
       <w:r>
         <w:rPr>
           <w:rFonts w:ascii="Arial" w:hAnsi="Arial" w:cs="Arial"/>
@@ -5135,15 +4160,7 @@
           <w:rFonts w:ascii="Arial" w:hAnsi="Arial" w:cs="Arial"/>
           <w:lang w:val="en-US"/>
         </w:rPr>
-        <w:t>MethodVideoConferenceHearing</w:t>
-      </w:r>
-      <w:proofErr w:type="spellEnd"/>
-      <w:r>
-        <w:rPr>
-          <w:rFonts w:ascii="Arial" w:hAnsi="Arial" w:cs="Arial"/>
-          <w:lang w:val="en-US"/>
-        </w:rPr>
-        <w:t>’}&gt;&gt;</w:t>
+        <w:t>MethodVideoConferenceHearing’}&gt;&gt;</w:t>
       </w:r>
     </w:p>
     <w:p>
@@ -5174,71 +4191,7 @@
           <w:rFonts w:ascii="Arial" w:eastAsia="Times New Roman" w:hAnsi="Arial" w:cs="Arial"/>
           <w:lang w:eastAsia="en-GB"/>
         </w:rPr>
-        <w:t>&lt;&lt;cs_{</w:t>
-      </w:r>
-      <w:proofErr w:type="spellStart"/>
-      <w:r>
-        <w:rPr>
-          <w:rFonts w:ascii="Arial" w:eastAsia="Times New Roman" w:hAnsi="Arial" w:cs="Arial"/>
-          <w:lang w:eastAsia="en-GB"/>
-        </w:rPr>
-        <w:t>hearingLocation.site_name</w:t>
-      </w:r>
-      <w:proofErr w:type="spellEnd"/>
-      <w:r>
-        <w:rPr>
-          <w:rFonts w:ascii="Arial" w:eastAsia="Times New Roman" w:hAnsi="Arial" w:cs="Arial"/>
-          <w:lang w:eastAsia="en-GB"/>
-        </w:rPr>
-        <w:t>!=null}&gt;&gt;will take place at &lt;&lt;</w:t>
-      </w:r>
-      <w:proofErr w:type="spellStart"/>
-      <w:r>
-        <w:rPr>
-          <w:rFonts w:ascii="Arial" w:eastAsia="Times New Roman" w:hAnsi="Arial" w:cs="Arial"/>
-          <w:lang w:eastAsia="en-GB"/>
-        </w:rPr>
-        <w:t>hearingLocation.site_name</w:t>
-      </w:r>
-      <w:proofErr w:type="spellEnd"/>
-      <w:r>
-        <w:rPr>
-          <w:rFonts w:ascii="Arial" w:eastAsia="Times New Roman" w:hAnsi="Arial" w:cs="Arial"/>
-          <w:lang w:eastAsia="en-GB"/>
-        </w:rPr>
-        <w:t>&gt;&gt;, &lt;&lt;</w:t>
-      </w:r>
-      <w:proofErr w:type="spellStart"/>
-      <w:r>
-        <w:rPr>
-          <w:rFonts w:ascii="Arial" w:eastAsia="Times New Roman" w:hAnsi="Arial" w:cs="Arial"/>
-          <w:lang w:eastAsia="en-GB"/>
-        </w:rPr>
-        <w:t>hearingLocation.court_address</w:t>
-      </w:r>
-      <w:proofErr w:type="spellEnd"/>
-      <w:r>
-        <w:rPr>
-          <w:rFonts w:ascii="Arial" w:eastAsia="Times New Roman" w:hAnsi="Arial" w:cs="Arial"/>
-          <w:lang w:eastAsia="en-GB"/>
-        </w:rPr>
-        <w:t>&gt;&gt; &lt;&lt;</w:t>
-      </w:r>
-      <w:proofErr w:type="spellStart"/>
-      <w:r>
-        <w:rPr>
-          <w:rFonts w:ascii="Arial" w:eastAsia="Times New Roman" w:hAnsi="Arial" w:cs="Arial"/>
-          <w:lang w:eastAsia="en-GB"/>
-        </w:rPr>
-        <w:t>hearingLocation.postcode</w:t>
-      </w:r>
-      <w:proofErr w:type="spellEnd"/>
-      <w:r>
-        <w:rPr>
-          <w:rFonts w:ascii="Arial" w:eastAsia="Times New Roman" w:hAnsi="Arial" w:cs="Arial"/>
-          <w:lang w:eastAsia="en-GB"/>
-        </w:rPr>
-        <w:t>&gt;&gt;, and &lt;&lt;es_&gt;&gt;</w:t>
+        <w:t>&lt;&lt;cs_{hearingLocation.site_name!=null}&gt;&gt;will take place at &lt;&lt;hearingLocation.site_name&gt;&gt;, &lt;&lt;hearingLocation.court_address&gt;&gt; &lt;&lt;hearingLocation.postcode&gt;&gt;, and &lt;&lt;es_&gt;&gt;</w:t>
       </w:r>
       <w:r>
         <w:rPr>
@@ -5320,21 +4273,12 @@
         </w:rPr>
         <w:t>&lt;&lt;cs_{</w:t>
       </w:r>
-      <w:proofErr w:type="spellStart"/>
-      <w:r>
-        <w:rPr>
-          <w:rFonts w:ascii="Arial" w:hAnsi="Arial" w:cs="Arial"/>
-          <w:lang w:val="en-US"/>
-        </w:rPr>
-        <w:t>hasBuildingDispute</w:t>
-      </w:r>
-      <w:proofErr w:type="spellEnd"/>
-      <w:r>
-        <w:rPr>
-          <w:rFonts w:ascii="Arial" w:hAnsi="Arial" w:cs="Arial"/>
-          <w:lang w:val="en-US"/>
-        </w:rPr>
-        <w:t>=true}&gt;&gt;</w:t>
+      <w:r>
+        <w:rPr>
+          <w:rFonts w:ascii="Arial" w:hAnsi="Arial" w:cs="Arial"/>
+          <w:lang w:val="en-US"/>
+        </w:rPr>
+        <w:t>hasBuildingDispute=true}&gt;&gt;</w:t>
       </w:r>
     </w:p>
     <w:p>
@@ -5490,83 +4434,35 @@
           <w:rFonts w:ascii="Arial" w:eastAsia="Arial" w:hAnsi="Arial" w:cs="Arial"/>
           <w:bCs/>
         </w:rPr>
-        <w:t>{</w:t>
-      </w:r>
-      <w:proofErr w:type="spellStart"/>
+        <w:t>{dateFormat(</w:t>
+      </w:r>
+      <w:r>
+        <w:rPr>
+          <w:rFonts w:ascii="Arial" w:hAnsi="Arial" w:cs="Arial"/>
+          <w:lang w:val="en-US"/>
+        </w:rPr>
+        <w:t>fastTrackBuildingDispute</w:t>
+      </w:r>
+      <w:r>
+        <w:rPr>
+          <w:rFonts w:ascii="Arial" w:hAnsi="Arial" w:cs="Arial"/>
+          <w:lang w:val="en-US"/>
+        </w:rPr>
+        <w:t>.</w:t>
+      </w:r>
+      <w:r>
+        <w:rPr>
+          <w:rFonts w:ascii="Arial" w:hAnsi="Arial" w:cs="Arial"/>
+          <w:lang w:val="en-US"/>
+        </w:rPr>
+        <w:t>date1</w:t>
+      </w:r>
       <w:r>
         <w:rPr>
           <w:rFonts w:ascii="Arial" w:eastAsia="Arial" w:hAnsi="Arial" w:cs="Arial"/>
           <w:bCs/>
         </w:rPr>
-        <w:t>dateFormat</w:t>
-      </w:r>
-      <w:proofErr w:type="spellEnd"/>
-      <w:r>
-        <w:rPr>
-          <w:rFonts w:ascii="Arial" w:eastAsia="Arial" w:hAnsi="Arial" w:cs="Arial"/>
-          <w:bCs/>
-        </w:rPr>
-        <w:t>(</w:t>
-      </w:r>
-      <w:r>
-        <w:rPr>
-          <w:rFonts w:ascii="Arial" w:hAnsi="Arial" w:cs="Arial"/>
-          <w:lang w:val="en-US"/>
-        </w:rPr>
-        <w:t>fastTrackBuildingDispute</w:t>
-      </w:r>
-      <w:r>
-        <w:rPr>
-          <w:rFonts w:ascii="Arial" w:hAnsi="Arial" w:cs="Arial"/>
-          <w:lang w:val="en-US"/>
-        </w:rPr>
-        <w:t>.</w:t>
-      </w:r>
-      <w:r>
-        <w:rPr>
-          <w:rFonts w:ascii="Arial" w:hAnsi="Arial" w:cs="Arial"/>
-          <w:lang w:val="en-US"/>
-        </w:rPr>
-        <w:t>date1</w:t>
-      </w:r>
-      <w:r>
-        <w:rPr>
-          <w:rFonts w:ascii="Arial" w:eastAsia="Arial" w:hAnsi="Arial" w:cs="Arial"/>
-          <w:bCs/>
-        </w:rPr>
-        <w:t xml:space="preserve">, ‘dd MMMM </w:t>
-      </w:r>
-      <w:proofErr w:type="spellStart"/>
-      <w:r>
-        <w:rPr>
-          <w:rFonts w:ascii="Arial" w:eastAsia="Arial" w:hAnsi="Arial" w:cs="Arial"/>
-          <w:bCs/>
-        </w:rPr>
-        <w:t>yyyy</w:t>
-      </w:r>
-      <w:proofErr w:type="spellEnd"/>
-      <w:r>
-        <w:rPr>
-          <w:rFonts w:ascii="Arial" w:eastAsia="Arial" w:hAnsi="Arial" w:cs="Arial"/>
-          <w:bCs/>
-        </w:rPr>
-        <w:t>’, ‘</w:t>
-      </w:r>
-      <w:proofErr w:type="spellStart"/>
-      <w:r>
-        <w:rPr>
-          <w:rFonts w:ascii="Arial" w:eastAsia="Arial" w:hAnsi="Arial" w:cs="Arial"/>
-          <w:bCs/>
-        </w:rPr>
-        <w:t>yyyy</w:t>
-      </w:r>
-      <w:proofErr w:type="spellEnd"/>
-      <w:r>
-        <w:rPr>
-          <w:rFonts w:ascii="Arial" w:eastAsia="Arial" w:hAnsi="Arial" w:cs="Arial"/>
-          <w:bCs/>
-        </w:rPr>
-        <w:t>-MM-dd’</w:t>
+        <w:t>, ‘dd MMMM yyyy’, ‘yyyy-MM-dd’</w:t>
       </w:r>
       <w:r>
         <w:rPr>
@@ -5653,235 +4549,138 @@
           <w:rFonts w:ascii="Arial" w:eastAsia="Arial" w:hAnsi="Arial" w:cs="Arial"/>
           <w:bCs/>
         </w:rPr>
-        <w:t>{</w:t>
-      </w:r>
-      <w:proofErr w:type="spellStart"/>
+        <w:t>{dateFormat(</w:t>
+      </w:r>
+      <w:r>
+        <w:rPr>
+          <w:rFonts w:ascii="Arial" w:hAnsi="Arial" w:cs="Arial"/>
+          <w:lang w:val="en-US"/>
+        </w:rPr>
+        <w:t>fastTrackBuildingDispute</w:t>
+      </w:r>
+      <w:r>
+        <w:rPr>
+          <w:rFonts w:ascii="Arial" w:hAnsi="Arial" w:cs="Arial"/>
+          <w:lang w:val="en-US"/>
+        </w:rPr>
+        <w:t>.</w:t>
+      </w:r>
+      <w:r>
+        <w:rPr>
+          <w:rFonts w:ascii="Arial" w:hAnsi="Arial" w:cs="Arial"/>
+          <w:lang w:val="en-US"/>
+        </w:rPr>
+        <w:t>date</w:t>
+      </w:r>
+      <w:r>
+        <w:rPr>
+          <w:rFonts w:ascii="Arial" w:hAnsi="Arial" w:cs="Arial"/>
+          <w:lang w:val="en-US"/>
+        </w:rPr>
+        <w:t>2</w:t>
+      </w:r>
       <w:r>
         <w:rPr>
           <w:rFonts w:ascii="Arial" w:eastAsia="Arial" w:hAnsi="Arial" w:cs="Arial"/>
           <w:bCs/>
         </w:rPr>
-        <w:t>dateFormat</w:t>
-      </w:r>
-      <w:proofErr w:type="spellEnd"/>
+        <w:t>, ‘dd MMMM yyyy’, ‘yyyy-MM-dd’</w:t>
+      </w:r>
       <w:r>
         <w:rPr>
           <w:rFonts w:ascii="Arial" w:eastAsia="Arial" w:hAnsi="Arial" w:cs="Arial"/>
           <w:bCs/>
         </w:rPr>
-        <w:t>(</w:t>
-      </w:r>
-      <w:r>
-        <w:rPr>
-          <w:rFonts w:ascii="Arial" w:hAnsi="Arial" w:cs="Arial"/>
-          <w:lang w:val="en-US"/>
-        </w:rPr>
-        <w:t>fastTrackBuildingDispute</w:t>
-      </w:r>
-      <w:r>
-        <w:rPr>
-          <w:rFonts w:ascii="Arial" w:hAnsi="Arial" w:cs="Arial"/>
-          <w:lang w:val="en-US"/>
+        <w:t>)</w:t>
+      </w:r>
+      <w:r>
+        <w:rPr>
+          <w:rFonts w:ascii="Arial" w:eastAsia="Arial" w:hAnsi="Arial" w:cs="Arial"/>
+          <w:bCs/>
+        </w:rPr>
+        <w:t>}</w:t>
+      </w:r>
+      <w:r>
+        <w:rPr>
+          <w:rFonts w:ascii="Arial" w:hAnsi="Arial" w:cs="Arial"/>
+          <w:b/>
+          <w:bCs/>
+        </w:rPr>
+        <w:t>&gt;&gt;</w:t>
+      </w:r>
+      <w:r>
+        <w:rPr>
+          <w:rFonts w:ascii="Arial" w:hAnsi="Arial" w:cs="Arial"/>
         </w:rPr>
         <w:t>.</w:t>
       </w:r>
-      <w:r>
-        <w:rPr>
-          <w:rFonts w:ascii="Arial" w:hAnsi="Arial" w:cs="Arial"/>
-          <w:lang w:val="en-US"/>
-        </w:rPr>
-        <w:t>date</w:t>
-      </w:r>
-      <w:r>
-        <w:rPr>
-          <w:rFonts w:ascii="Arial" w:hAnsi="Arial" w:cs="Arial"/>
-          <w:lang w:val="en-US"/>
-        </w:rPr>
-        <w:t>2</w:t>
-      </w:r>
-      <w:r>
-        <w:rPr>
-          <w:rFonts w:ascii="Arial" w:eastAsia="Arial" w:hAnsi="Arial" w:cs="Arial"/>
-          <w:bCs/>
-        </w:rPr>
-        <w:t xml:space="preserve">, ‘dd MMMM </w:t>
-      </w:r>
-      <w:proofErr w:type="spellStart"/>
-      <w:r>
-        <w:rPr>
-          <w:rFonts w:ascii="Arial" w:eastAsia="Arial" w:hAnsi="Arial" w:cs="Arial"/>
-          <w:bCs/>
-        </w:rPr>
-        <w:t>yyyy</w:t>
-      </w:r>
-      <w:proofErr w:type="spellEnd"/>
-      <w:r>
-        <w:rPr>
-          <w:rFonts w:ascii="Arial" w:eastAsia="Arial" w:hAnsi="Arial" w:cs="Arial"/>
-          <w:bCs/>
-        </w:rPr>
-        <w:t>’, ‘</w:t>
-      </w:r>
-      <w:proofErr w:type="spellStart"/>
-      <w:r>
-        <w:rPr>
-          <w:rFonts w:ascii="Arial" w:eastAsia="Arial" w:hAnsi="Arial" w:cs="Arial"/>
-          <w:bCs/>
-        </w:rPr>
-        <w:t>yyyy</w:t>
-      </w:r>
-      <w:proofErr w:type="spellEnd"/>
-      <w:r>
-        <w:rPr>
-          <w:rFonts w:ascii="Arial" w:eastAsia="Arial" w:hAnsi="Arial" w:cs="Arial"/>
-          <w:bCs/>
-        </w:rPr>
-        <w:t>-MM-dd’</w:t>
-      </w:r>
-      <w:r>
-        <w:rPr>
-          <w:rFonts w:ascii="Arial" w:eastAsia="Arial" w:hAnsi="Arial" w:cs="Arial"/>
-          <w:bCs/>
-        </w:rPr>
-        <w:t>)</w:t>
-      </w:r>
-      <w:r>
-        <w:rPr>
-          <w:rFonts w:ascii="Arial" w:eastAsia="Arial" w:hAnsi="Arial" w:cs="Arial"/>
-          <w:bCs/>
-        </w:rPr>
-        <w:t>}</w:t>
-      </w:r>
-      <w:r>
+    </w:p>
+    <w:p>
+      <w:pPr>
+        <w:rPr>
+          <w:rFonts w:ascii="Arial" w:hAnsi="Arial" w:cs="Arial"/>
+          <w:bCs/>
+          <w:lang w:val="es-ES"/>
+        </w:rPr>
+      </w:pPr>
+      <w:r>
+        <w:rPr>
+          <w:rFonts w:ascii="Arial" w:hAnsi="Arial" w:cs="Arial"/>
+          <w:bCs/>
+          <w:lang w:val="es-ES"/>
+        </w:rPr>
+        <w:t>&lt;&lt;es_&gt;&gt;</w:t>
+      </w:r>
+    </w:p>
+    <w:p>
+      <w:pPr>
+        <w:rPr>
+          <w:rFonts w:ascii="Arial" w:hAnsi="Arial" w:cs="Arial"/>
+          <w:bCs/>
+          <w:lang w:val="es-ES"/>
+        </w:rPr>
+      </w:pPr>
+      <w:r>
+        <w:rPr>
+          <w:rFonts w:ascii="Arial" w:hAnsi="Arial" w:cs="Arial"/>
+          <w:bCs/>
+          <w:lang w:val="es-ES"/>
+        </w:rPr>
+        <w:t>&lt;&lt;cs_{</w:t>
+      </w:r>
+      <w:r>
+        <w:rPr>
+          <w:rFonts w:ascii="Arial" w:hAnsi="Arial" w:cs="Arial"/>
+          <w:lang w:val="es-ES"/>
+        </w:rPr>
+        <w:t>hasClinicalNegligence=true</w:t>
+      </w:r>
+      <w:r>
+        <w:rPr>
+          <w:rFonts w:ascii="Arial" w:hAnsi="Arial" w:cs="Arial"/>
+          <w:lang w:val="es-ES"/>
+        </w:rPr>
+        <w:t>}&gt;&gt;</w:t>
+      </w:r>
+    </w:p>
+    <w:p>
+      <w:pPr>
         <w:rPr>
           <w:rFonts w:ascii="Arial" w:hAnsi="Arial" w:cs="Arial"/>
           <w:b/>
           <w:bCs/>
-        </w:rPr>
-        <w:t>&gt;&gt;</w:t>
-      </w:r>
-      <w:r>
-        <w:rPr>
-          <w:rFonts w:ascii="Arial" w:hAnsi="Arial" w:cs="Arial"/>
-        </w:rPr>
-        <w:t>.</w:t>
-      </w:r>
-    </w:p>
-    <w:p>
-      <w:pPr>
-        <w:rPr>
-          <w:rFonts w:ascii="Arial" w:hAnsi="Arial" w:cs="Arial"/>
-          <w:bCs/>
           <w:lang w:val="es-ES"/>
         </w:rPr>
       </w:pPr>
       <w:r>
         <w:rPr>
           <w:rFonts w:ascii="Arial" w:hAnsi="Arial" w:cs="Arial"/>
+          <w:b/>
           <w:bCs/>
           <w:lang w:val="es-ES"/>
         </w:rPr>
-        <w:t>&lt;&lt;es_&gt;&gt;</w:t>
-      </w:r>
-    </w:p>
-    <w:p>
-      <w:pPr>
-        <w:rPr>
-          <w:rFonts w:ascii="Arial" w:hAnsi="Arial" w:cs="Arial"/>
-          <w:bCs/>
-          <w:lang w:val="es-ES"/>
-        </w:rPr>
-      </w:pPr>
-      <w:r>
-        <w:rPr>
-          <w:rFonts w:ascii="Arial" w:hAnsi="Arial" w:cs="Arial"/>
-          <w:bCs/>
-          <w:lang w:val="es-ES"/>
-        </w:rPr>
-        <w:t>&lt;&lt;</w:t>
-      </w:r>
-      <w:proofErr w:type="spellStart"/>
-      <w:r>
-        <w:rPr>
-          <w:rFonts w:ascii="Arial" w:hAnsi="Arial" w:cs="Arial"/>
-          <w:bCs/>
-          <w:lang w:val="es-ES"/>
-        </w:rPr>
-        <w:t>cs</w:t>
-      </w:r>
-      <w:proofErr w:type="spellEnd"/>
-      <w:r>
-        <w:rPr>
-          <w:rFonts w:ascii="Arial" w:hAnsi="Arial" w:cs="Arial"/>
-          <w:bCs/>
-          <w:lang w:val="es-ES"/>
-        </w:rPr>
-        <w:t>_{</w:t>
-      </w:r>
-      <w:proofErr w:type="spellStart"/>
-      <w:r>
-        <w:rPr>
-          <w:rFonts w:ascii="Arial" w:hAnsi="Arial" w:cs="Arial"/>
-          <w:lang w:val="es-ES"/>
-        </w:rPr>
-        <w:t>hasClinicalNegligence</w:t>
-      </w:r>
-      <w:proofErr w:type="spellEnd"/>
-      <w:r>
-        <w:rPr>
-          <w:rFonts w:ascii="Arial" w:hAnsi="Arial" w:cs="Arial"/>
-          <w:lang w:val="es-ES"/>
-        </w:rPr>
-        <w:t>=true</w:t>
-      </w:r>
-      <w:r>
-        <w:rPr>
-          <w:rFonts w:ascii="Arial" w:hAnsi="Arial" w:cs="Arial"/>
-          <w:lang w:val="es-ES"/>
-        </w:rPr>
-        <w:t>}&gt;&gt;</w:t>
-      </w:r>
-    </w:p>
-    <w:p>
-      <w:pPr>
-        <w:rPr>
-          <w:rFonts w:ascii="Arial" w:hAnsi="Arial" w:cs="Arial"/>
-          <w:b/>
-          <w:bCs/>
-          <w:lang w:val="es-ES"/>
-        </w:rPr>
-      </w:pPr>
-      <w:proofErr w:type="spellStart"/>
-      <w:r>
-        <w:rPr>
-          <w:rFonts w:ascii="Arial" w:hAnsi="Arial" w:cs="Arial"/>
-          <w:b/>
-          <w:bCs/>
-          <w:lang w:val="es-ES"/>
-        </w:rPr>
-        <w:t>Clinical</w:t>
-      </w:r>
-      <w:proofErr w:type="spellEnd"/>
-      <w:r>
-        <w:rPr>
-          <w:rFonts w:ascii="Arial" w:hAnsi="Arial" w:cs="Arial"/>
-          <w:b/>
-          <w:bCs/>
-          <w:lang w:val="es-ES"/>
-        </w:rPr>
-        <w:t xml:space="preserve"> </w:t>
-      </w:r>
-      <w:proofErr w:type="spellStart"/>
-      <w:r>
-        <w:rPr>
-          <w:rFonts w:ascii="Arial" w:hAnsi="Arial" w:cs="Arial"/>
-          <w:b/>
-          <w:bCs/>
-          <w:lang w:val="es-ES"/>
-        </w:rPr>
-        <w:t>negligence</w:t>
-      </w:r>
-      <w:proofErr w:type="spellEnd"/>
+        <w:t>Clinical negligence</w:t>
+      </w:r>
     </w:p>
     <w:p>
       <w:pPr>
@@ -6290,78 +5089,24 @@
           <w:b/>
           <w:bCs/>
         </w:rPr>
-        <w:t>{</w:t>
-      </w:r>
-      <w:proofErr w:type="spellStart"/>
+        <w:t>{dateFormat(</w:t>
+      </w:r>
+      <w:r>
+        <w:rPr>
+          <w:rFonts w:ascii="Arial" w:hAnsi="Arial" w:cs="Arial"/>
+          <w:b/>
+          <w:bCs/>
+          <w:lang w:val="en-US"/>
+        </w:rPr>
+        <w:t>sdoR2FastTrackCreditHire.sdoR2FastTrackCreditHireDetails.date1</w:t>
+      </w:r>
       <w:r>
         <w:rPr>
           <w:rFonts w:ascii="Arial" w:eastAsia="Arial" w:hAnsi="Arial" w:cs="Arial"/>
           <w:b/>
           <w:bCs/>
         </w:rPr>
-        <w:t>dateFormat</w:t>
-      </w:r>
-      <w:proofErr w:type="spellEnd"/>
-      <w:r>
-        <w:rPr>
-          <w:rFonts w:ascii="Arial" w:eastAsia="Arial" w:hAnsi="Arial" w:cs="Arial"/>
-          <w:b/>
-          <w:bCs/>
-        </w:rPr>
-        <w:t>(</w:t>
-      </w:r>
-      <w:r>
-        <w:rPr>
-          <w:rFonts w:ascii="Arial" w:hAnsi="Arial" w:cs="Arial"/>
-          <w:b/>
-          <w:bCs/>
-          <w:lang w:val="en-US"/>
-        </w:rPr>
-        <w:t>sdoR2FastTrackCreditHire.sdoR2FastTrackCreditHireDetails.date1</w:t>
-      </w:r>
-      <w:r>
-        <w:rPr>
-          <w:rFonts w:ascii="Arial" w:eastAsia="Arial" w:hAnsi="Arial" w:cs="Arial"/>
-          <w:b/>
-          <w:bCs/>
-        </w:rPr>
-        <w:t xml:space="preserve">, ‘dd MMMM </w:t>
-      </w:r>
-      <w:proofErr w:type="spellStart"/>
-      <w:r>
-        <w:rPr>
-          <w:rFonts w:ascii="Arial" w:eastAsia="Arial" w:hAnsi="Arial" w:cs="Arial"/>
-          <w:b/>
-          <w:bCs/>
-        </w:rPr>
-        <w:t>yyyy</w:t>
-      </w:r>
-      <w:proofErr w:type="spellEnd"/>
-      <w:r>
-        <w:rPr>
-          <w:rFonts w:ascii="Arial" w:eastAsia="Arial" w:hAnsi="Arial" w:cs="Arial"/>
-          <w:b/>
-          <w:bCs/>
-        </w:rPr>
-        <w:t>’, ‘</w:t>
-      </w:r>
-      <w:proofErr w:type="spellStart"/>
-      <w:r>
-        <w:rPr>
-          <w:rFonts w:ascii="Arial" w:eastAsia="Arial" w:hAnsi="Arial" w:cs="Arial"/>
-          <w:b/>
-          <w:bCs/>
-        </w:rPr>
-        <w:t>yyyy</w:t>
-      </w:r>
-      <w:proofErr w:type="spellEnd"/>
-      <w:r>
-        <w:rPr>
-          <w:rFonts w:ascii="Arial" w:eastAsia="Arial" w:hAnsi="Arial" w:cs="Arial"/>
-          <w:b/>
-          <w:bCs/>
-        </w:rPr>
-        <w:t>-MM-dd’)}</w:t>
+        <w:t>, ‘dd MMMM yyyy’, ‘yyyy-MM-dd’)}</w:t>
       </w:r>
       <w:r>
         <w:rPr>
@@ -6477,78 +5222,24 @@
           <w:b/>
           <w:bCs/>
         </w:rPr>
-        <w:t>{</w:t>
-      </w:r>
-      <w:proofErr w:type="spellStart"/>
+        <w:t>{dateFormat(</w:t>
+      </w:r>
+      <w:r>
+        <w:rPr>
+          <w:rFonts w:ascii="Arial" w:hAnsi="Arial" w:cs="Arial"/>
+          <w:b/>
+          <w:bCs/>
+          <w:lang w:val="en-US"/>
+        </w:rPr>
+        <w:t>sdoR2FastTrackCreditHire.sdoR2FastTrackCreditHireDetails.date2</w:t>
+      </w:r>
       <w:r>
         <w:rPr>
           <w:rFonts w:ascii="Arial" w:eastAsia="Arial" w:hAnsi="Arial" w:cs="Arial"/>
           <w:b/>
           <w:bCs/>
         </w:rPr>
-        <w:t>dateFormat</w:t>
-      </w:r>
-      <w:proofErr w:type="spellEnd"/>
-      <w:r>
-        <w:rPr>
-          <w:rFonts w:ascii="Arial" w:eastAsia="Arial" w:hAnsi="Arial" w:cs="Arial"/>
-          <w:b/>
-          <w:bCs/>
-        </w:rPr>
-        <w:t>(</w:t>
-      </w:r>
-      <w:r>
-        <w:rPr>
-          <w:rFonts w:ascii="Arial" w:hAnsi="Arial" w:cs="Arial"/>
-          <w:b/>
-          <w:bCs/>
-          <w:lang w:val="en-US"/>
-        </w:rPr>
-        <w:t>sdoR2FastTrackCreditHire.sdoR2FastTrackCreditHireDetails.date2</w:t>
-      </w:r>
-      <w:r>
-        <w:rPr>
-          <w:rFonts w:ascii="Arial" w:eastAsia="Arial" w:hAnsi="Arial" w:cs="Arial"/>
-          <w:b/>
-          <w:bCs/>
-        </w:rPr>
-        <w:t xml:space="preserve">, ‘dd MMMM </w:t>
-      </w:r>
-      <w:proofErr w:type="spellStart"/>
-      <w:r>
-        <w:rPr>
-          <w:rFonts w:ascii="Arial" w:eastAsia="Arial" w:hAnsi="Arial" w:cs="Arial"/>
-          <w:b/>
-          <w:bCs/>
-        </w:rPr>
-        <w:t>yyyy</w:t>
-      </w:r>
-      <w:proofErr w:type="spellEnd"/>
-      <w:r>
-        <w:rPr>
-          <w:rFonts w:ascii="Arial" w:eastAsia="Arial" w:hAnsi="Arial" w:cs="Arial"/>
-          <w:b/>
-          <w:bCs/>
-        </w:rPr>
-        <w:t>’, ‘</w:t>
-      </w:r>
-      <w:proofErr w:type="spellStart"/>
-      <w:r>
-        <w:rPr>
-          <w:rFonts w:ascii="Arial" w:eastAsia="Arial" w:hAnsi="Arial" w:cs="Arial"/>
-          <w:b/>
-          <w:bCs/>
-        </w:rPr>
-        <w:t>yyyy</w:t>
-      </w:r>
-      <w:proofErr w:type="spellEnd"/>
-      <w:r>
-        <w:rPr>
-          <w:rFonts w:ascii="Arial" w:eastAsia="Arial" w:hAnsi="Arial" w:cs="Arial"/>
-          <w:b/>
-          <w:bCs/>
-        </w:rPr>
-        <w:t>-MM-dd’)}</w:t>
+        <w:t>, ‘dd MMMM yyyy’, ‘yyyy-MM-dd’)}</w:t>
       </w:r>
       <w:r>
         <w:rPr>
@@ -6679,198 +5370,96 @@
           <w:rFonts w:ascii="Arial" w:eastAsia="Arial" w:hAnsi="Arial" w:cs="Arial"/>
           <w:b/>
         </w:rPr>
-        <w:t>{</w:t>
-      </w:r>
-      <w:proofErr w:type="spellStart"/>
+        <w:t>{dateFormat(</w:t>
+      </w:r>
+      <w:r>
+        <w:rPr>
+          <w:rFonts w:ascii="Arial" w:hAnsi="Arial" w:cs="Arial"/>
+          <w:b/>
+          <w:lang w:val="en-US"/>
+        </w:rPr>
+        <w:t>sdoR2FastTrackCreditHire.date3</w:t>
+      </w:r>
       <w:r>
         <w:rPr>
           <w:rFonts w:ascii="Arial" w:eastAsia="Arial" w:hAnsi="Arial" w:cs="Arial"/>
           <w:b/>
         </w:rPr>
-        <w:t>dateFormat</w:t>
-      </w:r>
-      <w:proofErr w:type="spellEnd"/>
+        <w:t>, ‘dd MMMM yyyy’, ‘yyyy-MM-dd’)}</w:t>
+      </w:r>
+      <w:r>
+        <w:rPr>
+          <w:rFonts w:ascii="Arial" w:hAnsi="Arial" w:cs="Arial"/>
+          <w:b/>
+          <w:bCs/>
+        </w:rPr>
+        <w:t xml:space="preserve">&gt;&gt; </w:t>
+      </w:r>
+      <w:r>
+        <w:rPr>
+          <w:rFonts w:ascii="Arial" w:hAnsi="Arial" w:cs="Arial"/>
+        </w:rPr>
+        <w:t>&lt;&lt;</w:t>
+      </w:r>
+      <w:r>
+        <w:rPr>
+          <w:rFonts w:ascii="Arial" w:hAnsi="Arial" w:cs="Arial"/>
+          <w:lang w:val="en-US"/>
+        </w:rPr>
+        <w:t xml:space="preserve"> </w:t>
+      </w:r>
+      <w:r>
+        <w:rPr>
+          <w:rFonts w:ascii="Arial" w:hAnsi="Arial" w:cs="Arial"/>
+          <w:lang w:val="en-US"/>
+        </w:rPr>
+        <w:t>sdoR2FastTrackCreditHire</w:t>
+      </w:r>
+      <w:r>
+        <w:rPr>
+          <w:rFonts w:ascii="Arial" w:hAnsi="Arial" w:cs="Arial"/>
+          <w:lang w:val="en-US"/>
+        </w:rPr>
+        <w:t>.input7</w:t>
+      </w:r>
+      <w:r>
+        <w:rPr>
+          <w:rFonts w:ascii="Arial" w:hAnsi="Arial" w:cs="Arial"/>
+        </w:rPr>
+        <w:t xml:space="preserve">&gt;&gt; </w:t>
+      </w:r>
+      <w:r>
+        <w:rPr>
+          <w:rFonts w:ascii="Arial" w:hAnsi="Arial" w:cs="Arial"/>
+          <w:b/>
+          <w:bCs/>
+        </w:rPr>
+        <w:t>&lt;&lt;</w:t>
+      </w:r>
       <w:r>
         <w:rPr>
           <w:rFonts w:ascii="Arial" w:eastAsia="Arial" w:hAnsi="Arial" w:cs="Arial"/>
           <w:b/>
-        </w:rPr>
-        <w:t>(</w:t>
+          <w:bCs/>
+        </w:rPr>
+        <w:t>{dateFormat(</w:t>
       </w:r>
       <w:r>
         <w:rPr>
           <w:rFonts w:ascii="Arial" w:hAnsi="Arial" w:cs="Arial"/>
           <w:b/>
-          <w:lang w:val="en-US"/>
-        </w:rPr>
-        <w:t>sdoR2FastTrackCreditHire.date3</w:t>
+          <w:bCs/>
+          <w:lang w:val="en-US"/>
+        </w:rPr>
+        <w:t>sdoR2FastTrackCreditHire.date4</w:t>
       </w:r>
       <w:r>
         <w:rPr>
           <w:rFonts w:ascii="Arial" w:eastAsia="Arial" w:hAnsi="Arial" w:cs="Arial"/>
           <w:b/>
-        </w:rPr>
-        <w:t xml:space="preserve">, ‘dd MMMM </w:t>
-      </w:r>
-      <w:proofErr w:type="spellStart"/>
-      <w:r>
-        <w:rPr>
-          <w:rFonts w:ascii="Arial" w:eastAsia="Arial" w:hAnsi="Arial" w:cs="Arial"/>
-          <w:b/>
-        </w:rPr>
-        <w:t>yyyy</w:t>
-      </w:r>
-      <w:proofErr w:type="spellEnd"/>
-      <w:r>
-        <w:rPr>
-          <w:rFonts w:ascii="Arial" w:eastAsia="Arial" w:hAnsi="Arial" w:cs="Arial"/>
-          <w:b/>
-        </w:rPr>
-        <w:t>’, ‘</w:t>
-      </w:r>
-      <w:proofErr w:type="spellStart"/>
-      <w:r>
-        <w:rPr>
-          <w:rFonts w:ascii="Arial" w:eastAsia="Arial" w:hAnsi="Arial" w:cs="Arial"/>
-          <w:b/>
-        </w:rPr>
-        <w:t>yyyy</w:t>
-      </w:r>
-      <w:proofErr w:type="spellEnd"/>
-      <w:r>
-        <w:rPr>
-          <w:rFonts w:ascii="Arial" w:eastAsia="Arial" w:hAnsi="Arial" w:cs="Arial"/>
-          <w:b/>
-        </w:rPr>
-        <w:t>-MM-dd’)}</w:t>
-      </w:r>
-      <w:r>
-        <w:rPr>
-          <w:rFonts w:ascii="Arial" w:hAnsi="Arial" w:cs="Arial"/>
-          <w:b/>
-          <w:bCs/>
-        </w:rPr>
-        <w:t xml:space="preserve">&gt;&gt; </w:t>
-      </w:r>
-      <w:r>
-        <w:rPr>
-          <w:rFonts w:ascii="Arial" w:hAnsi="Arial" w:cs="Arial"/>
-        </w:rPr>
-        <w:t>&lt;&lt;</w:t>
-      </w:r>
-      <w:r>
-        <w:rPr>
-          <w:rFonts w:ascii="Arial" w:hAnsi="Arial" w:cs="Arial"/>
-          <w:lang w:val="en-US"/>
-        </w:rPr>
-        <w:t xml:space="preserve"> </w:t>
-      </w:r>
-      <w:r>
-        <w:rPr>
-          <w:rFonts w:ascii="Arial" w:hAnsi="Arial" w:cs="Arial"/>
-          <w:lang w:val="en-US"/>
-        </w:rPr>
-        <w:t>sdoR2FastTrackCreditHire</w:t>
-      </w:r>
-      <w:r>
-        <w:rPr>
-          <w:rFonts w:ascii="Arial" w:hAnsi="Arial" w:cs="Arial"/>
-          <w:lang w:val="en-US"/>
-        </w:rPr>
-        <w:t>.input7</w:t>
-      </w:r>
-      <w:r>
-        <w:rPr>
-          <w:rFonts w:ascii="Arial" w:hAnsi="Arial" w:cs="Arial"/>
-        </w:rPr>
-        <w:t xml:space="preserve">&gt;&gt; </w:t>
-      </w:r>
-      <w:r>
-        <w:rPr>
-          <w:rFonts w:ascii="Arial" w:hAnsi="Arial" w:cs="Arial"/>
-          <w:b/>
-          <w:bCs/>
-        </w:rPr>
-        <w:t>&lt;&lt;</w:t>
-      </w:r>
-      <w:r>
-        <w:rPr>
-          <w:rFonts w:ascii="Arial" w:eastAsia="Arial" w:hAnsi="Arial" w:cs="Arial"/>
-          <w:b/>
-          <w:bCs/>
-        </w:rPr>
-        <w:t>{</w:t>
-      </w:r>
-      <w:proofErr w:type="spellStart"/>
-      <w:r>
-        <w:rPr>
-          <w:rFonts w:ascii="Arial" w:eastAsia="Arial" w:hAnsi="Arial" w:cs="Arial"/>
-          <w:b/>
-          <w:bCs/>
-        </w:rPr>
-        <w:t>dateFormat</w:t>
-      </w:r>
-      <w:proofErr w:type="spellEnd"/>
-      <w:r>
-        <w:rPr>
-          <w:rFonts w:ascii="Arial" w:eastAsia="Arial" w:hAnsi="Arial" w:cs="Arial"/>
-          <w:b/>
-          <w:bCs/>
-        </w:rPr>
-        <w:t>(</w:t>
-      </w:r>
-      <w:r>
-        <w:rPr>
-          <w:rFonts w:ascii="Arial" w:hAnsi="Arial" w:cs="Arial"/>
-          <w:b/>
-          <w:bCs/>
-          <w:lang w:val="en-US"/>
-        </w:rPr>
-        <w:t>sdoR2FastTrackCreditHire.date4</w:t>
-      </w:r>
-      <w:r>
-        <w:rPr>
-          <w:rFonts w:ascii="Arial" w:eastAsia="Arial" w:hAnsi="Arial" w:cs="Arial"/>
-          <w:b/>
-          <w:bCs/>
-        </w:rPr>
-        <w:t xml:space="preserve">, ‘dd MMMM </w:t>
-      </w:r>
-      <w:proofErr w:type="spellStart"/>
-      <w:r>
-        <w:rPr>
-          <w:rFonts w:ascii="Arial" w:eastAsia="Arial" w:hAnsi="Arial" w:cs="Arial"/>
-          <w:b/>
-          <w:bCs/>
-        </w:rPr>
-        <w:t>yyyy</w:t>
-      </w:r>
-      <w:proofErr w:type="spellEnd"/>
-      <w:r>
-        <w:rPr>
-          <w:rFonts w:ascii="Arial" w:eastAsia="Arial" w:hAnsi="Arial" w:cs="Arial"/>
-          <w:b/>
-          <w:bCs/>
-        </w:rPr>
-        <w:t>’, ‘</w:t>
-      </w:r>
-      <w:proofErr w:type="spellStart"/>
-      <w:r>
-        <w:rPr>
-          <w:rFonts w:ascii="Arial" w:eastAsia="Arial" w:hAnsi="Arial" w:cs="Arial"/>
-          <w:b/>
-          <w:bCs/>
-        </w:rPr>
-        <w:t>yyyy</w:t>
-      </w:r>
-      <w:proofErr w:type="spellEnd"/>
-      <w:r>
-        <w:rPr>
-          <w:rFonts w:ascii="Arial" w:eastAsia="Arial" w:hAnsi="Arial" w:cs="Arial"/>
-          <w:b/>
-          <w:bCs/>
-        </w:rPr>
-        <w:t>-MM-dd’)}</w:t>
+          <w:bCs/>
+        </w:rPr>
+        <w:t>, ‘dd MMMM yyyy’, ‘yyyy-MM-dd’)}</w:t>
       </w:r>
       <w:r>
         <w:rPr>
@@ -6984,21 +5573,12 @@
         </w:rPr>
         <w:t>&lt;&lt;cs_{</w:t>
       </w:r>
-      <w:proofErr w:type="spellStart"/>
-      <w:r>
-        <w:rPr>
-          <w:rFonts w:ascii="Arial" w:hAnsi="Arial" w:cs="Arial"/>
-          <w:lang w:val="en-US"/>
-        </w:rPr>
-        <w:t>hasEmployersLiability</w:t>
-      </w:r>
-      <w:proofErr w:type="spellEnd"/>
-      <w:r>
-        <w:rPr>
-          <w:rFonts w:ascii="Arial" w:hAnsi="Arial" w:cs="Arial"/>
-          <w:lang w:val="en-US"/>
-        </w:rPr>
-        <w:t>=true</w:t>
+      <w:r>
+        <w:rPr>
+          <w:rFonts w:ascii="Arial" w:hAnsi="Arial" w:cs="Arial"/>
+          <w:lang w:val="en-US"/>
+        </w:rPr>
+        <w:t>hasEmployersLiability=true</w:t>
       </w:r>
       <w:r>
         <w:rPr>
@@ -7073,21 +5653,12 @@
         </w:rPr>
         <w:t>&lt;&lt;cs_{</w:t>
       </w:r>
-      <w:proofErr w:type="spellStart"/>
-      <w:r>
-        <w:rPr>
-          <w:rFonts w:ascii="Arial" w:hAnsi="Arial" w:cs="Arial"/>
-          <w:lang w:val="en-US"/>
-        </w:rPr>
-        <w:t>hasHousingDisrepair</w:t>
-      </w:r>
-      <w:proofErr w:type="spellEnd"/>
-      <w:r>
-        <w:rPr>
-          <w:rFonts w:ascii="Arial" w:hAnsi="Arial" w:cs="Arial"/>
-          <w:lang w:val="en-US"/>
-        </w:rPr>
-        <w:t>=true</w:t>
+      <w:r>
+        <w:rPr>
+          <w:rFonts w:ascii="Arial" w:hAnsi="Arial" w:cs="Arial"/>
+          <w:lang w:val="en-US"/>
+        </w:rPr>
+        <w:t>hasHousingDisrepair=true</w:t>
       </w:r>
       <w:r>
         <w:rPr>
@@ -7238,83 +5809,35 @@
           <w:rFonts w:ascii="Arial" w:eastAsia="Arial" w:hAnsi="Arial" w:cs="Arial"/>
           <w:bCs/>
         </w:rPr>
-        <w:t>{</w:t>
-      </w:r>
-      <w:proofErr w:type="spellStart"/>
+        <w:t>{dateFormat(</w:t>
+      </w:r>
+      <w:r>
+        <w:rPr>
+          <w:rFonts w:ascii="Arial" w:hAnsi="Arial" w:cs="Arial"/>
+          <w:lang w:val="en-US"/>
+        </w:rPr>
+        <w:t>fastTrackHousingDisrepair</w:t>
+      </w:r>
+      <w:r>
+        <w:rPr>
+          <w:rFonts w:ascii="Arial" w:hAnsi="Arial" w:cs="Arial"/>
+          <w:lang w:val="en-US"/>
+        </w:rPr>
+        <w:t>.</w:t>
+      </w:r>
+      <w:r>
+        <w:rPr>
+          <w:rFonts w:ascii="Arial" w:hAnsi="Arial" w:cs="Arial"/>
+          <w:lang w:val="en-US"/>
+        </w:rPr>
+        <w:t>date1</w:t>
+      </w:r>
       <w:r>
         <w:rPr>
           <w:rFonts w:ascii="Arial" w:eastAsia="Arial" w:hAnsi="Arial" w:cs="Arial"/>
           <w:bCs/>
         </w:rPr>
-        <w:t>dateFormat</w:t>
-      </w:r>
-      <w:proofErr w:type="spellEnd"/>
-      <w:r>
-        <w:rPr>
-          <w:rFonts w:ascii="Arial" w:eastAsia="Arial" w:hAnsi="Arial" w:cs="Arial"/>
-          <w:bCs/>
-        </w:rPr>
-        <w:t>(</w:t>
-      </w:r>
-      <w:r>
-        <w:rPr>
-          <w:rFonts w:ascii="Arial" w:hAnsi="Arial" w:cs="Arial"/>
-          <w:lang w:val="en-US"/>
-        </w:rPr>
-        <w:t>fastTrackHousingDisrepair</w:t>
-      </w:r>
-      <w:r>
-        <w:rPr>
-          <w:rFonts w:ascii="Arial" w:hAnsi="Arial" w:cs="Arial"/>
-          <w:lang w:val="en-US"/>
-        </w:rPr>
-        <w:t>.</w:t>
-      </w:r>
-      <w:r>
-        <w:rPr>
-          <w:rFonts w:ascii="Arial" w:hAnsi="Arial" w:cs="Arial"/>
-          <w:lang w:val="en-US"/>
-        </w:rPr>
-        <w:t>date1</w:t>
-      </w:r>
-      <w:r>
-        <w:rPr>
-          <w:rFonts w:ascii="Arial" w:eastAsia="Arial" w:hAnsi="Arial" w:cs="Arial"/>
-          <w:bCs/>
-        </w:rPr>
-        <w:t xml:space="preserve">, ‘dd MMMM </w:t>
-      </w:r>
-      <w:proofErr w:type="spellStart"/>
-      <w:r>
-        <w:rPr>
-          <w:rFonts w:ascii="Arial" w:eastAsia="Arial" w:hAnsi="Arial" w:cs="Arial"/>
-          <w:bCs/>
-        </w:rPr>
-        <w:t>yyyy</w:t>
-      </w:r>
-      <w:proofErr w:type="spellEnd"/>
-      <w:r>
-        <w:rPr>
-          <w:rFonts w:ascii="Arial" w:eastAsia="Arial" w:hAnsi="Arial" w:cs="Arial"/>
-          <w:bCs/>
-        </w:rPr>
-        <w:t>’, ‘</w:t>
-      </w:r>
-      <w:proofErr w:type="spellStart"/>
-      <w:r>
-        <w:rPr>
-          <w:rFonts w:ascii="Arial" w:eastAsia="Arial" w:hAnsi="Arial" w:cs="Arial"/>
-          <w:bCs/>
-        </w:rPr>
-        <w:t>yyyy</w:t>
-      </w:r>
-      <w:proofErr w:type="spellEnd"/>
-      <w:r>
-        <w:rPr>
-          <w:rFonts w:ascii="Arial" w:eastAsia="Arial" w:hAnsi="Arial" w:cs="Arial"/>
-          <w:bCs/>
-        </w:rPr>
-        <w:t>-MM-dd’</w:t>
+        <w:t>, ‘dd MMMM yyyy’, ‘yyyy-MM-dd’</w:t>
       </w:r>
       <w:r>
         <w:rPr>
@@ -7395,119 +5918,71 @@
           <w:rFonts w:ascii="Arial" w:eastAsia="Arial" w:hAnsi="Arial" w:cs="Arial"/>
           <w:bCs/>
         </w:rPr>
-        <w:t>{</w:t>
-      </w:r>
-      <w:proofErr w:type="spellStart"/>
+        <w:t>{dateFormat(</w:t>
+      </w:r>
+      <w:r>
+        <w:rPr>
+          <w:rFonts w:ascii="Arial" w:hAnsi="Arial" w:cs="Arial"/>
+          <w:lang w:val="en-US"/>
+        </w:rPr>
+        <w:t>fastTrackHousingDisrepair</w:t>
+      </w:r>
+      <w:r>
+        <w:rPr>
+          <w:rFonts w:ascii="Arial" w:hAnsi="Arial" w:cs="Arial"/>
+          <w:lang w:val="en-US"/>
+        </w:rPr>
+        <w:t>.</w:t>
+      </w:r>
+      <w:r>
+        <w:rPr>
+          <w:rFonts w:ascii="Arial" w:hAnsi="Arial" w:cs="Arial"/>
+          <w:lang w:val="en-US"/>
+        </w:rPr>
+        <w:t>date</w:t>
+      </w:r>
+      <w:r>
+        <w:rPr>
+          <w:rFonts w:ascii="Arial" w:hAnsi="Arial" w:cs="Arial"/>
+          <w:lang w:val="en-US"/>
+        </w:rPr>
+        <w:t>2</w:t>
+      </w:r>
       <w:r>
         <w:rPr>
           <w:rFonts w:ascii="Arial" w:eastAsia="Arial" w:hAnsi="Arial" w:cs="Arial"/>
           <w:bCs/>
         </w:rPr>
-        <w:t>dateFormat</w:t>
-      </w:r>
-      <w:proofErr w:type="spellEnd"/>
+        <w:t>, ‘dd MMMM yyyy’, ‘yyyy-MM-dd’</w:t>
+      </w:r>
       <w:r>
         <w:rPr>
           <w:rFonts w:ascii="Arial" w:eastAsia="Arial" w:hAnsi="Arial" w:cs="Arial"/>
           <w:bCs/>
         </w:rPr>
-        <w:t>(</w:t>
-      </w:r>
-      <w:r>
-        <w:rPr>
-          <w:rFonts w:ascii="Arial" w:hAnsi="Arial" w:cs="Arial"/>
-          <w:lang w:val="en-US"/>
-        </w:rPr>
-        <w:t>fastTrackHousingDisrepair</w:t>
-      </w:r>
-      <w:r>
-        <w:rPr>
-          <w:rFonts w:ascii="Arial" w:hAnsi="Arial" w:cs="Arial"/>
-          <w:lang w:val="en-US"/>
+        <w:t>)</w:t>
+      </w:r>
+      <w:r>
+        <w:rPr>
+          <w:rFonts w:ascii="Arial" w:eastAsia="Arial" w:hAnsi="Arial" w:cs="Arial"/>
+          <w:bCs/>
+        </w:rPr>
+        <w:t>}</w:t>
+      </w:r>
+      <w:r>
+        <w:rPr>
+          <w:rFonts w:ascii="Arial" w:hAnsi="Arial" w:cs="Arial"/>
+          <w:b/>
+          <w:bCs/>
+        </w:rPr>
+        <w:t>&gt;&gt;</w:t>
+      </w:r>
+      <w:r>
+        <w:rPr>
+          <w:rFonts w:ascii="Arial" w:hAnsi="Arial" w:cs="Arial"/>
         </w:rPr>
         <w:t>.</w:t>
       </w:r>
-      <w:r>
-        <w:rPr>
-          <w:rFonts w:ascii="Arial" w:hAnsi="Arial" w:cs="Arial"/>
-          <w:lang w:val="en-US"/>
-        </w:rPr>
-        <w:t>date</w:t>
-      </w:r>
-      <w:r>
-        <w:rPr>
-          <w:rFonts w:ascii="Arial" w:hAnsi="Arial" w:cs="Arial"/>
-          <w:lang w:val="en-US"/>
-        </w:rPr>
-        <w:t>2</w:t>
-      </w:r>
-      <w:r>
-        <w:rPr>
-          <w:rFonts w:ascii="Arial" w:eastAsia="Arial" w:hAnsi="Arial" w:cs="Arial"/>
-          <w:bCs/>
-        </w:rPr>
-        <w:t xml:space="preserve">, ‘dd MMMM </w:t>
-      </w:r>
-      <w:proofErr w:type="spellStart"/>
-      <w:r>
-        <w:rPr>
-          <w:rFonts w:ascii="Arial" w:eastAsia="Arial" w:hAnsi="Arial" w:cs="Arial"/>
-          <w:bCs/>
-        </w:rPr>
-        <w:t>yyyy</w:t>
-      </w:r>
-      <w:proofErr w:type="spellEnd"/>
-      <w:r>
-        <w:rPr>
-          <w:rFonts w:ascii="Arial" w:eastAsia="Arial" w:hAnsi="Arial" w:cs="Arial"/>
-          <w:bCs/>
-        </w:rPr>
-        <w:t>’, ‘</w:t>
-      </w:r>
-      <w:proofErr w:type="spellStart"/>
-      <w:r>
-        <w:rPr>
-          <w:rFonts w:ascii="Arial" w:eastAsia="Arial" w:hAnsi="Arial" w:cs="Arial"/>
-          <w:bCs/>
-        </w:rPr>
-        <w:t>yyyy</w:t>
-      </w:r>
-      <w:proofErr w:type="spellEnd"/>
-      <w:r>
-        <w:rPr>
-          <w:rFonts w:ascii="Arial" w:eastAsia="Arial" w:hAnsi="Arial" w:cs="Arial"/>
-          <w:bCs/>
-        </w:rPr>
-        <w:t>-MM-dd’</w:t>
-      </w:r>
-      <w:r>
-        <w:rPr>
-          <w:rFonts w:ascii="Arial" w:eastAsia="Arial" w:hAnsi="Arial" w:cs="Arial"/>
-          <w:bCs/>
-        </w:rPr>
-        <w:t>)</w:t>
-      </w:r>
-      <w:r>
-        <w:rPr>
-          <w:rFonts w:ascii="Arial" w:eastAsia="Arial" w:hAnsi="Arial" w:cs="Arial"/>
-          <w:bCs/>
-        </w:rPr>
-        <w:t>}</w:t>
-      </w:r>
-      <w:r>
-        <w:rPr>
-          <w:rFonts w:ascii="Arial" w:hAnsi="Arial" w:cs="Arial"/>
-          <w:b/>
-          <w:bCs/>
-        </w:rPr>
-        <w:t>&gt;&gt;</w:t>
-      </w:r>
-      <w:r>
-        <w:rPr>
-          <w:rFonts w:ascii="Arial" w:hAnsi="Arial" w:cs="Arial"/>
-        </w:rPr>
-        <w:t>.</w:t>
-      </w:r>
     </w:p>
     <w:p>
       <w:pPr>
@@ -7538,19 +6013,11 @@
         </w:rPr>
         <w:t>&lt;&lt;cs_{</w:t>
       </w:r>
-      <w:proofErr w:type="spellStart"/>
-      <w:r>
-        <w:rPr>
-          <w:rFonts w:ascii="Arial" w:hAnsi="Arial" w:cs="Arial"/>
-        </w:rPr>
-        <w:t>hasPersonalInjury</w:t>
-      </w:r>
-      <w:proofErr w:type="spellEnd"/>
-      <w:r>
-        <w:rPr>
-          <w:rFonts w:ascii="Arial" w:hAnsi="Arial" w:cs="Arial"/>
-        </w:rPr>
-        <w:t>=true</w:t>
+      <w:r>
+        <w:rPr>
+          <w:rFonts w:ascii="Arial" w:hAnsi="Arial" w:cs="Arial"/>
+        </w:rPr>
+        <w:t>hasPersonalInjury=true</w:t>
       </w:r>
       <w:r>
         <w:rPr>
@@ -7639,126 +6106,36 @@
           <w:bCs/>
           <w:lang w:val="es-ES"/>
         </w:rPr>
-        <w:t>{</w:t>
-      </w:r>
-      <w:proofErr w:type="spellStart"/>
+        <w:t>{dateFormat(</w:t>
+      </w:r>
+      <w:r>
+        <w:rPr>
+          <w:rFonts w:ascii="Arial" w:hAnsi="Arial" w:cs="Arial"/>
+          <w:lang w:val="es-ES"/>
+        </w:rPr>
+        <w:t>fastTrackPersonalInjury</w:t>
+      </w:r>
+      <w:r>
+        <w:rPr>
+          <w:rFonts w:ascii="Arial" w:hAnsi="Arial" w:cs="Arial"/>
+          <w:lang w:val="es-ES"/>
+        </w:rPr>
+        <w:t>.date</w:t>
+      </w:r>
+      <w:r>
+        <w:rPr>
+          <w:rFonts w:ascii="Arial" w:hAnsi="Arial" w:cs="Arial"/>
+          <w:lang w:val="es-ES"/>
+        </w:rPr>
+        <w:t>2</w:t>
+      </w:r>
       <w:r>
         <w:rPr>
           <w:rFonts w:ascii="Arial" w:eastAsia="Arial" w:hAnsi="Arial" w:cs="Arial"/>
           <w:bCs/>
           <w:lang w:val="es-ES"/>
         </w:rPr>
-        <w:t>dateFormat</w:t>
-      </w:r>
-      <w:proofErr w:type="spellEnd"/>
-      <w:r>
-        <w:rPr>
-          <w:rFonts w:ascii="Arial" w:eastAsia="Arial" w:hAnsi="Arial" w:cs="Arial"/>
-          <w:bCs/>
-          <w:lang w:val="es-ES"/>
-        </w:rPr>
-        <w:t>(</w:t>
-      </w:r>
-      <w:r>
-        <w:rPr>
-          <w:rFonts w:ascii="Arial" w:hAnsi="Arial" w:cs="Arial"/>
-          <w:lang w:val="es-ES"/>
-        </w:rPr>
-        <w:t>fastTrackPersonalInjury</w:t>
-      </w:r>
-      <w:r>
-        <w:rPr>
-          <w:rFonts w:ascii="Arial" w:hAnsi="Arial" w:cs="Arial"/>
-          <w:lang w:val="es-ES"/>
-        </w:rPr>
-        <w:t>.date</w:t>
-      </w:r>
-      <w:r>
-        <w:rPr>
-          <w:rFonts w:ascii="Arial" w:hAnsi="Arial" w:cs="Arial"/>
-          <w:lang w:val="es-ES"/>
-        </w:rPr>
-        <w:t>2</w:t>
-      </w:r>
-      <w:r>
-        <w:rPr>
-          <w:rFonts w:ascii="Arial" w:eastAsia="Arial" w:hAnsi="Arial" w:cs="Arial"/>
-          <w:bCs/>
-          <w:lang w:val="es-ES"/>
-        </w:rPr>
-        <w:t>, ‘</w:t>
-      </w:r>
-      <w:proofErr w:type="spellStart"/>
-      <w:r>
-        <w:rPr>
-          <w:rFonts w:ascii="Arial" w:eastAsia="Arial" w:hAnsi="Arial" w:cs="Arial"/>
-          <w:bCs/>
-          <w:lang w:val="es-ES"/>
-        </w:rPr>
-        <w:t>dd</w:t>
-      </w:r>
-      <w:proofErr w:type="spellEnd"/>
-      <w:r>
-        <w:rPr>
-          <w:rFonts w:ascii="Arial" w:eastAsia="Arial" w:hAnsi="Arial" w:cs="Arial"/>
-          <w:bCs/>
-          <w:lang w:val="es-ES"/>
-        </w:rPr>
-        <w:t xml:space="preserve"> MMMM </w:t>
-      </w:r>
-      <w:proofErr w:type="spellStart"/>
-      <w:r>
-        <w:rPr>
-          <w:rFonts w:ascii="Arial" w:eastAsia="Arial" w:hAnsi="Arial" w:cs="Arial"/>
-          <w:bCs/>
-          <w:lang w:val="es-ES"/>
-        </w:rPr>
-        <w:t>yyyy</w:t>
-      </w:r>
-      <w:proofErr w:type="spellEnd"/>
-      <w:r>
-        <w:rPr>
-          <w:rFonts w:ascii="Arial" w:eastAsia="Arial" w:hAnsi="Arial" w:cs="Arial"/>
-          <w:bCs/>
-          <w:lang w:val="es-ES"/>
-        </w:rPr>
-        <w:t>’, ‘</w:t>
-      </w:r>
-      <w:proofErr w:type="spellStart"/>
-      <w:r>
-        <w:rPr>
-          <w:rFonts w:ascii="Arial" w:eastAsia="Arial" w:hAnsi="Arial" w:cs="Arial"/>
-          <w:bCs/>
-          <w:lang w:val="es-ES"/>
-        </w:rPr>
-        <w:t>yyyy</w:t>
-      </w:r>
-      <w:proofErr w:type="spellEnd"/>
-      <w:r>
-        <w:rPr>
-          <w:rFonts w:ascii="Arial" w:eastAsia="Arial" w:hAnsi="Arial" w:cs="Arial"/>
-          <w:bCs/>
-          <w:lang w:val="es-ES"/>
-        </w:rPr>
-        <w:t>-MM-</w:t>
-      </w:r>
-      <w:proofErr w:type="spellStart"/>
-      <w:r>
-        <w:rPr>
-          <w:rFonts w:ascii="Arial" w:eastAsia="Arial" w:hAnsi="Arial" w:cs="Arial"/>
-          <w:bCs/>
-          <w:lang w:val="es-ES"/>
-        </w:rPr>
-        <w:t>dd</w:t>
-      </w:r>
-      <w:proofErr w:type="spellEnd"/>
-      <w:r>
-        <w:rPr>
-          <w:rFonts w:ascii="Arial" w:eastAsia="Arial" w:hAnsi="Arial" w:cs="Arial"/>
-          <w:bCs/>
-          <w:lang w:val="es-ES"/>
-        </w:rPr>
-        <w:t>’)}</w:t>
+        <w:t>, ‘dd MMMM yyyy’, ‘yyyy-MM-dd’)}</w:t>
       </w:r>
       <w:r>
         <w:rPr>
@@ -7811,25 +6188,69 @@
           <w:bCs/>
           <w:lang w:val="es-ES"/>
         </w:rPr>
-        <w:t>{</w:t>
-      </w:r>
-      <w:proofErr w:type="spellStart"/>
+        <w:t>{dateFormat(</w:t>
+      </w:r>
+      <w:r>
+        <w:rPr>
+          <w:rFonts w:ascii="Arial" w:hAnsi="Arial" w:cs="Arial"/>
+          <w:lang w:val="es-ES"/>
+        </w:rPr>
+        <w:t>fastTrackPersonalInjury</w:t>
+      </w:r>
+      <w:r>
+        <w:rPr>
+          <w:rFonts w:ascii="Arial" w:hAnsi="Arial" w:cs="Arial"/>
+          <w:lang w:val="es-ES"/>
+        </w:rPr>
+        <w:t>.date</w:t>
+      </w:r>
+      <w:r>
+        <w:rPr>
+          <w:rFonts w:ascii="Arial" w:hAnsi="Arial" w:cs="Arial"/>
+          <w:lang w:val="es-ES"/>
+        </w:rPr>
+        <w:t>3</w:t>
+      </w:r>
       <w:r>
         <w:rPr>
           <w:rFonts w:ascii="Arial" w:eastAsia="Arial" w:hAnsi="Arial" w:cs="Arial"/>
           <w:bCs/>
           <w:lang w:val="es-ES"/>
         </w:rPr>
-        <w:t>dateFormat</w:t>
-      </w:r>
-      <w:proofErr w:type="spellEnd"/>
+        <w:t>, ‘dd MMMM yyyy’, ‘yyyy-MM-dd’)}</w:t>
+      </w:r>
+      <w:r>
+        <w:rPr>
+          <w:rFonts w:ascii="Arial" w:hAnsi="Arial" w:cs="Arial"/>
+          <w:b/>
+          <w:bCs/>
+          <w:lang w:val="es-ES"/>
+        </w:rPr>
+        <w:t>&gt;&gt;</w:t>
+      </w:r>
+      <w:r>
+        <w:rPr>
+          <w:rFonts w:ascii="Arial" w:hAnsi="Arial" w:cs="Arial"/>
+          <w:lang w:val="es-ES"/>
+        </w:rPr>
+        <w:t xml:space="preserve"> &lt;&lt;fastTrackPersonalInjury.input4&gt;&gt; </w:t>
+      </w:r>
+      <w:r>
+        <w:rPr>
+          <w:rFonts w:ascii="Arial" w:hAnsi="Arial" w:cs="Arial"/>
+          <w:b/>
+          <w:bCs/>
+          <w:lang w:val="es-ES"/>
+        </w:rPr>
+        <w:t>&lt;&lt;</w:t>
+      </w:r>
       <w:r>
         <w:rPr>
           <w:rFonts w:ascii="Arial" w:eastAsia="Arial" w:hAnsi="Arial" w:cs="Arial"/>
           <w:bCs/>
           <w:lang w:val="es-ES"/>
         </w:rPr>
-        <w:t>(</w:t>
+        <w:t>{dateFormat(</w:t>
       </w:r>
       <w:r>
         <w:rPr>
@@ -7850,7 +6271,7 @@
           <w:rFonts w:ascii="Arial" w:hAnsi="Arial" w:cs="Arial"/>
           <w:lang w:val="es-ES"/>
         </w:rPr>
-        <w:t>3</w:t>
+        <w:t>4</w:t>
       </w:r>
       <w:r>
         <w:rPr>
@@ -7858,246 +6279,22 @@
           <w:bCs/>
           <w:lang w:val="es-ES"/>
         </w:rPr>
-        <w:t>, ‘</w:t>
-      </w:r>
-      <w:proofErr w:type="spellStart"/>
-      <w:r>
-        <w:rPr>
-          <w:rFonts w:ascii="Arial" w:eastAsia="Arial" w:hAnsi="Arial" w:cs="Arial"/>
+        <w:t>, ‘dd MMMM yyyy’, ‘yyyy-MM-dd’)}</w:t>
+      </w:r>
+      <w:r>
+        <w:rPr>
+          <w:rFonts w:ascii="Arial" w:hAnsi="Arial" w:cs="Arial"/>
+          <w:b/>
           <w:bCs/>
           <w:lang w:val="es-ES"/>
         </w:rPr>
-        <w:t>dd</w:t>
-      </w:r>
-      <w:proofErr w:type="spellEnd"/>
-      <w:r>
-        <w:rPr>
-          <w:rFonts w:ascii="Arial" w:eastAsia="Arial" w:hAnsi="Arial" w:cs="Arial"/>
-          <w:bCs/>
+        <w:t>&gt;&gt;</w:t>
+      </w:r>
+      <w:r>
+        <w:rPr>
+          <w:rFonts w:ascii="Arial" w:hAnsi="Arial" w:cs="Arial"/>
           <w:lang w:val="es-ES"/>
         </w:rPr>
-        <w:t xml:space="preserve"> MMMM </w:t>
-      </w:r>
-      <w:proofErr w:type="spellStart"/>
-      <w:r>
-        <w:rPr>
-          <w:rFonts w:ascii="Arial" w:eastAsia="Arial" w:hAnsi="Arial" w:cs="Arial"/>
-          <w:bCs/>
-          <w:lang w:val="es-ES"/>
-        </w:rPr>
-        <w:t>yyyy</w:t>
-      </w:r>
-      <w:proofErr w:type="spellEnd"/>
-      <w:r>
-        <w:rPr>
-          <w:rFonts w:ascii="Arial" w:eastAsia="Arial" w:hAnsi="Arial" w:cs="Arial"/>
-          <w:bCs/>
-          <w:lang w:val="es-ES"/>
-        </w:rPr>
-        <w:t>’, ‘</w:t>
-      </w:r>
-      <w:proofErr w:type="spellStart"/>
-      <w:r>
-        <w:rPr>
-          <w:rFonts w:ascii="Arial" w:eastAsia="Arial" w:hAnsi="Arial" w:cs="Arial"/>
-          <w:bCs/>
-          <w:lang w:val="es-ES"/>
-        </w:rPr>
-        <w:t>yyyy</w:t>
-      </w:r>
-      <w:proofErr w:type="spellEnd"/>
-      <w:r>
-        <w:rPr>
-          <w:rFonts w:ascii="Arial" w:eastAsia="Arial" w:hAnsi="Arial" w:cs="Arial"/>
-          <w:bCs/>
-          <w:lang w:val="es-ES"/>
-        </w:rPr>
-        <w:t>-MM-</w:t>
-      </w:r>
-      <w:proofErr w:type="spellStart"/>
-      <w:r>
-        <w:rPr>
-          <w:rFonts w:ascii="Arial" w:eastAsia="Arial" w:hAnsi="Arial" w:cs="Arial"/>
-          <w:bCs/>
-          <w:lang w:val="es-ES"/>
-        </w:rPr>
-        <w:t>dd</w:t>
-      </w:r>
-      <w:proofErr w:type="spellEnd"/>
-      <w:r>
-        <w:rPr>
-          <w:rFonts w:ascii="Arial" w:eastAsia="Arial" w:hAnsi="Arial" w:cs="Arial"/>
-          <w:bCs/>
-          <w:lang w:val="es-ES"/>
-        </w:rPr>
-        <w:t>’)}</w:t>
-      </w:r>
-      <w:r>
-        <w:rPr>
-          <w:rFonts w:ascii="Arial" w:hAnsi="Arial" w:cs="Arial"/>
-          <w:b/>
-          <w:bCs/>
-          <w:lang w:val="es-ES"/>
-        </w:rPr>
-        <w:t>&gt;&gt;</w:t>
-      </w:r>
-      <w:r>
-        <w:rPr>
-          <w:rFonts w:ascii="Arial" w:hAnsi="Arial" w:cs="Arial"/>
-          <w:lang w:val="es-ES"/>
-        </w:rPr>
-        <w:t xml:space="preserve"> &lt;&lt;fastTrackPersonalInjury.input4&gt;&gt; </w:t>
-      </w:r>
-      <w:r>
-        <w:rPr>
-          <w:rFonts w:ascii="Arial" w:hAnsi="Arial" w:cs="Arial"/>
-          <w:b/>
-          <w:bCs/>
-          <w:lang w:val="es-ES"/>
-        </w:rPr>
-        <w:t>&lt;&lt;</w:t>
-      </w:r>
-      <w:r>
-        <w:rPr>
-          <w:rFonts w:ascii="Arial" w:eastAsia="Arial" w:hAnsi="Arial" w:cs="Arial"/>
-          <w:bCs/>
-          <w:lang w:val="es-ES"/>
-        </w:rPr>
-        <w:t>{</w:t>
-      </w:r>
-      <w:proofErr w:type="spellStart"/>
-      <w:r>
-        <w:rPr>
-          <w:rFonts w:ascii="Arial" w:eastAsia="Arial" w:hAnsi="Arial" w:cs="Arial"/>
-          <w:bCs/>
-          <w:lang w:val="es-ES"/>
-        </w:rPr>
-        <w:t>dateFormat</w:t>
-      </w:r>
-      <w:proofErr w:type="spellEnd"/>
-      <w:r>
-        <w:rPr>
-          <w:rFonts w:ascii="Arial" w:eastAsia="Arial" w:hAnsi="Arial" w:cs="Arial"/>
-          <w:bCs/>
-          <w:lang w:val="es-ES"/>
-        </w:rPr>
-        <w:t>(</w:t>
-      </w:r>
-      <w:r>
-        <w:rPr>
-          <w:rFonts w:ascii="Arial" w:hAnsi="Arial" w:cs="Arial"/>
-          <w:lang w:val="es-ES"/>
-        </w:rPr>
-        <w:t>fastTrackPersonalInjury</w:t>
-      </w:r>
-      <w:r>
-        <w:rPr>
-          <w:rFonts w:ascii="Arial" w:hAnsi="Arial" w:cs="Arial"/>
-          <w:lang w:val="es-ES"/>
-        </w:rPr>
-        <w:t>.date</w:t>
-      </w:r>
-      <w:r>
-        <w:rPr>
-          <w:rFonts w:ascii="Arial" w:hAnsi="Arial" w:cs="Arial"/>
-          <w:lang w:val="es-ES"/>
-        </w:rPr>
-        <w:t>4</w:t>
-      </w:r>
-      <w:r>
-        <w:rPr>
-          <w:rFonts w:ascii="Arial" w:eastAsia="Arial" w:hAnsi="Arial" w:cs="Arial"/>
-          <w:bCs/>
-          <w:lang w:val="es-ES"/>
-        </w:rPr>
-        <w:t>, ‘</w:t>
-      </w:r>
-      <w:proofErr w:type="spellStart"/>
-      <w:r>
-        <w:rPr>
-          <w:rFonts w:ascii="Arial" w:eastAsia="Arial" w:hAnsi="Arial" w:cs="Arial"/>
-          <w:bCs/>
-          <w:lang w:val="es-ES"/>
-        </w:rPr>
-        <w:t>dd</w:t>
-      </w:r>
-      <w:proofErr w:type="spellEnd"/>
-      <w:r>
-        <w:rPr>
-          <w:rFonts w:ascii="Arial" w:eastAsia="Arial" w:hAnsi="Arial" w:cs="Arial"/>
-          <w:bCs/>
-          <w:lang w:val="es-ES"/>
-        </w:rPr>
-        <w:t xml:space="preserve"> MMMM </w:t>
-      </w:r>
-      <w:proofErr w:type="spellStart"/>
-      <w:r>
-        <w:rPr>
-          <w:rFonts w:ascii="Arial" w:eastAsia="Arial" w:hAnsi="Arial" w:cs="Arial"/>
-          <w:bCs/>
-          <w:lang w:val="es-ES"/>
-        </w:rPr>
-        <w:t>yyyy</w:t>
-      </w:r>
-      <w:proofErr w:type="spellEnd"/>
-      <w:r>
-        <w:rPr>
-          <w:rFonts w:ascii="Arial" w:eastAsia="Arial" w:hAnsi="Arial" w:cs="Arial"/>
-          <w:bCs/>
-          <w:lang w:val="es-ES"/>
-        </w:rPr>
-        <w:t>’, ‘</w:t>
-      </w:r>
-      <w:proofErr w:type="spellStart"/>
-      <w:r>
-        <w:rPr>
-          <w:rFonts w:ascii="Arial" w:eastAsia="Arial" w:hAnsi="Arial" w:cs="Arial"/>
-          <w:bCs/>
-          <w:lang w:val="es-ES"/>
-        </w:rPr>
-        <w:t>yyyy</w:t>
-      </w:r>
-      <w:proofErr w:type="spellEnd"/>
-      <w:r>
-        <w:rPr>
-          <w:rFonts w:ascii="Arial" w:eastAsia="Arial" w:hAnsi="Arial" w:cs="Arial"/>
-          <w:bCs/>
-          <w:lang w:val="es-ES"/>
-        </w:rPr>
-        <w:t>-MM-</w:t>
-      </w:r>
-      <w:proofErr w:type="spellStart"/>
-      <w:r>
-        <w:rPr>
-          <w:rFonts w:ascii="Arial" w:eastAsia="Arial" w:hAnsi="Arial" w:cs="Arial"/>
-          <w:bCs/>
-          <w:lang w:val="es-ES"/>
-        </w:rPr>
-        <w:t>dd</w:t>
-      </w:r>
-      <w:proofErr w:type="spellEnd"/>
-      <w:r>
-        <w:rPr>
-          <w:rFonts w:ascii="Arial" w:eastAsia="Arial" w:hAnsi="Arial" w:cs="Arial"/>
-          <w:bCs/>
-          <w:lang w:val="es-ES"/>
-        </w:rPr>
-        <w:t>’)}</w:t>
-      </w:r>
-      <w:r>
-        <w:rPr>
-          <w:rFonts w:ascii="Arial" w:hAnsi="Arial" w:cs="Arial"/>
-          <w:b/>
-          <w:bCs/>
-          <w:lang w:val="es-ES"/>
-        </w:rPr>
-        <w:t>&gt;&gt;</w:t>
-      </w:r>
-      <w:r>
-        <w:rPr>
-          <w:rFonts w:ascii="Arial" w:hAnsi="Arial" w:cs="Arial"/>
-          <w:lang w:val="es-ES"/>
-        </w:rPr>
         <w:t>.</w:t>
       </w:r>
     </w:p>
@@ -8130,21 +6327,12 @@
         </w:rPr>
         <w:t>&lt;&lt;cs_{</w:t>
       </w:r>
-      <w:proofErr w:type="spellStart"/>
-      <w:r>
-        <w:rPr>
-          <w:rFonts w:ascii="Arial" w:hAnsi="Arial" w:cs="Arial"/>
-          <w:lang w:val="en-US"/>
-        </w:rPr>
-        <w:t>hasRoadTrafficAccident</w:t>
-      </w:r>
-      <w:proofErr w:type="spellEnd"/>
-      <w:r>
-        <w:rPr>
-          <w:rFonts w:ascii="Arial" w:hAnsi="Arial" w:cs="Arial"/>
-          <w:lang w:val="en-US"/>
-        </w:rPr>
-        <w:t>=true</w:t>
+      <w:r>
+        <w:rPr>
+          <w:rFonts w:ascii="Arial" w:hAnsi="Arial" w:cs="Arial"/>
+          <w:lang w:val="en-US"/>
+        </w:rPr>
+        <w:t>hasRoadTrafficAccident=true</w:t>
       </w:r>
       <w:r>
         <w:rPr>
@@ -8186,7 +6374,6 @@
         </w:rPr>
         <w:t>&lt;&lt;</w:t>
       </w:r>
-      <w:proofErr w:type="spellStart"/>
       <w:r>
         <w:rPr>
           <w:rFonts w:ascii="Arial" w:hAnsi="Arial" w:cs="Arial"/>
@@ -8194,7 +6381,6 @@
         </w:rPr>
         <w:t>fastTrackRoadTrafficAccident.input</w:t>
       </w:r>
-      <w:proofErr w:type="spellEnd"/>
       <w:r>
         <w:rPr>
           <w:rFonts w:ascii="Arial" w:hAnsi="Arial" w:cs="Arial"/>
@@ -8220,91 +6406,41 @@
           <w:rFonts w:ascii="Arial" w:eastAsia="Arial" w:hAnsi="Arial" w:cs="Arial"/>
           <w:bCs/>
         </w:rPr>
-        <w:t>{</w:t>
-      </w:r>
-      <w:proofErr w:type="spellStart"/>
+        <w:t>{dateFormat(</w:t>
+      </w:r>
+      <w:r>
+        <w:rPr>
+          <w:rFonts w:ascii="Arial" w:hAnsi="Arial" w:cs="Arial"/>
+          <w:lang w:val="en-US"/>
+        </w:rPr>
+        <w:t>fastTrackRoadTrafficAccident.</w:t>
+      </w:r>
+      <w:r>
+        <w:rPr>
+          <w:rFonts w:ascii="Arial" w:hAnsi="Arial" w:cs="Arial"/>
+          <w:lang w:val="en-US"/>
+        </w:rPr>
+        <w:t>date</w:t>
+      </w:r>
       <w:r>
         <w:rPr>
           <w:rFonts w:ascii="Arial" w:eastAsia="Arial" w:hAnsi="Arial" w:cs="Arial"/>
           <w:bCs/>
         </w:rPr>
-        <w:t>dateFormat</w:t>
-      </w:r>
-      <w:proofErr w:type="spellEnd"/>
+        <w:t>, ‘dd MMMM yyyy’, ‘yyyy-MM-dd’</w:t>
+      </w:r>
       <w:r>
         <w:rPr>
           <w:rFonts w:ascii="Arial" w:eastAsia="Arial" w:hAnsi="Arial" w:cs="Arial"/>
           <w:bCs/>
         </w:rPr>
-        <w:t>(</w:t>
-      </w:r>
-      <w:proofErr w:type="spellStart"/>
-      <w:r>
-        <w:rPr>
-          <w:rFonts w:ascii="Arial" w:hAnsi="Arial" w:cs="Arial"/>
-          <w:lang w:val="en-US"/>
-        </w:rPr>
-        <w:t>fastTrackRoadTrafficAccident.</w:t>
-      </w:r>
-      <w:r>
-        <w:rPr>
-          <w:rFonts w:ascii="Arial" w:hAnsi="Arial" w:cs="Arial"/>
-          <w:lang w:val="en-US"/>
-        </w:rPr>
-        <w:t>date</w:t>
-      </w:r>
-      <w:proofErr w:type="spellEnd"/>
+        <w:t>)</w:t>
+      </w:r>
       <w:r>
         <w:rPr>
           <w:rFonts w:ascii="Arial" w:eastAsia="Arial" w:hAnsi="Arial" w:cs="Arial"/>
           <w:bCs/>
         </w:rPr>
-        <w:t xml:space="preserve">, ‘dd MMMM </w:t>
-      </w:r>
-      <w:proofErr w:type="spellStart"/>
-      <w:r>
-        <w:rPr>
-          <w:rFonts w:ascii="Arial" w:eastAsia="Arial" w:hAnsi="Arial" w:cs="Arial"/>
-          <w:bCs/>
-        </w:rPr>
-        <w:t>yyyy</w:t>
-      </w:r>
-      <w:proofErr w:type="spellEnd"/>
-      <w:r>
-        <w:rPr>
-          <w:rFonts w:ascii="Arial" w:eastAsia="Arial" w:hAnsi="Arial" w:cs="Arial"/>
-          <w:bCs/>
-        </w:rPr>
-        <w:t>’, ‘</w:t>
-      </w:r>
-      <w:proofErr w:type="spellStart"/>
-      <w:r>
-        <w:rPr>
-          <w:rFonts w:ascii="Arial" w:eastAsia="Arial" w:hAnsi="Arial" w:cs="Arial"/>
-          <w:bCs/>
-        </w:rPr>
-        <w:t>yyyy</w:t>
-      </w:r>
-      <w:proofErr w:type="spellEnd"/>
-      <w:r>
-        <w:rPr>
-          <w:rFonts w:ascii="Arial" w:eastAsia="Arial" w:hAnsi="Arial" w:cs="Arial"/>
-          <w:bCs/>
-        </w:rPr>
-        <w:t>-MM-dd’</w:t>
-      </w:r>
-      <w:r>
-        <w:rPr>
-          <w:rFonts w:ascii="Arial" w:eastAsia="Arial" w:hAnsi="Arial" w:cs="Arial"/>
-          <w:bCs/>
-        </w:rPr>
-        <w:t>)</w:t>
-      </w:r>
-      <w:r>
-        <w:rPr>
-          <w:rFonts w:ascii="Arial" w:eastAsia="Arial" w:hAnsi="Arial" w:cs="Arial"/>
-          <w:bCs/>
-        </w:rPr>
         <w:t>}</w:t>
       </w:r>
       <w:r>
@@ -8346,21 +6482,7 @@
         <w:rPr>
           <w:rFonts w:ascii="Arial" w:hAnsi="Arial" w:cs="Arial"/>
         </w:rPr>
-        <w:t>&lt;&lt;cs_{</w:t>
-      </w:r>
-      <w:proofErr w:type="spellStart"/>
-      <w:r>
-        <w:rPr>
-          <w:rFonts w:ascii="Arial" w:hAnsi="Arial" w:cs="Arial"/>
-        </w:rPr>
-        <w:t>hasNewDirections</w:t>
-      </w:r>
-      <w:proofErr w:type="spellEnd"/>
-      <w:r>
-        <w:rPr>
-          <w:rFonts w:ascii="Arial" w:hAnsi="Arial" w:cs="Arial"/>
-        </w:rPr>
-        <w:t>=true}&gt;&gt;</w:t>
+        <w:t>&lt;&lt;cs_{hasNewDirections=true}&gt;&gt;</w:t>
       </w:r>
     </w:p>
     <w:p>
@@ -8411,25 +6533,8 @@
           <w:rFonts w:ascii="Arial" w:hAnsi="Arial" w:cs="Arial"/>
           <w:bCs/>
         </w:rPr>
-        <w:t>&lt;&lt;</w:t>
-      </w:r>
-      <w:proofErr w:type="spellStart"/>
-      <w:r>
-        <w:rPr>
-          <w:rFonts w:ascii="Arial" w:hAnsi="Arial" w:cs="Arial"/>
-          <w:bCs/>
-        </w:rPr>
-        <w:t>rs</w:t>
-      </w:r>
-      <w:proofErr w:type="spellEnd"/>
-      <w:r>
-        <w:rPr>
-          <w:rFonts w:ascii="Arial" w:hAnsi="Arial" w:cs="Arial"/>
-          <w:bCs/>
-        </w:rPr>
-        <w:t>_</w:t>
-      </w:r>
-      <w:proofErr w:type="spellStart"/>
+        <w:t>&lt;&lt;rs_</w:t>
+      </w:r>
       <w:r>
         <w:rPr>
           <w:rFonts w:ascii="Arial" w:hAnsi="Arial" w:cs="Arial"/>
@@ -8437,7 +6542,6 @@
         </w:rPr>
         <w:t>fastTrackAddNewDirections</w:t>
       </w:r>
-      <w:proofErr w:type="spellEnd"/>
       <w:r>
         <w:rPr>
           <w:rFonts w:ascii="Arial" w:hAnsi="Arial" w:cs="Arial"/>
@@ -8463,46 +6567,22 @@
           <w:rFonts w:ascii="Arial" w:hAnsi="Arial" w:cs="Arial"/>
           <w:bCs/>
         </w:rPr>
-        <w:t>&lt;&lt;</w:t>
-      </w:r>
-      <w:proofErr w:type="spellStart"/>
-      <w:r>
-        <w:rPr>
-          <w:rFonts w:ascii="Arial" w:hAnsi="Arial" w:cs="Arial"/>
-          <w:bCs/>
-        </w:rPr>
-        <w:t>value.directionComment</w:t>
-      </w:r>
-      <w:proofErr w:type="spellEnd"/>
-      <w:r>
-        <w:rPr>
-          <w:rFonts w:ascii="Arial" w:hAnsi="Arial" w:cs="Arial"/>
-          <w:bCs/>
-        </w:rPr>
-        <w:t>&gt;&gt;</w:t>
-      </w:r>
-    </w:p>
-    <w:p>
-      <w:pPr>
-        <w:rPr>
-          <w:rFonts w:ascii="Arial" w:hAnsi="Arial" w:cs="Arial"/>
-          <w:bCs/>
-        </w:rPr>
-      </w:pPr>
-      <w:r>
-        <w:rPr>
-          <w:rFonts w:ascii="Arial" w:hAnsi="Arial" w:cs="Arial"/>
-          <w:bCs/>
-        </w:rPr>
-        <w:t>&lt;&lt;</w:t>
-      </w:r>
-      <w:proofErr w:type="spellStart"/>
-      <w:r>
-        <w:rPr>
-          <w:rFonts w:ascii="Arial" w:hAnsi="Arial" w:cs="Arial"/>
-          <w:bCs/>
-        </w:rPr>
-        <w:t>es_</w:t>
+        <w:t>&lt;&lt;value.directionComment&gt;&gt;</w:t>
+      </w:r>
+    </w:p>
+    <w:p>
+      <w:pPr>
+        <w:rPr>
+          <w:rFonts w:ascii="Arial" w:hAnsi="Arial" w:cs="Arial"/>
+          <w:bCs/>
+        </w:rPr>
+      </w:pPr>
+      <w:r>
+        <w:rPr>
+          <w:rFonts w:ascii="Arial" w:hAnsi="Arial" w:cs="Arial"/>
+          <w:bCs/>
+        </w:rPr>
+        <w:t>&lt;&lt;es_</w:t>
       </w:r>
       <w:r>
         <w:rPr>
@@ -8516,15 +6596,7 @@
           <w:rFonts w:ascii="Arial" w:hAnsi="Arial" w:cs="Arial"/>
           <w:bCs/>
         </w:rPr>
-        <w:t>AddNewDirections</w:t>
-      </w:r>
-      <w:proofErr w:type="spellEnd"/>
-      <w:r>
-        <w:rPr>
-          <w:rFonts w:ascii="Arial" w:hAnsi="Arial" w:cs="Arial"/>
-          <w:bCs/>
-        </w:rPr>
-        <w:t>&gt;&gt;</w:t>
+        <w:t>AddNewDirections&gt;&gt;</w:t>
       </w:r>
     </w:p>
     <w:p>
@@ -8557,7 +6629,6 @@
         </w:rPr>
         <w:t>&lt;&lt;cs_{</w:t>
       </w:r>
-      <w:proofErr w:type="spellStart"/>
       <w:r>
         <w:rPr>
           <w:rFonts w:ascii="Arial" w:hAnsi="Arial" w:cs="Arial"/>
@@ -8565,7 +6636,6 @@
         </w:rPr>
         <w:t>fastTrackWelshLanguageToggle</w:t>
       </w:r>
-      <w:proofErr w:type="spellEnd"/>
       <w:r>
         <w:rPr>
           <w:rFonts w:ascii="Arial" w:hAnsi="Arial" w:cs="Arial"/>
@@ -8609,7 +6679,6 @@
         </w:rPr>
         <w:t>&lt;&lt;</w:t>
       </w:r>
-      <w:proofErr w:type="spellStart"/>
       <w:r>
         <w:rPr>
           <w:rFonts w:ascii="Arial" w:hAnsi="Arial" w:cs="Arial"/>
@@ -8617,7 +6686,6 @@
         </w:rPr>
         <w:t>welshLanguageDescription</w:t>
       </w:r>
-      <w:proofErr w:type="spellEnd"/>
       <w:r>
         <w:rPr>
           <w:rFonts w:ascii="Arial" w:hAnsi="Arial" w:cs="Arial"/>
@@ -8675,7 +6743,6 @@
         </w:rPr>
         <w:t>&lt;&lt;</w:t>
       </w:r>
-      <w:proofErr w:type="spellStart"/>
       <w:r>
         <w:rPr>
           <w:rFonts w:ascii="Arial" w:hAnsi="Arial" w:cs="Arial"/>
@@ -8690,7 +6757,6 @@
         </w:rPr>
         <w:t>.input</w:t>
       </w:r>
-      <w:proofErr w:type="spellEnd"/>
       <w:r>
         <w:rPr>
           <w:rFonts w:ascii="Arial" w:hAnsi="Arial" w:cs="Arial"/>
@@ -8719,7 +6785,7 @@
 </file>
 
 <file path=word/endnotes.xml><?xml version="1.0" encoding="utf-8"?>
-<w:endnotes xmlns:wpc="http://schemas.microsoft.com/office/word/2010/wordprocessingCanvas" xmlns:cx="http://schemas.microsoft.com/office/drawing/2014/chartex" xmlns:cx1="http://schemas.microsoft.com/office/drawing/2015/9/8/chartex" xmlns:cx2="http://schemas.microsoft.com/office/drawing/2015/10/21/chartex" xmlns:cx3="http://schemas.microsoft.com/office/drawing/2016/5/9/chartex" xmlns:cx4="http://schemas.microsoft.com/office/drawing/2016/5/10/chartex" xmlns:cx5="http://schemas.microsoft.com/office/drawing/2016/5/11/chartex" xmlns:cx6="http://schemas.microsoft.com/office/drawing/2016/5/12/chartex" xmlns:cx7="http://schemas.microsoft.com/office/drawing/2016/5/13/chartex" xmlns:cx8="http://schemas.microsoft.com/office/drawing/2016/5/14/chartex" xmlns:mc="http://schemas.openxmlformats.org/markup-compatibility/2006" xmlns:aink="http://schemas.microsoft.com/office/drawing/2016/ink" xmlns:am3d="http://schemas.microsoft.com/office/drawing/2017/model3d" xmlns:o="urn:schemas-microsoft-com:office:office" xmlns:oel="http://schemas.microsoft.com/office/2019/extlst" xmlns:r="http://schemas.openxmlformats.org/officeDocument/2006/relationships" xmlns:m="http://schemas.openxmlformats.org/officeDocument/2006/math" xmlns:v="urn:schemas-microsoft-com:vml" xmlns:wp14="http://schemas.microsoft.com/office/word/2010/wordprocessingDrawing" xmlns:wp="http://schemas.openxmlformats.org/drawingml/2006/wordprocessingDrawing" xmlns:w10="urn:schemas-microsoft-com:office:word" xmlns:w="http://schemas.openxmlformats.org/wordprocessingml/2006/main" xmlns:w14="http://schemas.microsoft.com/office/word/2010/wordml" xmlns:w15="http://schemas.microsoft.com/office/word/2012/wordml" xmlns:w16cex="http://schemas.microsoft.com/office/word/2018/wordml/cex" xmlns:w16cid="http://schemas.microsoft.com/office/word/2016/wordml/cid" xmlns:w16="http://schemas.microsoft.com/office/word/2018/wordml" xmlns:w16du="http://schemas.microsoft.com/office/word/2023/wordml/word16du" xmlns:w16sdtdh="http://schemas.microsoft.com/office/word/2020/wordml/sdtdatahash" xmlns:w16se="http://schemas.microsoft.com/office/word/2015/wordml/symex" xmlns:wpg="http://schemas.microsoft.com/office/word/2010/wordprocessingGroup" xmlns:wpi="http://schemas.microsoft.com/office/word/2010/wordprocessingInk" xmlns:wne="http://schemas.microsoft.com/office/word/2006/wordml" xmlns:wps="http://schemas.microsoft.com/office/word/2010/wordprocessingShape" mc:Ignorable="w14 w15 w16se w16cid w16 w16cex w16sdtdh w16du wp14">
+<w:endnotes xmlns:wpc="http://schemas.microsoft.com/office/word/2010/wordprocessingCanvas" xmlns:cx="http://schemas.microsoft.com/office/drawing/2014/chartex" xmlns:cx1="http://schemas.microsoft.com/office/drawing/2015/9/8/chartex" xmlns:cx2="http://schemas.microsoft.com/office/drawing/2015/10/21/chartex" xmlns:cx3="http://schemas.microsoft.com/office/drawing/2016/5/9/chartex" xmlns:cx4="http://schemas.microsoft.com/office/drawing/2016/5/10/chartex" xmlns:cx5="http://schemas.microsoft.com/office/drawing/2016/5/11/chartex" xmlns:cx6="http://schemas.microsoft.com/office/drawing/2016/5/12/chartex" xmlns:cx7="http://schemas.microsoft.com/office/drawing/2016/5/13/chartex" xmlns:cx8="http://schemas.microsoft.com/office/drawing/2016/5/14/chartex" xmlns:mc="http://schemas.openxmlformats.org/markup-compatibility/2006" xmlns:aink="http://schemas.microsoft.com/office/drawing/2016/ink" xmlns:am3d="http://schemas.microsoft.com/office/drawing/2017/model3d" xmlns:o="urn:schemas-microsoft-com:office:office" xmlns:oel="http://schemas.microsoft.com/office/2019/extlst" xmlns:r="http://schemas.openxmlformats.org/officeDocument/2006/relationships" xmlns:m="http://schemas.openxmlformats.org/officeDocument/2006/math" xmlns:v="urn:schemas-microsoft-com:vml" xmlns:wp14="http://schemas.microsoft.com/office/word/2010/wordprocessingDrawing" xmlns:wp="http://schemas.openxmlformats.org/drawingml/2006/wordprocessingDrawing" xmlns:w10="urn:schemas-microsoft-com:office:word" xmlns:w="http://schemas.openxmlformats.org/wordprocessingml/2006/main" xmlns:w14="http://schemas.microsoft.com/office/word/2010/wordml" xmlns:w15="http://schemas.microsoft.com/office/word/2012/wordml" xmlns:w16cex="http://schemas.microsoft.com/office/word/2018/wordml/cex" xmlns:w16cid="http://schemas.microsoft.com/office/word/2016/wordml/cid" xmlns:w16="http://schemas.microsoft.com/office/word/2018/wordml" xmlns:w16du="http://schemas.microsoft.com/office/word/2023/wordml/word16du" xmlns:w16sdtdh="http://schemas.microsoft.com/office/word/2020/wordml/sdtdatahash" xmlns:w16sdtfl="http://schemas.microsoft.com/office/word/2024/wordml/sdtformatlock" xmlns:w16se="http://schemas.microsoft.com/office/word/2015/wordml/symex" xmlns:wpg="http://schemas.microsoft.com/office/word/2010/wordprocessingGroup" xmlns:wpi="http://schemas.microsoft.com/office/word/2010/wordprocessingInk" xmlns:wne="http://schemas.microsoft.com/office/word/2006/wordml" xmlns:wps="http://schemas.microsoft.com/office/word/2010/wordprocessingShape" mc:Ignorable="w14 w15 w16se w16cid w16 w16cex w16sdtdh w16sdtfl w16du wp14">
   <w:endnote w:type="separator" w:id="-1">
     <w:p>
       <w:pPr>
@@ -8751,7 +6817,7 @@
 </file>
 
 <file path=word/footnotes.xml><?xml version="1.0" encoding="utf-8"?>
-<w:footnotes xmlns:wpc="http://schemas.microsoft.com/office/word/2010/wordprocessingCanvas" xmlns:cx="http://schemas.microsoft.com/office/drawing/2014/chartex" xmlns:cx1="http://schemas.microsoft.com/office/drawing/2015/9/8/chartex" xmlns:cx2="http://schemas.microsoft.com/office/drawing/2015/10/21/chartex" xmlns:cx3="http://schemas.microsoft.com/office/drawing/2016/5/9/chartex" xmlns:cx4="http://schemas.microsoft.com/office/drawing/2016/5/10/chartex" xmlns:cx5="http://schemas.microsoft.com/office/drawing/2016/5/11/chartex" xmlns:cx6="http://schemas.microsoft.com/office/drawing/2016/5/12/chartex" xmlns:cx7="http://schemas.microsoft.com/office/drawing/2016/5/13/chartex" xmlns:cx8="http://schemas.microsoft.com/office/drawing/2016/5/14/chartex" xmlns:mc="http://schemas.openxmlformats.org/markup-compatibility/2006" xmlns:aink="http://schemas.microsoft.com/office/drawing/2016/ink" xmlns:am3d="http://schemas.microsoft.com/office/drawing/2017/model3d" xmlns:o="urn:schemas-microsoft-com:office:office" xmlns:oel="http://schemas.microsoft.com/office/2019/extlst" xmlns:r="http://schemas.openxmlformats.org/officeDocument/2006/relationships" xmlns:m="http://schemas.openxmlformats.org/officeDocument/2006/math" xmlns:v="urn:schemas-microsoft-com:vml" xmlns:wp14="http://schemas.microsoft.com/office/word/2010/wordprocessingDrawing" xmlns:wp="http://schemas.openxmlformats.org/drawingml/2006/wordprocessingDrawing" xmlns:w10="urn:schemas-microsoft-com:office:word" xmlns:w="http://schemas.openxmlformats.org/wordprocessingml/2006/main" xmlns:w14="http://schemas.microsoft.com/office/word/2010/wordml" xmlns:w15="http://schemas.microsoft.com/office/word/2012/wordml" xmlns:w16cex="http://schemas.microsoft.com/office/word/2018/wordml/cex" xmlns:w16cid="http://schemas.microsoft.com/office/word/2016/wordml/cid" xmlns:w16="http://schemas.microsoft.com/office/word/2018/wordml" xmlns:w16du="http://schemas.microsoft.com/office/word/2023/wordml/word16du" xmlns:w16sdtdh="http://schemas.microsoft.com/office/word/2020/wordml/sdtdatahash" xmlns:w16se="http://schemas.microsoft.com/office/word/2015/wordml/symex" xmlns:wpg="http://schemas.microsoft.com/office/word/2010/wordprocessingGroup" xmlns:wpi="http://schemas.microsoft.com/office/word/2010/wordprocessingInk" xmlns:wne="http://schemas.microsoft.com/office/word/2006/wordml" xmlns:wps="http://schemas.microsoft.com/office/word/2010/wordprocessingShape" mc:Ignorable="w14 w15 w16se w16cid w16 w16cex w16sdtdh w16du wp14">
+<w:footnotes xmlns:wpc="http://schemas.microsoft.com/office/word/2010/wordprocessingCanvas" xmlns:cx="http://schemas.microsoft.com/office/drawing/2014/chartex" xmlns:cx1="http://schemas.microsoft.com/office/drawing/2015/9/8/chartex" xmlns:cx2="http://schemas.microsoft.com/office/drawing/2015/10/21/chartex" xmlns:cx3="http://schemas.microsoft.com/office/drawing/2016/5/9/chartex" xmlns:cx4="http://schemas.microsoft.com/office/drawing/2016/5/10/chartex" xmlns:cx5="http://schemas.microsoft.com/office/drawing/2016/5/11/chartex" xmlns:cx6="http://schemas.microsoft.com/office/drawing/2016/5/12/chartex" xmlns:cx7="http://schemas.microsoft.com/office/drawing/2016/5/13/chartex" xmlns:cx8="http://schemas.microsoft.com/office/drawing/2016/5/14/chartex" xmlns:mc="http://schemas.openxmlformats.org/markup-compatibility/2006" xmlns:aink="http://schemas.microsoft.com/office/drawing/2016/ink" xmlns:am3d="http://schemas.microsoft.com/office/drawing/2017/model3d" xmlns:o="urn:schemas-microsoft-com:office:office" xmlns:oel="http://schemas.microsoft.com/office/2019/extlst" xmlns:r="http://schemas.openxmlformats.org/officeDocument/2006/relationships" xmlns:m="http://schemas.openxmlformats.org/officeDocument/2006/math" xmlns:v="urn:schemas-microsoft-com:vml" xmlns:wp14="http://schemas.microsoft.com/office/word/2010/wordprocessingDrawing" xmlns:wp="http://schemas.openxmlformats.org/drawingml/2006/wordprocessingDrawing" xmlns:w10="urn:schemas-microsoft-com:office:word" xmlns:w="http://schemas.openxmlformats.org/wordprocessingml/2006/main" xmlns:w14="http://schemas.microsoft.com/office/word/2010/wordml" xmlns:w15="http://schemas.microsoft.com/office/word/2012/wordml" xmlns:w16cex="http://schemas.microsoft.com/office/word/2018/wordml/cex" xmlns:w16cid="http://schemas.microsoft.com/office/word/2016/wordml/cid" xmlns:w16="http://schemas.microsoft.com/office/word/2018/wordml" xmlns:w16du="http://schemas.microsoft.com/office/word/2023/wordml/word16du" xmlns:w16sdtdh="http://schemas.microsoft.com/office/word/2020/wordml/sdtdatahash" xmlns:w16sdtfl="http://schemas.microsoft.com/office/word/2024/wordml/sdtformatlock" xmlns:w16se="http://schemas.microsoft.com/office/word/2015/wordml/symex" xmlns:wpg="http://schemas.microsoft.com/office/word/2010/wordprocessingGroup" xmlns:wpi="http://schemas.microsoft.com/office/word/2010/wordprocessingInk" xmlns:wne="http://schemas.microsoft.com/office/word/2006/wordml" xmlns:wps="http://schemas.microsoft.com/office/word/2010/wordprocessingShape" mc:Ignorable="w14 w15 w16se w16cid w16 w16cex w16sdtdh w16sdtfl w16du wp14">
   <w:footnote w:type="separator" w:id="-1">
     <w:p>
       <w:pPr>
@@ -8783,7 +6849,7 @@
 </file>
 
 <file path=word/numbering.xml><?xml version="1.0" encoding="utf-8"?>
-<w:numbering xmlns:wpc="http://schemas.microsoft.com/office/word/2010/wordprocessingCanvas" xmlns:cx="http://schemas.microsoft.com/office/drawing/2014/chartex" xmlns:cx1="http://schemas.microsoft.com/office/drawing/2015/9/8/chartex" xmlns:cx2="http://schemas.microsoft.com/office/drawing/2015/10/21/chartex" xmlns:cx3="http://schemas.microsoft.com/office/drawing/2016/5/9/chartex" xmlns:cx4="http://schemas.microsoft.com/office/drawing/2016/5/10/chartex" xmlns:cx5="http://schemas.microsoft.com/office/drawing/2016/5/11/chartex" xmlns:cx6="http://schemas.microsoft.com/office/drawing/2016/5/12/chartex" xmlns:cx7="http://schemas.microsoft.com/office/drawing/2016/5/13/chartex" xmlns:cx8="http://schemas.microsoft.com/office/drawing/2016/5/14/chartex" xmlns:mc="http://schemas.openxmlformats.org/markup-compatibility/2006" xmlns:aink="http://schemas.microsoft.com/office/drawing/2016/ink" xmlns:am3d="http://schemas.microsoft.com/office/drawing/2017/model3d" xmlns:o="urn:schemas-microsoft-com:office:office" xmlns:oel="http://schemas.microsoft.com/office/2019/extlst" xmlns:r="http://schemas.openxmlformats.org/officeDocument/2006/relationships" xmlns:m="http://schemas.openxmlformats.org/officeDocument/2006/math" xmlns:v="urn:schemas-microsoft-com:vml" xmlns:wp14="http://schemas.microsoft.com/office/word/2010/wordprocessingDrawing" xmlns:wp="http://schemas.openxmlformats.org/drawingml/2006/wordprocessingDrawing" xmlns:w10="urn:schemas-microsoft-com:office:word" xmlns:w="http://schemas.openxmlformats.org/wordprocessingml/2006/main" xmlns:w14="http://schemas.microsoft.com/office/word/2010/wordml" xmlns:w15="http://schemas.microsoft.com/office/word/2012/wordml" xmlns:w16cex="http://schemas.microsoft.com/office/word/2018/wordml/cex" xmlns:w16cid="http://schemas.microsoft.com/office/word/2016/wordml/cid" xmlns:w16="http://schemas.microsoft.com/office/word/2018/wordml" xmlns:w16du="http://schemas.microsoft.com/office/word/2023/wordml/word16du" xmlns:w16sdtdh="http://schemas.microsoft.com/office/word/2020/wordml/sdtdatahash" xmlns:w16se="http://schemas.microsoft.com/office/word/2015/wordml/symex" xmlns:wpg="http://schemas.microsoft.com/office/word/2010/wordprocessingGroup" xmlns:wpi="http://schemas.microsoft.com/office/word/2010/wordprocessingInk" xmlns:wne="http://schemas.microsoft.com/office/word/2006/wordml" xmlns:wps="http://schemas.microsoft.com/office/word/2010/wordprocessingShape" mc:Ignorable="w14 w15 w16se w16cid w16 w16cex w16sdtdh w16du wp14">
+<w:numbering xmlns:wpc="http://schemas.microsoft.com/office/word/2010/wordprocessingCanvas" xmlns:cx="http://schemas.microsoft.com/office/drawing/2014/chartex" xmlns:cx1="http://schemas.microsoft.com/office/drawing/2015/9/8/chartex" xmlns:cx2="http://schemas.microsoft.com/office/drawing/2015/10/21/chartex" xmlns:cx3="http://schemas.microsoft.com/office/drawing/2016/5/9/chartex" xmlns:cx4="http://schemas.microsoft.com/office/drawing/2016/5/10/chartex" xmlns:cx5="http://schemas.microsoft.com/office/drawing/2016/5/11/chartex" xmlns:cx6="http://schemas.microsoft.com/office/drawing/2016/5/12/chartex" xmlns:cx7="http://schemas.microsoft.com/office/drawing/2016/5/13/chartex" xmlns:cx8="http://schemas.microsoft.com/office/drawing/2016/5/14/chartex" xmlns:mc="http://schemas.openxmlformats.org/markup-compatibility/2006" xmlns:aink="http://schemas.microsoft.com/office/drawing/2016/ink" xmlns:am3d="http://schemas.microsoft.com/office/drawing/2017/model3d" xmlns:o="urn:schemas-microsoft-com:office:office" xmlns:oel="http://schemas.microsoft.com/office/2019/extlst" xmlns:r="http://schemas.openxmlformats.org/officeDocument/2006/relationships" xmlns:m="http://schemas.openxmlformats.org/officeDocument/2006/math" xmlns:v="urn:schemas-microsoft-com:vml" xmlns:wp14="http://schemas.microsoft.com/office/word/2010/wordprocessingDrawing" xmlns:wp="http://schemas.openxmlformats.org/drawingml/2006/wordprocessingDrawing" xmlns:w10="urn:schemas-microsoft-com:office:word" xmlns:w="http://schemas.openxmlformats.org/wordprocessingml/2006/main" xmlns:w14="http://schemas.microsoft.com/office/word/2010/wordml" xmlns:w15="http://schemas.microsoft.com/office/word/2012/wordml" xmlns:w16cex="http://schemas.microsoft.com/office/word/2018/wordml/cex" xmlns:w16cid="http://schemas.microsoft.com/office/word/2016/wordml/cid" xmlns:w16="http://schemas.microsoft.com/office/word/2018/wordml" xmlns:w16du="http://schemas.microsoft.com/office/word/2023/wordml/word16du" xmlns:w16sdtdh="http://schemas.microsoft.com/office/word/2020/wordml/sdtdatahash" xmlns:w16sdtfl="http://schemas.microsoft.com/office/word/2024/wordml/sdtformatlock" xmlns:w16se="http://schemas.microsoft.com/office/word/2015/wordml/symex" xmlns:wpg="http://schemas.microsoft.com/office/word/2010/wordprocessingGroup" xmlns:wpi="http://schemas.microsoft.com/office/word/2010/wordprocessingInk" xmlns:wne="http://schemas.microsoft.com/office/word/2006/wordml" xmlns:wps="http://schemas.microsoft.com/office/word/2010/wordprocessingShape" mc:Ignorable="w14 w15 w16se w16cid w16 w16cex w16sdtdh w16sdtfl w16du wp14">
   <w:abstractNum w:abstractNumId="0" w15:restartNumberingAfterBreak="0">
     <w:nsid w:val="00E173CE"/>
     <w:multiLevelType w:val="hybridMultilevel"/>
@@ -12841,7 +10907,7 @@
 </file>
 
 <file path=word/styles.xml><?xml version="1.0" encoding="utf-8"?>
-<w:styles xmlns:mc="http://schemas.openxmlformats.org/markup-compatibility/2006" xmlns:r="http://schemas.openxmlformats.org/officeDocument/2006/relationships" xmlns:w="http://schemas.openxmlformats.org/wordprocessingml/2006/main" xmlns:w14="http://schemas.microsoft.com/office/word/2010/wordml" xmlns:w15="http://schemas.microsoft.com/office/word/2012/wordml" xmlns:w16cex="http://schemas.microsoft.com/office/word/2018/wordml/cex" xmlns:w16cid="http://schemas.microsoft.com/office/word/2016/wordml/cid" xmlns:w16="http://schemas.microsoft.com/office/word/2018/wordml" xmlns:w16du="http://schemas.microsoft.com/office/word/2023/wordml/word16du" xmlns:w16sdtdh="http://schemas.microsoft.com/office/word/2020/wordml/sdtdatahash" xmlns:w16se="http://schemas.microsoft.com/office/word/2015/wordml/symex" mc:Ignorable="w14 w15 w16se w16cid w16 w16cex w16sdtdh w16du">
+<w:styles xmlns:mc="http://schemas.openxmlformats.org/markup-compatibility/2006" xmlns:r="http://schemas.openxmlformats.org/officeDocument/2006/relationships" xmlns:w="http://schemas.openxmlformats.org/wordprocessingml/2006/main" xmlns:w14="http://schemas.microsoft.com/office/word/2010/wordml" xmlns:w15="http://schemas.microsoft.com/office/word/2012/wordml" xmlns:w16cex="http://schemas.microsoft.com/office/word/2018/wordml/cex" xmlns:w16cid="http://schemas.microsoft.com/office/word/2016/wordml/cid" xmlns:w16="http://schemas.microsoft.com/office/word/2018/wordml" xmlns:w16du="http://schemas.microsoft.com/office/word/2023/wordml/word16du" xmlns:w16sdtdh="http://schemas.microsoft.com/office/word/2020/wordml/sdtdatahash" xmlns:w16sdtfl="http://schemas.microsoft.com/office/word/2024/wordml/sdtformatlock" xmlns:w16se="http://schemas.microsoft.com/office/word/2015/wordml/symex" mc:Ignorable="w14 w15 w16se w16cid w16 w16cex w16sdtdh w16sdtfl w16du">
   <w:docDefaults>
     <w:rPrDefault>
       <w:rPr>
@@ -13266,6 +11332,7 @@
   <w:style w:type="character" w:default="1" w:styleId="DefaultParagraphFont">
     <w:name w:val="Default Paragraph Font"/>
     <w:uiPriority w:val="1"/>
+    <w:semiHidden/>
     <w:unhideWhenUsed/>
   </w:style>
   <w:style w:type="table" w:default="1" w:styleId="TableNormal">
@@ -13777,6 +11844,15 @@
 </file>
 
 <file path=customXml/item1.xml><?xml version="1.0" encoding="utf-8"?>
+<?mso-contentType ?>
+<FormTemplates xmlns="http://schemas.microsoft.com/sharepoint/v3/contenttype/forms">
+  <Display>DocumentLibraryForm</Display>
+  <Edit>DocumentLibraryForm</Edit>
+  <New>DocumentLibraryForm</New>
+</FormTemplates>
+</file>
+
+<file path=customXml/item2.xml><?xml version="1.0" encoding="utf-8"?>
 <ct:contentTypeSchema xmlns:ct="http://schemas.microsoft.com/office/2006/metadata/contentType" xmlns:ma="http://schemas.microsoft.com/office/2006/metadata/properties/metaAttributes" ct:_="" ma:_="" ma:contentTypeName="_CtTemplate" ma:contentTypeID="0x01010064A5FDCCFB03F540B94405305D7DE14F00A4F8B82F7CEF57469A8FE5CEAB7A0EE0" ma:contentTypeVersion="55" ma:contentTypeDescription="Part of Template Management with Site Columns representing custom attributes." ma:contentTypeScope="" ma:versionID="e48abcd8da7fe05ec90dabdfbb8c2749">
   <xsd:schema xmlns:xsd="http://www.w3.org/2001/XMLSchema" xmlns:xs="http://www.w3.org/2001/XMLSchema" xmlns:p="http://schemas.microsoft.com/office/2006/metadata/properties" xmlns:ns2="f336f4fe-8719-4ea2-b5d6-29b3a580aeb4" xmlns:ns3="b57b892a-dd61-4bba-b372-a8d93da2c7e6" targetNamespace="http://schemas.microsoft.com/office/2006/metadata/properties" ma:root="true" ma:fieldsID="4c733adc908683170864ffc34cec60fa" ns2:_="" ns3:_="">
     <xsd:import namespace="f336f4fe-8719-4ea2-b5d6-29b3a580aeb4"/>
@@ -14098,15 +12174,6 @@
 </ct:contentTypeSchema>
 </file>
 
-<file path=customXml/item2.xml><?xml version="1.0" encoding="utf-8"?>
-<?mso-contentType ?>
-<FormTemplates xmlns="http://schemas.microsoft.com/sharepoint/v3/contenttype/forms">
-  <Display>DocumentLibraryForm</Display>
-  <Edit>DocumentLibraryForm</Edit>
-  <New>DocumentLibraryForm</New>
-</FormTemplates>
-</file>
-
 <file path=customXml/item3.xml><?xml version="1.0" encoding="utf-8"?>
 <p:properties xmlns:p="http://schemas.microsoft.com/office/2006/metadata/properties" xmlns:xsi="http://www.w3.org/2001/XMLSchema-instance" xmlns:pc="http://schemas.microsoft.com/office/infopath/2007/PartnerControls">
   <documentManagement>
@@ -14133,6 +12200,14 @@
 </file>
 
 <file path=customXml/itemProps1.xml><?xml version="1.0" encoding="utf-8"?>
+<ds:datastoreItem xmlns:ds="http://schemas.openxmlformats.org/officeDocument/2006/customXml" ds:itemID="{75ABB397-9654-40A8-BA83-98F2BA902102}">
+  <ds:schemaRefs>
+    <ds:schemaRef ds:uri="http://schemas.microsoft.com/sharepoint/v3/contenttype/forms"/>
+  </ds:schemaRefs>
+</ds:datastoreItem>
+</file>
+
+<file path=customXml/itemProps2.xml><?xml version="1.0" encoding="utf-8"?>
 <ds:datastoreItem xmlns:ds="http://schemas.openxmlformats.org/officeDocument/2006/customXml" ds:itemID="{EDB7EA9B-ED82-4768-83AD-4433A7153D2A}">
   <ds:schemaRefs>
     <ds:schemaRef ds:uri="http://schemas.microsoft.com/office/2006/metadata/contentType"/>
@@ -14147,14 +12222,6 @@
     <ds:schemaRef ds:uri="http://purl.org/dc/elements/1.1/"/>
     <ds:schemaRef ds:uri="http://purl.org/dc/terms/"/>
     <ds:schemaRef ds:uri="http://schemas.microsoft.com/internal/obd"/>
-  </ds:schemaRefs>
-</ds:datastoreItem>
-</file>
-
-<file path=customXml/itemProps2.xml><?xml version="1.0" encoding="utf-8"?>
-<ds:datastoreItem xmlns:ds="http://schemas.openxmlformats.org/officeDocument/2006/customXml" ds:itemID="{75ABB397-9654-40A8-BA83-98F2BA902102}">
-  <ds:schemaRefs>
-    <ds:schemaRef ds:uri="http://schemas.microsoft.com/sharepoint/v3/contenttype/forms"/>
   </ds:schemaRefs>
 </ds:datastoreItem>
 </file>

</xml_diff>